<commit_message>
Polish report layout after render check
</commit_message>
<xml_diff>
--- a/data/processed/ST_QueryEngine_Report_final.docx
+++ b/data/processed/ST_QueryEngine_Report_final.docx
@@ -37,7 +37,7 @@
         <w:rPr>
           <w:rFonts w:ascii="Times New Roman" w:hAnsi="Times New Roman" w:eastAsia="宋体"/>
         </w:rPr>
-        <w:t>单位：__________    项目链接：待补充</w:t>
+        <w:t>单位：__________    项目链接：https://github.com/woem2436/ST-QueryEngine</w:t>
       </w:r>
     </w:p>
     <w:p>
@@ -56,7 +56,7 @@
         <w:rPr>
           <w:rFonts w:ascii="Times New Roman" w:hAnsi="Times New Roman" w:eastAsia="宋体"/>
         </w:rPr>
-        <w:t>现实中的 Excel 表格常包含合并单元格、多级表头、横向键值对和章节式说明，难以直接转换为规则关系表并使用 SQL 查询。本文围绕课程项目“表格数据的智能查询系统”，以 SSTQA-zh 数据集为测试基准，设计并实现了一个离线可复现的半结构化表格问答系统。系统首先对原始工作簿进行结构分析与证据化拆分，生成单元格证据、行证据、表级元数据和局部关系视图；随后根据问题语义将查询路由到关系执行、键值查找、稀疏检索、列表抽取、计数、极值和聚合计算等策略。系统参考 ST-Raptor 对半结构化表格“先恢复结构、再执行操作”的思想，但采用轻量规则和本地 SQLite/JSON 存储，避免课堂环境中对外部 LLM 和向量数据库的强依赖。当前系统在 SSTQA-zh 的 764 条测试样本上取得 55.50% 的整体准确率，其中内容匹配类为 61.36%，数值计算类为 43.95%，语义感知类为 47.15%。实验表明，结构保留、混合存储和可解释路由能够显著提高复杂表格问答的稳定性。</w:t>
+        <w:t>现实中的 Excel 表格常包含合并单元格、多级表头、横向键值对和章节式说明，难以直接转换为规则关系表并使用 SQL 查询。本文围绕课程项目“表格数据的智能查询系统”，以 SSTQA-zh 数据集为测试基准，设计并实现了一个离线可复现的半结构化表格问答系统。系统首先对原始工作簿进行结构分析与证据化拆分，生成单元格证据、行证据、表级元数据和局部关系视图；随后根据问题语义将查询路由到关系执行、键值查找、稀疏检索、列表抽取、计数、极值和聚合计算等策略。系统参考 ST-Raptor 对半结构化表格“先恢复结构、再执行操作”的思想，但采用轻量规则和本地 SQLite/JSON 存储，避免课堂环境中对外部 LLM 和向量数据库的强依赖。当前系统在 SSTQA-zh 的 764 条测试样本上取得 55.37% 的整体准确率，其中内容匹配类为 61.16%，数值计算类为 43.95%，语义感知类为 47.15%。实验表明，结构保留、混合存储和可解释路由能够显著提高复杂表格问答的稳定性。</w:t>
       </w:r>
     </w:p>
     <w:p>
@@ -107,7 +107,7 @@
         <w:rPr>
           <w:rFonts w:ascii="Times New Roman" w:hAnsi="Times New Roman" w:eastAsia="宋体"/>
         </w:rPr>
-        <w:t>This project builds an offline and reproducible question answering system for semi-structured Excel tables in SSTQA-zh. The system converts workbooks into cell evidence, row evidence, table metadata and local relational views, then routes natural-language questions to relational execution, key-value lookup, sparse retrieval, list extraction, counting, extreme-value search and aggregation. Inspired by ST-Raptor's structure-first operation pipeline, the implementation uses lightweight rules with SQLite and JSON indexes so that it can run without mandatory external LLM or vector-database services. On 764 test questions, the current system reaches 55.50% overall accuracy.</w:t>
+        <w:t>This project builds an offline and reproducible question answering system for semi-structured Excel tables in SSTQA-zh. The system converts workbooks into cell evidence, row evidence, table metadata and local relational views, then routes natural-language questions to relational execution, key-value lookup, sparse retrieval, list extraction, counting, extreme-value search and aggregation. Inspired by ST-Raptor's structure-first operation pipeline, the implementation uses lightweight rules with SQLite and JSON indexes so that it can run without mandatory external LLM or vector-database services. On 764 test questions, the current system reaches 55.37% overall accuracy.</w:t>
       </w:r>
     </w:p>
     <w:p>
@@ -200,6 +200,624 @@
           <w:rFonts w:ascii="Times New Roman" w:hAnsi="Times New Roman" w:eastAsia="宋体"/>
         </w:rPr>
         <w:t>项目输入包括 data/raw 目录下的 102 个 xlsx 文件以及 test.jsonl。每条测试样本包含 table_id、自然语言问题、标准答案、问题类型和难度。系统在评测时根据 table_id 读取对应工作簿，返回答案后与标准答案进行文本和数值匹配，并输出整体准确率和分类型准确率。</w:t>
+      </w:r>
+    </w:p>
+    <w:p>
+      <w:pPr>
+        <w:spacing w:line="252" w:lineRule="auto" w:after="40"/>
+        <w:ind w:firstLine="0"/>
+      </w:pPr>
+      <w:r>
+        <w:rPr>
+          <w:rFonts w:ascii="Times New Roman" w:hAnsi="Times New Roman" w:eastAsia="黑体"/>
+          <w:b/>
+        </w:rPr>
+        <w:t>表格数量：</w:t>
+      </w:r>
+      <w:r>
+        <w:rPr>
+          <w:rFonts w:ascii="Times New Roman" w:hAnsi="Times New Roman" w:eastAsia="宋体"/>
+        </w:rPr>
+        <w:t>102 张真实 Excel 表格</w:t>
+      </w:r>
+    </w:p>
+    <w:p>
+      <w:pPr>
+        <w:spacing w:line="252" w:lineRule="auto" w:after="40"/>
+        <w:ind w:firstLine="0"/>
+      </w:pPr>
+      <w:r>
+        <w:rPr>
+          <w:rFonts w:ascii="Times New Roman" w:hAnsi="Times New Roman" w:eastAsia="黑体"/>
+          <w:b/>
+        </w:rPr>
+        <w:t>问题数量：</w:t>
+      </w:r>
+      <w:r>
+        <w:rPr>
+          <w:rFonts w:ascii="Times New Roman" w:hAnsi="Times New Roman" w:eastAsia="宋体"/>
+        </w:rPr>
+        <w:t>764 条自然语言查询</w:t>
+      </w:r>
+    </w:p>
+    <w:p>
+      <w:pPr>
+        <w:spacing w:line="252" w:lineRule="auto" w:after="40"/>
+        <w:ind w:firstLine="0"/>
+      </w:pPr>
+      <w:r>
+        <w:rPr>
+          <w:rFonts w:ascii="Times New Roman" w:hAnsi="Times New Roman" w:eastAsia="黑体"/>
+          <w:b/>
+        </w:rPr>
+        <w:t>问题类型：</w:t>
+      </w:r>
+      <w:r>
+        <w:rPr>
+          <w:rFonts w:ascii="Times New Roman" w:hAnsi="Times New Roman" w:eastAsia="宋体"/>
+        </w:rPr>
+        <w:t>内容匹配、数值计算、语义感知</w:t>
+      </w:r>
+    </w:p>
+    <w:p>
+      <w:pPr>
+        <w:spacing w:line="252" w:lineRule="auto" w:after="40"/>
+        <w:ind w:firstLine="0"/>
+      </w:pPr>
+      <w:r>
+        <w:rPr>
+          <w:rFonts w:ascii="Times New Roman" w:hAnsi="Times New Roman" w:eastAsia="黑体"/>
+          <w:b/>
+        </w:rPr>
+        <w:t>评测输出：</w:t>
+      </w:r>
+      <w:r>
+        <w:rPr>
+          <w:rFonts w:ascii="Times New Roman" w:hAnsi="Times New Roman" w:eastAsia="宋体"/>
+        </w:rPr>
+        <w:t>evaluation_report.json</w:t>
+      </w:r>
+    </w:p>
+    <w:p>
+      <w:pPr>
+        <w:pStyle w:val="1"/>
+        <w:spacing w:before="140" w:after="60"/>
+      </w:pPr>
+      <w:r>
+        <w:rPr>
+          <w:rFonts w:ascii="Times New Roman" w:hAnsi="Times New Roman" w:eastAsia="黑体"/>
+          <w:b/>
+        </w:rPr>
+        <w:t>3 系统总体架构</w:t>
+      </w:r>
+    </w:p>
+    <w:p>
+      <w:pPr>
+        <w:spacing w:line="259" w:lineRule="auto" w:after="60"/>
+        <w:ind w:firstLine="360"/>
+      </w:pPr>
+      <w:r>
+        <w:rPr>
+          <w:rFonts w:ascii="Times New Roman" w:hAnsi="Times New Roman" w:eastAsia="宋体"/>
+        </w:rPr>
+        <w:t>系统采用“结构解析-混合存储-查询路由-答案执行-评测统计”的流水线。解析阶段尽量不把表格过早压扁为单一 DataFrame，而是保留坐标、上方表头、左侧标签、同行文本和表级标题。存储阶段同时写入 SQLite 与 JSON 索引。查询阶段先尝试局部关系执行器，置信度不足时再回退到原有混合检索流程。</w:t>
+      </w:r>
+    </w:p>
+    <w:p>
+      <w:pPr>
+        <w:spacing w:line="259" w:lineRule="auto" w:after="60"/>
+        <w:ind w:firstLine="360"/>
+      </w:pPr>
+      <w:r>
+        <w:rPr>
+          <w:rFonts w:ascii="Times New Roman" w:hAnsi="Times New Roman" w:eastAsia="宋体"/>
+        </w:rPr>
+        <w:t>src/main.py 是命令行入口，负责索引重建、单条查询和全量评测；src/table_indexer.py 构建 CellRecord、RowRecord 与 table_index.json；src/relational_engine.py 是本次优化后的核心，负责把部分表格恢复成局部关系视图并执行筛选、计数、极值、求和、均值和差值；src/hybrid_engine.py 负责整合关系执行器、单元格检索和回退策略；src/parser、src/storage、src/router、src/evaluator 分别处理 Excel 解析、存储封装、问题分类和答案评测。</w:t>
+      </w:r>
+    </w:p>
+    <w:p>
+      <w:pPr>
+        <w:pStyle w:val="1"/>
+        <w:spacing w:before="140" w:after="60"/>
+      </w:pPr>
+      <w:r>
+        <w:rPr>
+          <w:rFonts w:ascii="Times New Roman" w:hAnsi="Times New Roman" w:eastAsia="黑体"/>
+          <w:b/>
+        </w:rPr>
+        <w:t>4 表格拆分策略</w:t>
+      </w:r>
+    </w:p>
+    <w:p>
+      <w:pPr>
+        <w:spacing w:line="259" w:lineRule="auto" w:after="60"/>
+        <w:ind w:firstLine="360"/>
+      </w:pPr>
+      <w:r>
+        <w:rPr>
+          <w:rFonts w:ascii="Times New Roman" w:hAnsi="Times New Roman" w:eastAsia="宋体"/>
+        </w:rPr>
+        <w:t>拆分策略遵循“能关系化的关系化，不能关系化的证据化”的原则。首先用 openpyxl 读取公式缓存后的显示值，填充所有合并单元格，并裁剪全空边界。随后识别表头候选行、标题行和章节行，为每个非空单元格生成包含 value、row_text、above_text、left_text、right_text、坐标和单位的证据记录。这样即使表格无法直接转成 SQL 表，系统仍能基于上下文定位答案。</w:t>
+      </w:r>
+    </w:p>
+    <w:p>
+      <w:pPr>
+        <w:spacing w:line="259" w:lineRule="auto" w:after="60"/>
+        <w:ind w:firstLine="360"/>
+      </w:pPr>
+      <w:r>
+        <w:rPr>
+          <w:rFonts w:ascii="Times New Roman" w:hAnsi="Times New Roman" w:eastAsia="宋体"/>
+        </w:rPr>
+        <w:t>对于规则明细表，系统构造局部关系视图：将多级表头压缩成列名，过滤小计、合计和说明行，保留行号与原始证据；对于横向月份表，系统识别“1月、2月、3月”等宽表列并支持跨月份运算；对于章节式清单，系统记录当前章节标题，使“某章节一共有多少条目”“涉及几个责任部门”等问题可以在章节范围内统计；对于无显式表头的文本表，系统根据行内模式生成虚拟列，避免把整行文本误当成一个值。</w:t>
+      </w:r>
+    </w:p>
+    <w:p>
+      <w:pPr>
+        <w:pStyle w:val="1"/>
+        <w:spacing w:before="140" w:after="60"/>
+      </w:pPr>
+      <w:r>
+        <w:rPr>
+          <w:rFonts w:ascii="Times New Roman" w:hAnsi="Times New Roman" w:eastAsia="黑体"/>
+          <w:b/>
+        </w:rPr>
+        <w:t>5 存储方案选择依据</w:t>
+      </w:r>
+    </w:p>
+    <w:p>
+      <w:pPr>
+        <w:spacing w:line="259" w:lineRule="auto" w:after="60"/>
+        <w:ind w:firstLine="360"/>
+      </w:pPr>
+      <w:r>
+        <w:rPr>
+          <w:rFonts w:ascii="Times New Roman" w:hAnsi="Times New Roman" w:eastAsia="宋体"/>
+        </w:rPr>
+        <w:t>根据题目要求，系统没有把所有表格强行放入一种数据库，而是按数据形态选择存储。SQLite 用于存储单元格、行证据和局部关系结果，优点是可查询、可审计、便于按 table_id 与坐标回溯；JSON 用于保存轻量 n-gram/BM25 风格索引，优点是无需下载 embedding 模型即可离线召回；KV 元数据用于保存文件路径、表格规模、标题和运行配置；向量数据库与 LLM Agent 保留接口，但默认不参与运行，以保证课堂环境可复现。</w:t>
+      </w:r>
+    </w:p>
+    <w:p>
+      <w:pPr>
+        <w:spacing w:line="252" w:lineRule="auto" w:after="40"/>
+        <w:ind w:firstLine="0"/>
+      </w:pPr>
+      <w:r>
+        <w:rPr>
+          <w:rFonts w:ascii="Times New Roman" w:hAnsi="Times New Roman" w:eastAsia="黑体"/>
+          <w:b/>
+        </w:rPr>
+        <w:t>单元格与行证据：</w:t>
+      </w:r>
+      <w:r>
+        <w:rPr>
+          <w:rFonts w:ascii="Times New Roman" w:hAnsi="Times New Roman" w:eastAsia="宋体"/>
+        </w:rPr>
+        <w:t>写入 SQLite，用于结构化查询、坐标回溯和结果审计。</w:t>
+      </w:r>
+    </w:p>
+    <w:p>
+      <w:pPr>
+        <w:spacing w:line="252" w:lineRule="auto" w:after="40"/>
+        <w:ind w:firstLine="0"/>
+      </w:pPr>
+      <w:r>
+        <w:rPr>
+          <w:rFonts w:ascii="Times New Roman" w:hAnsi="Times New Roman" w:eastAsia="黑体"/>
+          <w:b/>
+        </w:rPr>
+        <w:t>稀疏检索索引：</w:t>
+      </w:r>
+      <w:r>
+        <w:rPr>
+          <w:rFonts w:ascii="Times New Roman" w:hAnsi="Times New Roman" w:eastAsia="宋体"/>
+        </w:rPr>
+        <w:t>写入 JSON，使用中文 n-gram/BM25 风格重合度离线召回。</w:t>
+      </w:r>
+    </w:p>
+    <w:p>
+      <w:pPr>
+        <w:spacing w:line="252" w:lineRule="auto" w:after="40"/>
+        <w:ind w:firstLine="0"/>
+      </w:pPr>
+      <w:r>
+        <w:rPr>
+          <w:rFonts w:ascii="Times New Roman" w:hAnsi="Times New Roman" w:eastAsia="黑体"/>
+          <w:b/>
+        </w:rPr>
+        <w:t>表级元数据：</w:t>
+      </w:r>
+      <w:r>
+        <w:rPr>
+          <w:rFonts w:ascii="Times New Roman" w:hAnsi="Times New Roman" w:eastAsia="宋体"/>
+        </w:rPr>
+        <w:t>使用 KV/JSON 保存标题、路径、规模、章节和运行配置。</w:t>
+      </w:r>
+    </w:p>
+    <w:p>
+      <w:pPr>
+        <w:spacing w:line="252" w:lineRule="auto" w:after="40"/>
+        <w:ind w:firstLine="0"/>
+      </w:pPr>
+      <w:r>
+        <w:rPr>
+          <w:rFonts w:ascii="Times New Roman" w:hAnsi="Times New Roman" w:eastAsia="黑体"/>
+          <w:b/>
+        </w:rPr>
+        <w:t>语义扩展接口：</w:t>
+      </w:r>
+      <w:r>
+        <w:rPr>
+          <w:rFonts w:ascii="Times New Roman" w:hAnsi="Times New Roman" w:eastAsia="宋体"/>
+        </w:rPr>
+        <w:t>保留 LLM/向量检索入口，但默认离线运行，保证课程环境可复现。</w:t>
+      </w:r>
+    </w:p>
+    <w:p>
+      <w:pPr>
+        <w:pStyle w:val="1"/>
+        <w:spacing w:before="140" w:after="60"/>
+      </w:pPr>
+      <w:r>
+        <w:rPr>
+          <w:rFonts w:ascii="Times New Roman" w:hAnsi="Times New Roman" w:eastAsia="黑体"/>
+          <w:b/>
+        </w:rPr>
+        <w:t>6 查询路由逻辑</w:t>
+      </w:r>
+    </w:p>
+    <w:p>
+      <w:pPr>
+        <w:spacing w:line="259" w:lineRule="auto" w:after="60"/>
+        <w:ind w:firstLine="360"/>
+      </w:pPr>
+      <w:r>
+        <w:rPr>
+          <w:rFonts w:ascii="Times New Roman" w:hAnsi="Times New Roman" w:eastAsia="宋体"/>
+        </w:rPr>
+        <w:t>查询路由分为两层。第一层由 RuleBasedRouter 根据问题中的“多少、最高、最低、总和、平均、哪些、是否、相比”等词汇识别意图。第二层由 HybridQueryEngine 决定具体执行器：若表格适合关系化且置信度足够，则优先调用 RelationalAnswerEngine；否则使用 lookup、list、count、extreme、sum、avg 等轻量执行器和单元格检索兜底。</w:t>
+      </w:r>
+    </w:p>
+    <w:p>
+      <w:pPr>
+        <w:spacing w:line="259" w:lineRule="auto" w:after="60"/>
+        <w:ind w:firstLine="360"/>
+      </w:pPr>
+      <w:r>
+        <w:rPr>
+          <w:rFonts w:ascii="Times New Roman" w:hAnsi="Times New Roman" w:eastAsia="宋体"/>
+        </w:rPr>
+        <w:t>RelationalAnswerEngine 的关键是先抽取条件，再选择目标列。例如“标准分为 2 的考核项目有多少条”会被解析为条件列“标准分=2”和目标对象“考核项目”；“6 月份 A 产品的利润相比 5 月份减少了多少”会被解析为实体 A 产品、指标利润、月份 6 月与 5 月，并执行差值计算。执行后系统返回答案和置信度，低置信度结果不会强行覆盖原检索结果。</w:t>
+      </w:r>
+    </w:p>
+    <w:p>
+      <w:pPr>
+        <w:pStyle w:val="1"/>
+        <w:spacing w:before="140" w:after="60"/>
+      </w:pPr>
+      <w:r>
+        <w:rPr>
+          <w:rFonts w:ascii="Times New Roman" w:hAnsi="Times New Roman" w:eastAsia="黑体"/>
+          <w:b/>
+        </w:rPr>
+        <w:t>7 功能完善与 Bug 修复</w:t>
+      </w:r>
+    </w:p>
+    <w:p>
+      <w:pPr>
+        <w:spacing w:line="259" w:lineRule="auto" w:after="60"/>
+        <w:ind w:firstLine="360"/>
+      </w:pPr>
+      <w:r>
+        <w:rPr>
+          <w:rFonts w:ascii="Times New Roman" w:hAnsi="Times New Roman" w:eastAsia="宋体"/>
+        </w:rPr>
+        <w:t>早期版本主要依赖单元格检索，因此在简单查值题上可以工作，但对计数、列表、跨月份运算和多条件筛选较弱。本次优化加入了关系执行器、表格适配性判断、章节范围统计、宽表月份解析、百分比/差值计算、无表头文本表恢复和更保守的列表答案匹配，使系统从“能找相似文本”逐步变成“能执行局部表格操作”。</w:t>
+      </w:r>
+    </w:p>
+    <w:p>
+      <w:pPr>
+        <w:spacing w:line="252" w:lineRule="auto" w:after="40"/>
+        <w:ind w:firstLine="0"/>
+      </w:pPr>
+      <w:r>
+        <w:rPr>
+          <w:rFonts w:ascii="Times New Roman" w:hAnsi="Times New Roman" w:eastAsia="黑体"/>
+          <w:b/>
+        </w:rPr>
+        <w:t>指标同步：</w:t>
+      </w:r>
+      <w:r>
+        <w:rPr>
+          <w:rFonts w:ascii="Times New Roman" w:hAnsi="Times New Roman" w:eastAsia="宋体"/>
+        </w:rPr>
+        <w:t>将旧报告中的 30.37% 更新为当前全量评测 55.37%。</w:t>
+      </w:r>
+    </w:p>
+    <w:p>
+      <w:pPr>
+        <w:spacing w:line="252" w:lineRule="auto" w:after="40"/>
+        <w:ind w:firstLine="0"/>
+      </w:pPr>
+      <w:r>
+        <w:rPr>
+          <w:rFonts w:ascii="Times New Roman" w:hAnsi="Times New Roman" w:eastAsia="黑体"/>
+          <w:b/>
+        </w:rPr>
+        <w:t>关系表缺失：</w:t>
+      </w:r>
+      <w:r>
+        <w:rPr>
+          <w:rFonts w:ascii="Times New Roman" w:hAnsi="Times New Roman" w:eastAsia="宋体"/>
+        </w:rPr>
+        <w:t>新增局部关系视图，让可关系化表格进入筛选和聚合流程。</w:t>
+      </w:r>
+    </w:p>
+    <w:p>
+      <w:pPr>
+        <w:spacing w:line="252" w:lineRule="auto" w:after="40"/>
+        <w:ind w:firstLine="0"/>
+      </w:pPr>
+      <w:r>
+        <w:rPr>
+          <w:rFonts w:ascii="Times New Roman" w:hAnsi="Times New Roman" w:eastAsia="黑体"/>
+          <w:b/>
+        </w:rPr>
+        <w:t>章节计数失败：</w:t>
+      </w:r>
+      <w:r>
+        <w:rPr>
+          <w:rFonts w:ascii="Times New Roman" w:hAnsi="Times New Roman" w:eastAsia="宋体"/>
+        </w:rPr>
+        <w:t>记录章节与条目边界，支持章节范围内的 count/list 查询。</w:t>
+      </w:r>
+    </w:p>
+    <w:p>
+      <w:pPr>
+        <w:spacing w:line="252" w:lineRule="auto" w:after="40"/>
+        <w:ind w:firstLine="0"/>
+      </w:pPr>
+      <w:r>
+        <w:rPr>
+          <w:rFonts w:ascii="Times New Roman" w:hAnsi="Times New Roman" w:eastAsia="黑体"/>
+          <w:b/>
+        </w:rPr>
+        <w:t>月份宽表错误：</w:t>
+      </w:r>
+      <w:r>
+        <w:rPr>
+          <w:rFonts w:ascii="Times New Roman" w:hAnsi="Times New Roman" w:eastAsia="宋体"/>
+        </w:rPr>
+        <w:t>识别横向月份列，执行跨月差值、百分比和聚合计算。</w:t>
+      </w:r>
+    </w:p>
+    <w:p>
+      <w:pPr>
+        <w:spacing w:line="252" w:lineRule="auto" w:after="40"/>
+        <w:ind w:firstLine="0"/>
+      </w:pPr>
+      <w:r>
+        <w:rPr>
+          <w:rFonts w:ascii="Times New Roman" w:hAnsi="Times New Roman" w:eastAsia="黑体"/>
+          <w:b/>
+        </w:rPr>
+        <w:t>列表答案过严：</w:t>
+      </w:r>
+      <w:r>
+        <w:rPr>
+          <w:rFonts w:ascii="Times New Roman" w:hAnsi="Times New Roman" w:eastAsia="宋体"/>
+        </w:rPr>
+        <w:t>增加保守集合匹配，降低顺序和分隔符差异造成的误判。</w:t>
+      </w:r>
+    </w:p>
+    <w:p>
+      <w:pPr>
+        <w:pStyle w:val="1"/>
+        <w:spacing w:before="140" w:after="60"/>
+      </w:pPr>
+      <w:r>
+        <w:rPr>
+          <w:rFonts w:ascii="Times New Roman" w:hAnsi="Times New Roman" w:eastAsia="黑体"/>
+          <w:b/>
+        </w:rPr>
+        <w:t>8 实验设置与结果</w:t>
+      </w:r>
+    </w:p>
+    <w:p>
+      <w:pPr>
+        <w:spacing w:line="259" w:lineRule="auto" w:after="60"/>
+        <w:ind w:firstLine="360"/>
+      </w:pPr>
+      <w:r>
+        <w:rPr>
+          <w:rFonts w:ascii="Times New Roman" w:hAnsi="Times New Roman" w:eastAsia="宋体"/>
+        </w:rPr>
+        <w:t>实验在本地 Windows + Python 环境中完成，默认不启用在线 LLM API。评测命令为 python src/main.py --evaluate --quiet，系统读取完整 test.jsonl，并将结果写入 data/processed/evaluation_report.json。当前版本全量样本准确率为 55.37%，已接近课程项目设定的 60% 左右目标。</w:t>
+      </w:r>
+    </w:p>
+    <w:p>
+      <w:pPr>
+        <w:spacing w:line="252" w:lineRule="auto" w:after="40"/>
+        <w:ind w:firstLine="0"/>
+      </w:pPr>
+      <w:r>
+        <w:rPr>
+          <w:rFonts w:ascii="Times New Roman" w:hAnsi="Times New Roman" w:eastAsia="黑体"/>
+          <w:b/>
+        </w:rPr>
+        <w:t>版本演进：</w:t>
+      </w:r>
+      <w:r>
+        <w:rPr>
+          <w:rFonts w:ascii="Times New Roman" w:hAnsi="Times New Roman" w:eastAsia="宋体"/>
+        </w:rPr>
+        <w:t>初始版 30.37%，以单元格检索为主；中间版 46.99%，加入关系执行；当前版 55.37%，增强宽表、章节和列表处理。</w:t>
+      </w:r>
+    </w:p>
+    <w:p>
+      <w:pPr>
+        <w:spacing w:line="252" w:lineRule="auto" w:after="40"/>
+        <w:ind w:firstLine="0"/>
+      </w:pPr>
+      <w:r>
+        <w:rPr>
+          <w:rFonts w:ascii="Times New Roman" w:hAnsi="Times New Roman" w:eastAsia="黑体"/>
+          <w:b/>
+        </w:rPr>
+        <w:t>分类结果：</w:t>
+      </w:r>
+      <w:r>
+        <w:rPr>
+          <w:rFonts w:ascii="Times New Roman" w:hAnsi="Times New Roman" w:eastAsia="宋体"/>
+        </w:rPr>
+        <w:t>Content Match：484 条，61.16%；Numeric Computation：157 条，43.95%；Semantic-Aware：123 条，47.15%。</w:t>
+      </w:r>
+    </w:p>
+    <w:p>
+      <w:pPr>
+        <w:spacing w:line="259" w:lineRule="auto" w:after="60"/>
+        <w:ind w:firstLine="360"/>
+      </w:pPr>
+      <w:r>
+        <w:rPr>
+          <w:rFonts w:ascii="Times New Roman" w:hAnsi="Times New Roman" w:eastAsia="宋体"/>
+        </w:rPr>
+        <w:t>从路由统计看，764 条问题中有 547 条由 relational 路径处理，184 条由 lookup 路径处理，count、list、extreme 和 sum 路径承担较小但关键的补充作用。结果说明，半结构化表格问答不能只依靠文本相似度；一旦能够恢复局部表结构，数值计算和多条件筛选的上限会明显提高。</w:t>
+      </w:r>
+    </w:p>
+    <w:p>
+      <w:pPr>
+        <w:pStyle w:val="1"/>
+        <w:spacing w:before="140" w:after="60"/>
+      </w:pPr>
+      <w:r>
+        <w:rPr>
+          <w:rFonts w:ascii="Times New Roman" w:hAnsi="Times New Roman" w:eastAsia="黑体"/>
+          <w:b/>
+        </w:rPr>
+        <w:t>9 创新性分析</w:t>
+      </w:r>
+    </w:p>
+    <w:p>
+      <w:pPr>
+        <w:spacing w:line="259" w:lineRule="auto" w:after="60"/>
+        <w:ind w:firstLine="360"/>
+      </w:pPr>
+      <w:r>
+        <w:rPr>
+          <w:rFonts w:ascii="Times New Roman" w:hAnsi="Times New Roman" w:eastAsia="宋体"/>
+        </w:rPr>
+        <w:t>本项目的创新性不在于调用更大的模型，而在于把课程数据库思想和半结构化表格特点结合起来。第一，系统以证据单元格和局部关系视图共同表示表格，兼顾 SQL 式精确计算与布局语义保留。第二，查询路由不是 SQL、KV、向量或 LLM 的单选题，而是按问题语义组合不同执行器。第三，系统引入置信度门控，只有当关系执行结果足够可信时才覆盖回退检索，从而减少规则误伤。第四，默认离线可复现，适合课程验收，也为后续接入 LLM 验证器留下空间。</w:t>
+      </w:r>
+    </w:p>
+    <w:p>
+      <w:pPr>
+        <w:spacing w:line="259" w:lineRule="auto" w:after="60"/>
+        <w:ind w:firstLine="360"/>
+      </w:pPr>
+      <w:r>
+        <w:rPr>
+          <w:rFonts w:ascii="Times New Roman" w:hAnsi="Times New Roman" w:eastAsia="宋体"/>
+        </w:rPr>
+        <w:t>与 ST-Raptor 相比，本项目没有构建完整 HO-Tree 和 LLM 操作流水线，而是实现了一个轻量近似：用表头、章节、左右上下文和关系视图表达隐式结构，用规则执行器模拟 lookup、filter、aggregate、compare 等基本操作，再用答案匹配器做结果验证。这一设计牺牲了一部分泛化能力，但换来了实现完整度、可解释性和运行稳定性。</w:t>
+      </w:r>
+    </w:p>
+    <w:p>
+      <w:pPr>
+        <w:pStyle w:val="1"/>
+        <w:spacing w:before="140" w:after="60"/>
+      </w:pPr>
+      <w:r>
+        <w:rPr>
+          <w:rFonts w:ascii="Times New Roman" w:hAnsi="Times New Roman" w:eastAsia="黑体"/>
+          <w:b/>
+        </w:rPr>
+        <w:t>10 错误分析与改进方向</w:t>
+      </w:r>
+    </w:p>
+    <w:p>
+      <w:pPr>
+        <w:spacing w:line="259" w:lineRule="auto" w:after="60"/>
+        <w:ind w:firstLine="360"/>
+      </w:pPr>
+      <w:r>
+        <w:rPr>
+          <w:rFonts w:ascii="Times New Roman" w:hAnsi="Times New Roman" w:eastAsia="宋体"/>
+        </w:rPr>
+        <w:t>当前错误主要来自三类样本。第一类是复杂财务表，问题需要跨多个小计区、左右分栏或资产/负债双侧区域进行定位，局部关系视图仍可能选错列。第二类是语义归纳题，例如“总结主要变化”“如何影响整体指数”，需要先抽取多条证据再组织自然语言答案。第三类是数据本身或文件索引存在疑似不一致的样本，系统即使检索正确文件也可能找不到问题所需信息。</w:t>
+      </w:r>
+    </w:p>
+    <w:p>
+      <w:pPr>
+        <w:spacing w:line="259" w:lineRule="auto" w:after="60"/>
+        <w:ind w:firstLine="360"/>
+      </w:pPr>
+      <w:r>
+        <w:rPr>
+          <w:rFonts w:ascii="Times New Roman" w:hAnsi="Times New Roman" w:eastAsia="宋体"/>
+        </w:rPr>
+        <w:t>后续可以沿三条路线继续优化：其一，引入 HO-Tree 或类似树结构，更系统地表达合并单元格和多级表头；其二，增加受限 pandas/SQL 代码生成器，让数值计算题先生成可验证表达式再执行；其三，引入轻量 LLM 验证器，只让模型阅读候选证据而不是整张表，负责目标列选择、条件消歧和摘要生成，以控制成本并减少幻觉。</w:t>
+      </w:r>
+    </w:p>
+    <w:p>
+      <w:pPr>
+        <w:pStyle w:val="1"/>
+        <w:spacing w:before="140" w:after="60"/>
+      </w:pPr>
+      <w:r>
+        <w:rPr>
+          <w:rFonts w:ascii="Times New Roman" w:hAnsi="Times New Roman" w:eastAsia="黑体"/>
+          <w:b/>
+        </w:rPr>
+        <w:t>11 结论</w:t>
+      </w:r>
+    </w:p>
+    <w:p>
+      <w:pPr>
+        <w:spacing w:line="259" w:lineRule="auto" w:after="60"/>
+        <w:ind w:firstLine="360"/>
+      </w:pPr>
+      <w:r>
+        <w:rPr>
+          <w:rFonts w:ascii="Times New Roman" w:hAnsi="Times New Roman" w:eastAsia="宋体"/>
+        </w:rPr>
+        <w:t>本文完成了一个面向 SSTQA-zh 的表格数据智能查询系统，实现了从 Excel 结构解析、混合存储、自然语言查询、路由执行到准确率评测的完整闭环。系统当前在 764 条测试样本上达到 55.37% 的准确率，说明结构分析、存储选择和查询路由是解决半结构化表格问答的有效路径。虽然距离 ST-Raptor 这类完整 LLM 框架仍有差距，但该系统已经具备课程项目所需的完整性、可解释性和可继续研究的扩展空间。</w:t>
+      </w:r>
+    </w:p>
+    <w:p>
+      <w:pPr>
+        <w:sectPr>
+          <w:type w:val="continuous"/>
+          <w:pgSz w:w="11905" w:h="16837" w:code="9"/>
+          <w:pgMar w:top="1181" w:right="1181" w:bottom="1181" w:left="1181" w:header="964" w:footer="964" w:gutter="0"/>
+          <w:cols w:num="2" w:space="720"/>
+          <w:docGrid w:type="lines" w:linePitch="312"/>
+        </w:sectPr>
+      </w:pPr>
+    </w:p>
+    <w:p>
+      <w:pPr>
+        <w:pStyle w:val="1"/>
+        <w:spacing w:before="140" w:after="60"/>
+      </w:pPr>
+      <w:r>
+        <w:rPr>
+          <w:rFonts w:ascii="Times New Roman" w:hAnsi="Times New Roman" w:eastAsia="黑体"/>
+          <w:b/>
+        </w:rPr>
+        <w:t>附录A Python 文件实现说明</w:t>
+      </w:r>
+    </w:p>
+    <w:p>
+      <w:pPr>
+        <w:spacing w:line="259" w:lineRule="auto" w:after="60"/>
+        <w:ind w:firstLine="360"/>
+      </w:pPr>
+      <w:r>
+        <w:rPr>
+          <w:rFonts w:ascii="Times New Roman" w:hAnsi="Times New Roman" w:eastAsia="宋体"/>
+        </w:rPr>
+        <w:t>为了便于复现和维护，本节按文件说明项目中主要 Python 文件的职责、输入输出和实现思路。源码总体遵循“入口调度、结构解析、证据索引、混合执行、结果评测”的分层方式：上层文件负责任务流程，下层文件负责存储、检索、分类和答案匹配，测试与脚本文件用于验证和生成报告。</w:t>
       </w:r>
     </w:p>
     <w:tbl>
@@ -214,856 +832,6 @@
         <w:gridCol w:w="4771"/>
       </w:tblGrid>
       <w:tr>
-        <w:tc>
-          <w:tcPr>
-            <w:tcW w:type="dxa" w:w="1440"/>
-            <w:vAlign w:val="center"/>
-            <w:shd w:fill="D9EAF7"/>
-            <w:tcMar>
-              <w:top w:w="80" w:type="dxa"/>
-              <w:start w:w="80" w:type="dxa"/>
-              <w:bottom w:w="80" w:type="dxa"/>
-              <w:end w:w="80" w:type="dxa"/>
-            </w:tcMar>
-          </w:tcPr>
-          <w:p>
-            <w:pPr>
-              <w:spacing w:after="0"/>
-              <w:jc w:val="center"/>
-            </w:pPr>
-            <w:r>
-              <w:rPr>
-                <w:rFonts w:ascii="Times New Roman" w:hAnsi="Times New Roman" w:eastAsia="黑体"/>
-                <w:b/>
-                <w:sz w:val="15"/>
-              </w:rPr>
-              <w:t>项目</w:t>
-            </w:r>
-          </w:p>
-        </w:tc>
-        <w:tc>
-          <w:tcPr>
-            <w:tcW w:type="dxa" w:w="2880"/>
-            <w:vAlign w:val="center"/>
-            <w:shd w:fill="D9EAF7"/>
-            <w:tcMar>
-              <w:top w:w="80" w:type="dxa"/>
-              <w:start w:w="80" w:type="dxa"/>
-              <w:bottom w:w="80" w:type="dxa"/>
-              <w:end w:w="80" w:type="dxa"/>
-            </w:tcMar>
-          </w:tcPr>
-          <w:p>
-            <w:pPr>
-              <w:spacing w:after="0"/>
-              <w:jc w:val="center"/>
-            </w:pPr>
-            <w:r>
-              <w:rPr>
-                <w:rFonts w:ascii="Times New Roman" w:hAnsi="Times New Roman" w:eastAsia="黑体"/>
-                <w:b/>
-                <w:sz w:val="15"/>
-              </w:rPr>
-              <w:t>说明</w:t>
-            </w:r>
-          </w:p>
-        </w:tc>
-      </w:tr>
-      <w:tr>
-        <w:tc>
-          <w:tcPr>
-            <w:tcW w:type="dxa" w:w="1440"/>
-            <w:vAlign w:val="center"/>
-            <w:tcMar>
-              <w:top w:w="80" w:type="dxa"/>
-              <w:start w:w="80" w:type="dxa"/>
-              <w:bottom w:w="80" w:type="dxa"/>
-              <w:end w:w="80" w:type="dxa"/>
-            </w:tcMar>
-          </w:tcPr>
-          <w:p>
-            <w:pPr>
-              <w:spacing w:after="0" w:line="240" w:lineRule="auto"/>
-            </w:pPr>
-            <w:r>
-              <w:rPr>
-                <w:rFonts w:ascii="Times New Roman" w:hAnsi="Times New Roman" w:eastAsia="宋体"/>
-                <w:sz w:val="15"/>
-              </w:rPr>
-              <w:t>表格数量</w:t>
-            </w:r>
-          </w:p>
-        </w:tc>
-        <w:tc>
-          <w:tcPr>
-            <w:tcW w:type="dxa" w:w="2880"/>
-            <w:vAlign w:val="center"/>
-            <w:tcMar>
-              <w:top w:w="80" w:type="dxa"/>
-              <w:start w:w="80" w:type="dxa"/>
-              <w:bottom w:w="80" w:type="dxa"/>
-              <w:end w:w="80" w:type="dxa"/>
-            </w:tcMar>
-          </w:tcPr>
-          <w:p>
-            <w:pPr>
-              <w:spacing w:after="0" w:line="240" w:lineRule="auto"/>
-            </w:pPr>
-            <w:r>
-              <w:rPr>
-                <w:rFonts w:ascii="Times New Roman" w:hAnsi="Times New Roman" w:eastAsia="宋体"/>
-                <w:sz w:val="15"/>
-              </w:rPr>
-              <w:t>102 张真实 Excel 表格</w:t>
-            </w:r>
-          </w:p>
-        </w:tc>
-      </w:tr>
-      <w:tr>
-        <w:tc>
-          <w:tcPr>
-            <w:tcW w:type="dxa" w:w="1440"/>
-            <w:vAlign w:val="center"/>
-            <w:tcMar>
-              <w:top w:w="80" w:type="dxa"/>
-              <w:start w:w="80" w:type="dxa"/>
-              <w:bottom w:w="80" w:type="dxa"/>
-              <w:end w:w="80" w:type="dxa"/>
-            </w:tcMar>
-          </w:tcPr>
-          <w:p>
-            <w:pPr>
-              <w:spacing w:after="0" w:line="240" w:lineRule="auto"/>
-            </w:pPr>
-            <w:r>
-              <w:rPr>
-                <w:rFonts w:ascii="Times New Roman" w:hAnsi="Times New Roman" w:eastAsia="宋体"/>
-                <w:sz w:val="15"/>
-              </w:rPr>
-              <w:t>问题数量</w:t>
-            </w:r>
-          </w:p>
-        </w:tc>
-        <w:tc>
-          <w:tcPr>
-            <w:tcW w:type="dxa" w:w="2880"/>
-            <w:vAlign w:val="center"/>
-            <w:tcMar>
-              <w:top w:w="80" w:type="dxa"/>
-              <w:start w:w="80" w:type="dxa"/>
-              <w:bottom w:w="80" w:type="dxa"/>
-              <w:end w:w="80" w:type="dxa"/>
-            </w:tcMar>
-          </w:tcPr>
-          <w:p>
-            <w:pPr>
-              <w:spacing w:after="0" w:line="240" w:lineRule="auto"/>
-            </w:pPr>
-            <w:r>
-              <w:rPr>
-                <w:rFonts w:ascii="Times New Roman" w:hAnsi="Times New Roman" w:eastAsia="宋体"/>
-                <w:sz w:val="15"/>
-              </w:rPr>
-              <w:t>764 条自然语言查询</w:t>
-            </w:r>
-          </w:p>
-        </w:tc>
-      </w:tr>
-      <w:tr>
-        <w:tc>
-          <w:tcPr>
-            <w:tcW w:type="dxa" w:w="1440"/>
-            <w:vAlign w:val="center"/>
-            <w:tcMar>
-              <w:top w:w="80" w:type="dxa"/>
-              <w:start w:w="80" w:type="dxa"/>
-              <w:bottom w:w="80" w:type="dxa"/>
-              <w:end w:w="80" w:type="dxa"/>
-            </w:tcMar>
-          </w:tcPr>
-          <w:p>
-            <w:pPr>
-              <w:spacing w:after="0" w:line="240" w:lineRule="auto"/>
-            </w:pPr>
-            <w:r>
-              <w:rPr>
-                <w:rFonts w:ascii="Times New Roman" w:hAnsi="Times New Roman" w:eastAsia="宋体"/>
-                <w:sz w:val="15"/>
-              </w:rPr>
-              <w:t>问题类型</w:t>
-            </w:r>
-          </w:p>
-        </w:tc>
-        <w:tc>
-          <w:tcPr>
-            <w:tcW w:type="dxa" w:w="2880"/>
-            <w:vAlign w:val="center"/>
-            <w:tcMar>
-              <w:top w:w="80" w:type="dxa"/>
-              <w:start w:w="80" w:type="dxa"/>
-              <w:bottom w:w="80" w:type="dxa"/>
-              <w:end w:w="80" w:type="dxa"/>
-            </w:tcMar>
-          </w:tcPr>
-          <w:p>
-            <w:pPr>
-              <w:spacing w:after="0" w:line="240" w:lineRule="auto"/>
-            </w:pPr>
-            <w:r>
-              <w:rPr>
-                <w:rFonts w:ascii="Times New Roman" w:hAnsi="Times New Roman" w:eastAsia="宋体"/>
-                <w:sz w:val="15"/>
-              </w:rPr>
-              <w:t>内容匹配、数值计算、语义感知</w:t>
-            </w:r>
-          </w:p>
-        </w:tc>
-      </w:tr>
-      <w:tr>
-        <w:tc>
-          <w:tcPr>
-            <w:tcW w:type="dxa" w:w="1440"/>
-            <w:vAlign w:val="center"/>
-            <w:tcMar>
-              <w:top w:w="80" w:type="dxa"/>
-              <w:start w:w="80" w:type="dxa"/>
-              <w:bottom w:w="80" w:type="dxa"/>
-              <w:end w:w="80" w:type="dxa"/>
-            </w:tcMar>
-          </w:tcPr>
-          <w:p>
-            <w:pPr>
-              <w:spacing w:after="0" w:line="240" w:lineRule="auto"/>
-            </w:pPr>
-            <w:r>
-              <w:rPr>
-                <w:rFonts w:ascii="Times New Roman" w:hAnsi="Times New Roman" w:eastAsia="宋体"/>
-                <w:sz w:val="15"/>
-              </w:rPr>
-              <w:t>评测输出</w:t>
-            </w:r>
-          </w:p>
-        </w:tc>
-        <w:tc>
-          <w:tcPr>
-            <w:tcW w:type="dxa" w:w="2880"/>
-            <w:vAlign w:val="center"/>
-            <w:tcMar>
-              <w:top w:w="80" w:type="dxa"/>
-              <w:start w:w="80" w:type="dxa"/>
-              <w:bottom w:w="80" w:type="dxa"/>
-              <w:end w:w="80" w:type="dxa"/>
-            </w:tcMar>
-          </w:tcPr>
-          <w:p>
-            <w:pPr>
-              <w:spacing w:after="0" w:line="240" w:lineRule="auto"/>
-            </w:pPr>
-            <w:r>
-              <w:rPr>
-                <w:rFonts w:ascii="Times New Roman" w:hAnsi="Times New Roman" w:eastAsia="宋体"/>
-                <w:sz w:val="15"/>
-              </w:rPr>
-              <w:t>evaluation_report.json</w:t>
-            </w:r>
-          </w:p>
-        </w:tc>
-      </w:tr>
-    </w:tbl>
-    <w:p/>
-    <w:p>
-      <w:pPr>
-        <w:pStyle w:val="1"/>
-        <w:spacing w:before="140" w:after="60"/>
-      </w:pPr>
-      <w:r>
-        <w:rPr>
-          <w:rFonts w:ascii="Times New Roman" w:hAnsi="Times New Roman" w:eastAsia="黑体"/>
-          <w:b/>
-        </w:rPr>
-        <w:t>3 系统总体架构</w:t>
-      </w:r>
-    </w:p>
-    <w:p>
-      <w:pPr>
-        <w:spacing w:line="259" w:lineRule="auto" w:after="60"/>
-        <w:ind w:firstLine="360"/>
-      </w:pPr>
-      <w:r>
-        <w:rPr>
-          <w:rFonts w:ascii="Times New Roman" w:hAnsi="Times New Roman" w:eastAsia="宋体"/>
-        </w:rPr>
-        <w:t>系统采用“结构解析-混合存储-查询路由-答案执行-评测统计”的流水线。解析阶段尽量不把表格过早压扁为单一 DataFrame，而是保留坐标、上方表头、左侧标签、同行文本和表级标题。存储阶段同时写入 SQLite 与 JSON 索引。查询阶段先尝试局部关系执行器，置信度不足时再回退到原有混合检索流程。</w:t>
-      </w:r>
-    </w:p>
-    <w:p>
-      <w:pPr>
-        <w:spacing w:line="259" w:lineRule="auto" w:after="60"/>
-        <w:ind w:firstLine="360"/>
-      </w:pPr>
-      <w:r>
-        <w:rPr>
-          <w:rFonts w:ascii="Times New Roman" w:hAnsi="Times New Roman" w:eastAsia="宋体"/>
-        </w:rPr>
-        <w:t>src/main.py 是命令行入口，负责索引重建、单条查询和全量评测；src/table_indexer.py 构建 CellRecord、RowRecord 与 table_index.json；src/relational_engine.py 是本次优化后的核心，负责把部分表格恢复成局部关系视图并执行筛选、计数、极值、求和、均值和差值；src/hybrid_engine.py 负责整合关系执行器、单元格检索和回退策略；src/parser、src/storage、src/router、src/evaluator 分别处理 Excel 解析、存储封装、问题分类和答案评测。</w:t>
-      </w:r>
-    </w:p>
-    <w:p>
-      <w:pPr>
-        <w:pStyle w:val="1"/>
-        <w:spacing w:before="140" w:after="60"/>
-      </w:pPr>
-      <w:r>
-        <w:rPr>
-          <w:rFonts w:ascii="Times New Roman" w:hAnsi="Times New Roman" w:eastAsia="黑体"/>
-          <w:b/>
-        </w:rPr>
-        <w:t>4 表格拆分策略</w:t>
-      </w:r>
-    </w:p>
-    <w:p>
-      <w:pPr>
-        <w:spacing w:line="259" w:lineRule="auto" w:after="60"/>
-        <w:ind w:firstLine="360"/>
-      </w:pPr>
-      <w:r>
-        <w:rPr>
-          <w:rFonts w:ascii="Times New Roman" w:hAnsi="Times New Roman" w:eastAsia="宋体"/>
-        </w:rPr>
-        <w:t>拆分策略遵循“能关系化的关系化，不能关系化的证据化”的原则。首先用 openpyxl 读取公式缓存后的显示值，填充所有合并单元格，并裁剪全空边界。随后识别表头候选行、标题行和章节行，为每个非空单元格生成包含 value、row_text、above_text、left_text、right_text、坐标和单位的证据记录。这样即使表格无法直接转成 SQL 表，系统仍能基于上下文定位答案。</w:t>
-      </w:r>
-    </w:p>
-    <w:p>
-      <w:pPr>
-        <w:spacing w:line="259" w:lineRule="auto" w:after="60"/>
-        <w:ind w:firstLine="360"/>
-      </w:pPr>
-      <w:r>
-        <w:rPr>
-          <w:rFonts w:ascii="Times New Roman" w:hAnsi="Times New Roman" w:eastAsia="宋体"/>
-        </w:rPr>
-        <w:t>对于规则明细表，系统构造局部关系视图：将多级表头压缩成列名，过滤小计、合计和说明行，保留行号与原始证据；对于横向月份表，系统识别“1月、2月、3月”等宽表列并支持跨月份运算；对于章节式清单，系统记录当前章节标题，使“某章节一共有多少条目”“涉及几个责任部门”等问题可以在章节范围内统计；对于无显式表头的文本表，系统根据行内模式生成虚拟列，避免把整行文本误当成一个值。</w:t>
-      </w:r>
-    </w:p>
-    <w:p>
-      <w:pPr>
-        <w:pStyle w:val="1"/>
-        <w:spacing w:before="140" w:after="60"/>
-      </w:pPr>
-      <w:r>
-        <w:rPr>
-          <w:rFonts w:ascii="Times New Roman" w:hAnsi="Times New Roman" w:eastAsia="黑体"/>
-          <w:b/>
-        </w:rPr>
-        <w:t>5 存储方案选择依据</w:t>
-      </w:r>
-    </w:p>
-    <w:p>
-      <w:pPr>
-        <w:spacing w:line="259" w:lineRule="auto" w:after="60"/>
-        <w:ind w:firstLine="360"/>
-      </w:pPr>
-      <w:r>
-        <w:rPr>
-          <w:rFonts w:ascii="Times New Roman" w:hAnsi="Times New Roman" w:eastAsia="宋体"/>
-        </w:rPr>
-        <w:t>根据题目要求，系统没有把所有表格强行放入一种数据库，而是按数据形态选择存储。SQLite 用于存储单元格、行证据和局部关系结果，优点是可查询、可审计、便于按 table_id 与坐标回溯；JSON 用于保存轻量 n-gram/BM25 风格索引，优点是无需下载 embedding 模型即可离线召回；KV 元数据用于保存文件路径、表格规模、标题和运行配置；向量数据库与 LLM Agent 保留接口，但默认不参与运行，以保证课堂环境可复现。</w:t>
-      </w:r>
-    </w:p>
-    <w:tbl>
-      <w:tblPr>
-        <w:tblStyle w:val="af4"/>
-        <w:tblW w:type="auto" w:w="0"/>
-        <w:jc w:val="center"/>
-        <w:tblLook w:firstColumn="1" w:firstRow="1" w:lastColumn="0" w:lastRow="0" w:noHBand="0" w:noVBand="1" w:val="04A0"/>
-      </w:tblPr>
-      <w:tblGrid>
-        <w:gridCol w:w="3181"/>
-        <w:gridCol w:w="3181"/>
-        <w:gridCol w:w="3181"/>
-      </w:tblGrid>
-      <w:tr>
-        <w:tc>
-          <w:tcPr>
-            <w:tcW w:type="dxa" w:w="1152"/>
-            <w:vAlign w:val="center"/>
-            <w:shd w:fill="D9EAF7"/>
-            <w:tcMar>
-              <w:top w:w="80" w:type="dxa"/>
-              <w:start w:w="80" w:type="dxa"/>
-              <w:bottom w:w="80" w:type="dxa"/>
-              <w:end w:w="80" w:type="dxa"/>
-            </w:tcMar>
-          </w:tcPr>
-          <w:p>
-            <w:pPr>
-              <w:spacing w:after="0"/>
-              <w:jc w:val="center"/>
-            </w:pPr>
-            <w:r>
-              <w:rPr>
-                <w:rFonts w:ascii="Times New Roman" w:hAnsi="Times New Roman" w:eastAsia="黑体"/>
-                <w:b/>
-                <w:sz w:val="15"/>
-              </w:rPr>
-              <w:t>形态</w:t>
-            </w:r>
-          </w:p>
-        </w:tc>
-        <w:tc>
-          <w:tcPr>
-            <w:tcW w:type="dxa" w:w="1296"/>
-            <w:vAlign w:val="center"/>
-            <w:shd w:fill="D9EAF7"/>
-            <w:tcMar>
-              <w:top w:w="80" w:type="dxa"/>
-              <w:start w:w="80" w:type="dxa"/>
-              <w:bottom w:w="80" w:type="dxa"/>
-              <w:end w:w="80" w:type="dxa"/>
-            </w:tcMar>
-          </w:tcPr>
-          <w:p>
-            <w:pPr>
-              <w:spacing w:after="0"/>
-              <w:jc w:val="center"/>
-            </w:pPr>
-            <w:r>
-              <w:rPr>
-                <w:rFonts w:ascii="Times New Roman" w:hAnsi="Times New Roman" w:eastAsia="黑体"/>
-                <w:b/>
-                <w:sz w:val="15"/>
-              </w:rPr>
-              <w:t>方案</w:t>
-            </w:r>
-          </w:p>
-        </w:tc>
-        <w:tc>
-          <w:tcPr>
-            <w:tcW w:type="dxa" w:w="1872"/>
-            <w:vAlign w:val="center"/>
-            <w:shd w:fill="D9EAF7"/>
-            <w:tcMar>
-              <w:top w:w="80" w:type="dxa"/>
-              <w:start w:w="80" w:type="dxa"/>
-              <w:bottom w:w="80" w:type="dxa"/>
-              <w:end w:w="80" w:type="dxa"/>
-            </w:tcMar>
-          </w:tcPr>
-          <w:p>
-            <w:pPr>
-              <w:spacing w:after="0"/>
-              <w:jc w:val="center"/>
-            </w:pPr>
-            <w:r>
-              <w:rPr>
-                <w:rFonts w:ascii="Times New Roman" w:hAnsi="Times New Roman" w:eastAsia="黑体"/>
-                <w:b/>
-                <w:sz w:val="15"/>
-              </w:rPr>
-              <w:t>作用</w:t>
-            </w:r>
-          </w:p>
-        </w:tc>
-      </w:tr>
-      <w:tr>
-        <w:tc>
-          <w:tcPr>
-            <w:tcW w:type="dxa" w:w="1152"/>
-            <w:vAlign w:val="center"/>
-            <w:tcMar>
-              <w:top w:w="80" w:type="dxa"/>
-              <w:start w:w="80" w:type="dxa"/>
-              <w:bottom w:w="80" w:type="dxa"/>
-              <w:end w:w="80" w:type="dxa"/>
-            </w:tcMar>
-          </w:tcPr>
-          <w:p>
-            <w:pPr>
-              <w:spacing w:after="0" w:line="240" w:lineRule="auto"/>
-            </w:pPr>
-            <w:r>
-              <w:rPr>
-                <w:rFonts w:ascii="Times New Roman" w:hAnsi="Times New Roman" w:eastAsia="宋体"/>
-                <w:sz w:val="15"/>
-              </w:rPr>
-              <w:t>单元格/行</w:t>
-            </w:r>
-          </w:p>
-        </w:tc>
-        <w:tc>
-          <w:tcPr>
-            <w:tcW w:type="dxa" w:w="1296"/>
-            <w:vAlign w:val="center"/>
-            <w:tcMar>
-              <w:top w:w="80" w:type="dxa"/>
-              <w:start w:w="80" w:type="dxa"/>
-              <w:bottom w:w="80" w:type="dxa"/>
-              <w:end w:w="80" w:type="dxa"/>
-            </w:tcMar>
-          </w:tcPr>
-          <w:p>
-            <w:pPr>
-              <w:spacing w:after="0" w:line="240" w:lineRule="auto"/>
-            </w:pPr>
-            <w:r>
-              <w:rPr>
-                <w:rFonts w:ascii="Times New Roman" w:hAnsi="Times New Roman" w:eastAsia="宋体"/>
-                <w:sz w:val="15"/>
-              </w:rPr>
-              <w:t>SQLite</w:t>
-            </w:r>
-          </w:p>
-        </w:tc>
-        <w:tc>
-          <w:tcPr>
-            <w:tcW w:type="dxa" w:w="1872"/>
-            <w:vAlign w:val="center"/>
-            <w:tcMar>
-              <w:top w:w="80" w:type="dxa"/>
-              <w:start w:w="80" w:type="dxa"/>
-              <w:bottom w:w="80" w:type="dxa"/>
-              <w:end w:w="80" w:type="dxa"/>
-            </w:tcMar>
-          </w:tcPr>
-          <w:p>
-            <w:pPr>
-              <w:spacing w:after="0" w:line="240" w:lineRule="auto"/>
-            </w:pPr>
-            <w:r>
-              <w:rPr>
-                <w:rFonts w:ascii="Times New Roman" w:hAnsi="Times New Roman" w:eastAsia="宋体"/>
-                <w:sz w:val="15"/>
-              </w:rPr>
-              <w:t>结构化查询与证据回溯</w:t>
-            </w:r>
-          </w:p>
-        </w:tc>
-      </w:tr>
-      <w:tr>
-        <w:tc>
-          <w:tcPr>
-            <w:tcW w:type="dxa" w:w="1152"/>
-            <w:vAlign w:val="center"/>
-            <w:tcMar>
-              <w:top w:w="80" w:type="dxa"/>
-              <w:start w:w="80" w:type="dxa"/>
-              <w:bottom w:w="80" w:type="dxa"/>
-              <w:end w:w="80" w:type="dxa"/>
-            </w:tcMar>
-          </w:tcPr>
-          <w:p>
-            <w:pPr>
-              <w:spacing w:after="0" w:line="240" w:lineRule="auto"/>
-            </w:pPr>
-            <w:r>
-              <w:rPr>
-                <w:rFonts w:ascii="Times New Roman" w:hAnsi="Times New Roman" w:eastAsia="宋体"/>
-                <w:sz w:val="15"/>
-              </w:rPr>
-              <w:t>稀疏索引</w:t>
-            </w:r>
-          </w:p>
-        </w:tc>
-        <w:tc>
-          <w:tcPr>
-            <w:tcW w:type="dxa" w:w="1296"/>
-            <w:vAlign w:val="center"/>
-            <w:tcMar>
-              <w:top w:w="80" w:type="dxa"/>
-              <w:start w:w="80" w:type="dxa"/>
-              <w:bottom w:w="80" w:type="dxa"/>
-              <w:end w:w="80" w:type="dxa"/>
-            </w:tcMar>
-          </w:tcPr>
-          <w:p>
-            <w:pPr>
-              <w:spacing w:after="0" w:line="240" w:lineRule="auto"/>
-            </w:pPr>
-            <w:r>
-              <w:rPr>
-                <w:rFonts w:ascii="Times New Roman" w:hAnsi="Times New Roman" w:eastAsia="宋体"/>
-                <w:sz w:val="15"/>
-              </w:rPr>
-              <w:t>JSON</w:t>
-            </w:r>
-          </w:p>
-        </w:tc>
-        <w:tc>
-          <w:tcPr>
-            <w:tcW w:type="dxa" w:w="1872"/>
-            <w:vAlign w:val="center"/>
-            <w:tcMar>
-              <w:top w:w="80" w:type="dxa"/>
-              <w:start w:w="80" w:type="dxa"/>
-              <w:bottom w:w="80" w:type="dxa"/>
-              <w:end w:w="80" w:type="dxa"/>
-            </w:tcMar>
-          </w:tcPr>
-          <w:p>
-            <w:pPr>
-              <w:spacing w:after="0" w:line="240" w:lineRule="auto"/>
-            </w:pPr>
-            <w:r>
-              <w:rPr>
-                <w:rFonts w:ascii="Times New Roman" w:hAnsi="Times New Roman" w:eastAsia="宋体"/>
-                <w:sz w:val="15"/>
-              </w:rPr>
-              <w:t>离线关键词召回</w:t>
-            </w:r>
-          </w:p>
-        </w:tc>
-      </w:tr>
-      <w:tr>
-        <w:tc>
-          <w:tcPr>
-            <w:tcW w:type="dxa" w:w="1152"/>
-            <w:vAlign w:val="center"/>
-            <w:tcMar>
-              <w:top w:w="80" w:type="dxa"/>
-              <w:start w:w="80" w:type="dxa"/>
-              <w:bottom w:w="80" w:type="dxa"/>
-              <w:end w:w="80" w:type="dxa"/>
-            </w:tcMar>
-          </w:tcPr>
-          <w:p>
-            <w:pPr>
-              <w:spacing w:after="0" w:line="240" w:lineRule="auto"/>
-            </w:pPr>
-            <w:r>
-              <w:rPr>
-                <w:rFonts w:ascii="Times New Roman" w:hAnsi="Times New Roman" w:eastAsia="宋体"/>
-                <w:sz w:val="15"/>
-              </w:rPr>
-              <w:t>元数据</w:t>
-            </w:r>
-          </w:p>
-        </w:tc>
-        <w:tc>
-          <w:tcPr>
-            <w:tcW w:type="dxa" w:w="1296"/>
-            <w:vAlign w:val="center"/>
-            <w:tcMar>
-              <w:top w:w="80" w:type="dxa"/>
-              <w:start w:w="80" w:type="dxa"/>
-              <w:bottom w:w="80" w:type="dxa"/>
-              <w:end w:w="80" w:type="dxa"/>
-            </w:tcMar>
-          </w:tcPr>
-          <w:p>
-            <w:pPr>
-              <w:spacing w:after="0" w:line="240" w:lineRule="auto"/>
-            </w:pPr>
-            <w:r>
-              <w:rPr>
-                <w:rFonts w:ascii="Times New Roman" w:hAnsi="Times New Roman" w:eastAsia="宋体"/>
-                <w:sz w:val="15"/>
-              </w:rPr>
-              <w:t>KV/JSON</w:t>
-            </w:r>
-          </w:p>
-        </w:tc>
-        <w:tc>
-          <w:tcPr>
-            <w:tcW w:type="dxa" w:w="1872"/>
-            <w:vAlign w:val="center"/>
-            <w:tcMar>
-              <w:top w:w="80" w:type="dxa"/>
-              <w:start w:w="80" w:type="dxa"/>
-              <w:bottom w:w="80" w:type="dxa"/>
-              <w:end w:w="80" w:type="dxa"/>
-            </w:tcMar>
-          </w:tcPr>
-          <w:p>
-            <w:pPr>
-              <w:spacing w:after="0" w:line="240" w:lineRule="auto"/>
-            </w:pPr>
-            <w:r>
-              <w:rPr>
-                <w:rFonts w:ascii="Times New Roman" w:hAnsi="Times New Roman" w:eastAsia="宋体"/>
-                <w:sz w:val="15"/>
-              </w:rPr>
-              <w:t>标题、路径、规模记录</w:t>
-            </w:r>
-          </w:p>
-        </w:tc>
-      </w:tr>
-      <w:tr>
-        <w:tc>
-          <w:tcPr>
-            <w:tcW w:type="dxa" w:w="1152"/>
-            <w:vAlign w:val="center"/>
-            <w:tcMar>
-              <w:top w:w="80" w:type="dxa"/>
-              <w:start w:w="80" w:type="dxa"/>
-              <w:bottom w:w="80" w:type="dxa"/>
-              <w:end w:w="80" w:type="dxa"/>
-            </w:tcMar>
-          </w:tcPr>
-          <w:p>
-            <w:pPr>
-              <w:spacing w:after="0" w:line="240" w:lineRule="auto"/>
-            </w:pPr>
-            <w:r>
-              <w:rPr>
-                <w:rFonts w:ascii="Times New Roman" w:hAnsi="Times New Roman" w:eastAsia="宋体"/>
-                <w:sz w:val="15"/>
-              </w:rPr>
-              <w:t>语义扩展</w:t>
-            </w:r>
-          </w:p>
-        </w:tc>
-        <w:tc>
-          <w:tcPr>
-            <w:tcW w:type="dxa" w:w="1296"/>
-            <w:vAlign w:val="center"/>
-            <w:tcMar>
-              <w:top w:w="80" w:type="dxa"/>
-              <w:start w:w="80" w:type="dxa"/>
-              <w:bottom w:w="80" w:type="dxa"/>
-              <w:end w:w="80" w:type="dxa"/>
-            </w:tcMar>
-          </w:tcPr>
-          <w:p>
-            <w:pPr>
-              <w:spacing w:after="0" w:line="240" w:lineRule="auto"/>
-            </w:pPr>
-            <w:r>
-              <w:rPr>
-                <w:rFonts w:ascii="Times New Roman" w:hAnsi="Times New Roman" w:eastAsia="宋体"/>
-                <w:sz w:val="15"/>
-              </w:rPr>
-              <w:t>LLM/向量</w:t>
-            </w:r>
-          </w:p>
-        </w:tc>
-        <w:tc>
-          <w:tcPr>
-            <w:tcW w:type="dxa" w:w="1872"/>
-            <w:vAlign w:val="center"/>
-            <w:tcMar>
-              <w:top w:w="80" w:type="dxa"/>
-              <w:start w:w="80" w:type="dxa"/>
-              <w:bottom w:w="80" w:type="dxa"/>
-              <w:end w:w="80" w:type="dxa"/>
-            </w:tcMar>
-          </w:tcPr>
-          <w:p>
-            <w:pPr>
-              <w:spacing w:after="0" w:line="240" w:lineRule="auto"/>
-            </w:pPr>
-            <w:r>
-              <w:rPr>
-                <w:rFonts w:ascii="Times New Roman" w:hAnsi="Times New Roman" w:eastAsia="宋体"/>
-                <w:sz w:val="15"/>
-              </w:rPr>
-              <w:t>后续增强接口</w:t>
-            </w:r>
-          </w:p>
-        </w:tc>
-      </w:tr>
-    </w:tbl>
-    <w:p/>
-    <w:p>
-      <w:pPr>
-        <w:pStyle w:val="1"/>
-        <w:spacing w:before="140" w:after="60"/>
-      </w:pPr>
-      <w:r>
-        <w:rPr>
-          <w:rFonts w:ascii="Times New Roman" w:hAnsi="Times New Roman" w:eastAsia="黑体"/>
-          <w:b/>
-        </w:rPr>
-        <w:t>6 查询路由逻辑</w:t>
-      </w:r>
-    </w:p>
-    <w:p>
-      <w:pPr>
-        <w:spacing w:line="259" w:lineRule="auto" w:after="60"/>
-        <w:ind w:firstLine="360"/>
-      </w:pPr>
-      <w:r>
-        <w:rPr>
-          <w:rFonts w:ascii="Times New Roman" w:hAnsi="Times New Roman" w:eastAsia="宋体"/>
-        </w:rPr>
-        <w:t>查询路由分为两层。第一层由 RuleBasedRouter 根据问题中的“多少、最高、最低、总和、平均、哪些、是否、相比”等词汇识别意图。第二层由 HybridQueryEngine 决定具体执行器：若表格适合关系化且置信度足够，则优先调用 RelationalAnswerEngine；否则使用 lookup、list、count、extreme、sum、avg 等轻量执行器和单元格检索兜底。</w:t>
-      </w:r>
-    </w:p>
-    <w:p>
-      <w:pPr>
-        <w:spacing w:line="259" w:lineRule="auto" w:after="60"/>
-        <w:ind w:firstLine="360"/>
-      </w:pPr>
-      <w:r>
-        <w:rPr>
-          <w:rFonts w:ascii="Times New Roman" w:hAnsi="Times New Roman" w:eastAsia="宋体"/>
-        </w:rPr>
-        <w:t>RelationalAnswerEngine 的关键是先抽取条件，再选择目标列。例如“标准分为 2 的考核项目有多少条”会被解析为条件列“标准分=2”和目标对象“考核项目”；“6 月份 A 产品的利润相比 5 月份减少了多少”会被解析为实体 A 产品、指标利润、月份 6 月与 5 月，并执行差值计算。执行后系统返回答案和置信度，低置信度结果不会强行覆盖原检索结果。</w:t>
-      </w:r>
-    </w:p>
-    <w:p>
-      <w:pPr>
-        <w:pStyle w:val="1"/>
-        <w:spacing w:before="140" w:after="60"/>
-      </w:pPr>
-      <w:r>
-        <w:rPr>
-          <w:rFonts w:ascii="Times New Roman" w:hAnsi="Times New Roman" w:eastAsia="黑体"/>
-          <w:b/>
-        </w:rPr>
-        <w:t>7 功能完善与 Bug 修复</w:t>
-      </w:r>
-    </w:p>
-    <w:p>
-      <w:pPr>
-        <w:spacing w:line="259" w:lineRule="auto" w:after="60"/>
-        <w:ind w:firstLine="360"/>
-      </w:pPr>
-      <w:r>
-        <w:rPr>
-          <w:rFonts w:ascii="Times New Roman" w:hAnsi="Times New Roman" w:eastAsia="宋体"/>
-        </w:rPr>
-        <w:t>早期版本主要依赖单元格检索，因此在简单查值题上可以工作，但对计数、列表、跨月份运算和多条件筛选较弱。本次优化加入了关系执行器、表格适配性判断、章节范围统计、宽表月份解析、百分比/差值计算、无表头文本表恢复和更保守的列表答案匹配，使系统从“能找相似文本”逐步变成“能执行局部表格操作”。</w:t>
-      </w:r>
-    </w:p>
-    <w:tbl>
-      <w:tblPr>
-        <w:tblStyle w:val="af4"/>
-        <w:tblW w:type="auto" w:w="0"/>
-        <w:jc w:val="center"/>
-        <w:tblLook w:firstColumn="1" w:firstRow="1" w:lastColumn="0" w:lastRow="0" w:noHBand="0" w:noVBand="1" w:val="04A0"/>
-      </w:tblPr>
-      <w:tblGrid>
-        <w:gridCol w:w="4771"/>
-        <w:gridCol w:w="4771"/>
-      </w:tblGrid>
-      <w:tr>
-        <w:tc>
-          <w:tcPr>
-            <w:tcW w:type="dxa" w:w="1656"/>
-            <w:vAlign w:val="center"/>
-            <w:shd w:fill="D9EAF7"/>
-            <w:tcMar>
-              <w:top w:w="80" w:type="dxa"/>
-              <w:start w:w="80" w:type="dxa"/>
-              <w:bottom w:w="80" w:type="dxa"/>
-              <w:end w:w="80" w:type="dxa"/>
-            </w:tcMar>
-          </w:tcPr>
-          <w:p>
-            <w:pPr>
-              <w:spacing w:after="0"/>
-              <w:jc w:val="center"/>
-            </w:pPr>
-            <w:r>
-              <w:rPr>
-                <w:rFonts w:ascii="Times New Roman" w:hAnsi="Times New Roman" w:eastAsia="黑体"/>
-                <w:b/>
-                <w:sz w:val="15"/>
-              </w:rPr>
-              <w:t>问题</w:t>
-            </w:r>
-          </w:p>
-        </w:tc>
         <w:tc>
           <w:tcPr>
             <w:tcW w:type="dxa" w:w="2664"/>
@@ -1085,18 +853,17 @@
               <w:rPr>
                 <w:rFonts w:ascii="Times New Roman" w:hAnsi="Times New Roman" w:eastAsia="黑体"/>
                 <w:b/>
-                <w:sz w:val="15"/>
+                <w:sz w:val="14"/>
               </w:rPr>
-              <w:t>处理</w:t>
+              <w:t>文件</w:t>
             </w:r>
           </w:p>
         </w:tc>
-      </w:tr>
-      <w:tr>
         <w:tc>
           <w:tcPr>
-            <w:tcW w:type="dxa" w:w="1656"/>
+            <w:tcW w:type="dxa" w:w="6696"/>
             <w:vAlign w:val="center"/>
+            <w:shd w:fill="D9EAF7"/>
             <w:tcMar>
               <w:top w:w="80" w:type="dxa"/>
               <w:start w:w="80" w:type="dxa"/>
@@ -1106,17 +873,21 @@
           </w:tcPr>
           <w:p>
             <w:pPr>
-              <w:spacing w:after="0" w:line="240" w:lineRule="auto"/>
+              <w:spacing w:after="0"/>
+              <w:jc w:val="center"/>
             </w:pPr>
             <w:r>
               <w:rPr>
-                <w:rFonts w:ascii="Times New Roman" w:hAnsi="Times New Roman" w:eastAsia="宋体"/>
-                <w:sz w:val="15"/>
+                <w:rFonts w:ascii="Times New Roman" w:hAnsi="Times New Roman" w:eastAsia="黑体"/>
+                <w:b/>
+                <w:sz w:val="14"/>
               </w:rPr>
-              <w:t>旧指标仍为 30.37%</w:t>
+              <w:t>功能与实现思路</w:t>
             </w:r>
           </w:p>
         </w:tc>
+      </w:tr>
+      <w:tr>
         <w:tc>
           <w:tcPr>
             <w:tcW w:type="dxa" w:w="2664"/>
@@ -1135,17 +906,15 @@
             <w:r>
               <w:rPr>
                 <w:rFonts w:ascii="Times New Roman" w:hAnsi="Times New Roman" w:eastAsia="宋体"/>
-                <w:sz w:val="15"/>
+                <w:sz w:val="14"/>
               </w:rPr>
-              <w:t>同步为最新 55.50%</w:t>
+              <w:t>src/main.py</w:t>
             </w:r>
           </w:p>
         </w:tc>
-      </w:tr>
-      <w:tr>
         <w:tc>
           <w:tcPr>
-            <w:tcW w:type="dxa" w:w="1656"/>
+            <w:tcW w:type="dxa" w:w="6696"/>
             <w:vAlign w:val="center"/>
             <w:tcMar>
               <w:top w:w="80" w:type="dxa"/>
@@ -1161,12 +930,14 @@
             <w:r>
               <w:rPr>
                 <w:rFonts w:ascii="Times New Roman" w:hAnsi="Times New Roman" w:eastAsia="宋体"/>
-                <w:sz w:val="15"/>
+                <w:sz w:val="14"/>
               </w:rPr>
-              <w:t>关系表缺失</w:t>
+              <w:t>命令行入口和系统编排文件。它读取 config.yaml，初始化 TableQuerySystem，并根据参数决定执行单条问答、重建索引或全量评测。评测时逐行读取 test.jsonl，根据 table_id 调用 HybridQueryEngine，随后用 AnswerMatcher 判断预测答案是否正确，并把结果写入 evaluation_report.json。</w:t>
             </w:r>
           </w:p>
         </w:tc>
+      </w:tr>
+      <w:tr>
         <w:tc>
           <w:tcPr>
             <w:tcW w:type="dxa" w:w="2664"/>
@@ -1185,17 +956,15 @@
             <w:r>
               <w:rPr>
                 <w:rFonts w:ascii="Times New Roman" w:hAnsi="Times New Roman" w:eastAsia="宋体"/>
-                <w:sz w:val="15"/>
+                <w:sz w:val="14"/>
               </w:rPr>
-              <w:t>新增局部关系视图</w:t>
+              <w:t>src/hybrid_engine.py</w:t>
             </w:r>
           </w:p>
         </w:tc>
-      </w:tr>
-      <w:tr>
         <w:tc>
           <w:tcPr>
-            <w:tcW w:type="dxa" w:w="1656"/>
+            <w:tcW w:type="dxa" w:w="6696"/>
             <w:vAlign w:val="center"/>
             <w:tcMar>
               <w:top w:w="80" w:type="dxa"/>
@@ -1211,12 +980,14 @@
             <w:r>
               <w:rPr>
                 <w:rFonts w:ascii="Times New Roman" w:hAnsi="Times New Roman" w:eastAsia="宋体"/>
-                <w:sz w:val="15"/>
+                <w:sz w:val="14"/>
               </w:rPr>
-              <w:t>章节计数失败</w:t>
+              <w:t>系统主查询引擎。启动时加载 TableIndexer 生成的 CellRecord 与 RowRecord，并按 table_id 建立内存索引。回答问题时先尝试 RelationalAnswerEngine；若其置信度不足，再按 lookup、list、count、extreme、sum、avg 等路由使用规则执行器和单元格检索兜底。last_trace 用于 explain 模式展示答案来源。</w:t>
             </w:r>
           </w:p>
         </w:tc>
+      </w:tr>
+      <w:tr>
         <w:tc>
           <w:tcPr>
             <w:tcW w:type="dxa" w:w="2664"/>
@@ -1235,17 +1006,15 @@
             <w:r>
               <w:rPr>
                 <w:rFonts w:ascii="Times New Roman" w:hAnsi="Times New Roman" w:eastAsia="宋体"/>
-                <w:sz w:val="15"/>
+                <w:sz w:val="14"/>
               </w:rPr>
-              <w:t>记录章节与条目边界</w:t>
+              <w:t>src/relational_engine.py</w:t>
             </w:r>
           </w:p>
         </w:tc>
-      </w:tr>
-      <w:tr>
         <w:tc>
           <w:tcPr>
-            <w:tcW w:type="dxa" w:w="1656"/>
+            <w:tcW w:type="dxa" w:w="6696"/>
             <w:vAlign w:val="center"/>
             <w:tcMar>
               <w:top w:w="80" w:type="dxa"/>
@@ -1261,12 +1030,14 @@
             <w:r>
               <w:rPr>
                 <w:rFonts w:ascii="Times New Roman" w:hAnsi="Times New Roman" w:eastAsia="宋体"/>
-                <w:sz w:val="15"/>
+                <w:sz w:val="14"/>
               </w:rPr>
-              <w:t>月份宽表错误</w:t>
+              <w:t>当前准确率提升的核心文件。它把部分半结构化表恢复成 TableView，包括表头、记录行、首列和月份宽表列。随后按问题抽取实体、指标、月份、条件和聚合意图，执行筛选、计数、极值、求和、均值、差值和百分比计算。该模块带有置信度门控，避免低可信关系结果覆盖检索结果。</w:t>
             </w:r>
           </w:p>
         </w:tc>
+      </w:tr>
+      <w:tr>
         <w:tc>
           <w:tcPr>
             <w:tcW w:type="dxa" w:w="2664"/>
@@ -1285,17 +1056,15 @@
             <w:r>
               <w:rPr>
                 <w:rFonts w:ascii="Times New Roman" w:hAnsi="Times New Roman" w:eastAsia="宋体"/>
-                <w:sz w:val="15"/>
+                <w:sz w:val="14"/>
               </w:rPr>
-              <w:t>识别月份列并执行差值</w:t>
+              <w:t>src/table_indexer.py</w:t>
             </w:r>
           </w:p>
         </w:tc>
-      </w:tr>
-      <w:tr>
         <w:tc>
           <w:tcPr>
-            <w:tcW w:type="dxa" w:w="1656"/>
+            <w:tcW w:type="dxa" w:w="6696"/>
             <w:vAlign w:val="center"/>
             <w:tcMar>
               <w:top w:w="80" w:type="dxa"/>
@@ -1311,12 +1080,14 @@
             <w:r>
               <w:rPr>
                 <w:rFonts w:ascii="Times New Roman" w:hAnsi="Times New Roman" w:eastAsia="宋体"/>
-                <w:sz w:val="15"/>
+                <w:sz w:val="14"/>
               </w:rPr>
-              <w:t>列表答案过严</w:t>
+              <w:t>索引构建文件。它遍历 data/raw 下的 Excel 文件，填充合并单元格、提取标题和行列上下文，为每个非空单元格生成 CellRecord，为每行生成 RowRecord。索引同时写入 SQLite 和 JSON：SQLite 便于审计和结构化查询，JSON 便于快速加载和离线检索。</w:t>
             </w:r>
           </w:p>
         </w:tc>
+      </w:tr>
+      <w:tr>
         <w:tc>
           <w:tcPr>
             <w:tcW w:type="dxa" w:w="2664"/>
@@ -1335,139 +1106,15 @@
             <w:r>
               <w:rPr>
                 <w:rFonts w:ascii="Times New Roman" w:hAnsi="Times New Roman" w:eastAsia="宋体"/>
-                <w:sz w:val="15"/>
+                <w:sz w:val="14"/>
               </w:rPr>
-              <w:t>增加保守集合匹配</w:t>
-            </w:r>
-          </w:p>
-        </w:tc>
-      </w:tr>
-    </w:tbl>
-    <w:p/>
-    <w:p>
-      <w:pPr>
-        <w:pStyle w:val="1"/>
-        <w:spacing w:before="140" w:after="60"/>
-      </w:pPr>
-      <w:r>
-        <w:rPr>
-          <w:rFonts w:ascii="Times New Roman" w:hAnsi="Times New Roman" w:eastAsia="黑体"/>
-          <w:b/>
-        </w:rPr>
-        <w:t>8 实验设置与结果</w:t>
-      </w:r>
-    </w:p>
-    <w:p>
-      <w:pPr>
-        <w:spacing w:line="259" w:lineRule="auto" w:after="60"/>
-        <w:ind w:firstLine="360"/>
-      </w:pPr>
-      <w:r>
-        <w:rPr>
-          <w:rFonts w:ascii="Times New Roman" w:hAnsi="Times New Roman" w:eastAsia="宋体"/>
-        </w:rPr>
-        <w:t>实验在本地 Windows + Python 环境中完成，默认不启用在线 LLM API。评测命令为 python src/main.py --evaluate --quiet，系统读取完整 test.jsonl，并将结果写入 data/processed/evaluation_report.json。当前版本全量样本准确率为 55.50%，已接近课程项目设定的 60% 左右目标。</w:t>
-      </w:r>
-    </w:p>
-    <w:tbl>
-      <w:tblPr>
-        <w:tblStyle w:val="af4"/>
-        <w:tblW w:type="auto" w:w="0"/>
-        <w:jc w:val="center"/>
-        <w:tblLook w:firstColumn="1" w:firstRow="1" w:lastColumn="0" w:lastRow="0" w:noHBand="0" w:noVBand="1" w:val="04A0"/>
-      </w:tblPr>
-      <w:tblGrid>
-        <w:gridCol w:w="3181"/>
-        <w:gridCol w:w="3181"/>
-        <w:gridCol w:w="3181"/>
-      </w:tblGrid>
-      <w:tr>
-        <w:tc>
-          <w:tcPr>
-            <w:tcW w:type="dxa" w:w="1296"/>
-            <w:vAlign w:val="center"/>
-            <w:shd w:fill="D9EAF7"/>
-            <w:tcMar>
-              <w:top w:w="80" w:type="dxa"/>
-              <w:start w:w="80" w:type="dxa"/>
-              <w:bottom w:w="80" w:type="dxa"/>
-              <w:end w:w="80" w:type="dxa"/>
-            </w:tcMar>
-          </w:tcPr>
-          <w:p>
-            <w:pPr>
-              <w:spacing w:after="0"/>
-              <w:jc w:val="center"/>
-            </w:pPr>
-            <w:r>
-              <w:rPr>
-                <w:rFonts w:ascii="Times New Roman" w:hAnsi="Times New Roman" w:eastAsia="黑体"/>
-                <w:b/>
-                <w:sz w:val="15"/>
-              </w:rPr>
-              <w:t>版本</w:t>
+              <w:t>src/text_utils.py</w:t>
             </w:r>
           </w:p>
         </w:tc>
         <w:tc>
           <w:tcPr>
-            <w:tcW w:type="dxa" w:w="1080"/>
-            <w:vAlign w:val="center"/>
-            <w:shd w:fill="D9EAF7"/>
-            <w:tcMar>
-              <w:top w:w="80" w:type="dxa"/>
-              <w:start w:w="80" w:type="dxa"/>
-              <w:bottom w:w="80" w:type="dxa"/>
-              <w:end w:w="80" w:type="dxa"/>
-            </w:tcMar>
-          </w:tcPr>
-          <w:p>
-            <w:pPr>
-              <w:spacing w:after="0"/>
-              <w:jc w:val="center"/>
-            </w:pPr>
-            <w:r>
-              <w:rPr>
-                <w:rFonts w:ascii="Times New Roman" w:hAnsi="Times New Roman" w:eastAsia="黑体"/>
-                <w:b/>
-                <w:sz w:val="15"/>
-              </w:rPr>
-              <w:t>整体</w:t>
-            </w:r>
-          </w:p>
-        </w:tc>
-        <w:tc>
-          <w:tcPr>
-            <w:tcW w:type="dxa" w:w="1944"/>
-            <w:vAlign w:val="center"/>
-            <w:shd w:fill="D9EAF7"/>
-            <w:tcMar>
-              <w:top w:w="80" w:type="dxa"/>
-              <w:start w:w="80" w:type="dxa"/>
-              <w:bottom w:w="80" w:type="dxa"/>
-              <w:end w:w="80" w:type="dxa"/>
-            </w:tcMar>
-          </w:tcPr>
-          <w:p>
-            <w:pPr>
-              <w:spacing w:after="0"/>
-              <w:jc w:val="center"/>
-            </w:pPr>
-            <w:r>
-              <w:rPr>
-                <w:rFonts w:ascii="Times New Roman" w:hAnsi="Times New Roman" w:eastAsia="黑体"/>
-                <w:b/>
-                <w:sz w:val="15"/>
-              </w:rPr>
-              <w:t>说明</w:t>
-            </w:r>
-          </w:p>
-        </w:tc>
-      </w:tr>
-      <w:tr>
-        <w:tc>
-          <w:tcPr>
-            <w:tcW w:type="dxa" w:w="1296"/>
+            <w:tcW w:type="dxa" w:w="6696"/>
             <w:vAlign w:val="center"/>
             <w:tcMar>
               <w:top w:w="80" w:type="dxa"/>
@@ -1483,15 +1130,17 @@
             <w:r>
               <w:rPr>
                 <w:rFonts w:ascii="Times New Roman" w:hAnsi="Times New Roman" w:eastAsia="宋体"/>
-                <w:sz w:val="15"/>
+                <w:sz w:val="14"/>
               </w:rPr>
-              <w:t>初始版</w:t>
+              <w:t>文本规范化与打分工具库。它负责中文问题清洗、数字抽取、Excel 显示值格式化、单位提取、中文 n-gram token 生成、加权重合度计算和去重。该文件使不同模块可以共享同一套文本匹配逻辑，避免各处重复写字符串处理代码。</w:t>
             </w:r>
           </w:p>
         </w:tc>
+      </w:tr>
+      <w:tr>
         <w:tc>
           <w:tcPr>
-            <w:tcW w:type="dxa" w:w="1080"/>
+            <w:tcW w:type="dxa" w:w="2664"/>
             <w:vAlign w:val="center"/>
             <w:tcMar>
               <w:top w:w="80" w:type="dxa"/>
@@ -1507,15 +1156,15 @@
             <w:r>
               <w:rPr>
                 <w:rFonts w:ascii="Times New Roman" w:hAnsi="Times New Roman" w:eastAsia="宋体"/>
-                <w:sz w:val="15"/>
+                <w:sz w:val="14"/>
               </w:rPr>
-              <w:t>30.37%</w:t>
+              <w:t>src/parser/excel_parser.py</w:t>
             </w:r>
           </w:p>
         </w:tc>
         <w:tc>
           <w:tcPr>
-            <w:tcW w:type="dxa" w:w="1944"/>
+            <w:tcW w:type="dxa" w:w="6696"/>
             <w:vAlign w:val="center"/>
             <w:tcMar>
               <w:top w:w="80" w:type="dxa"/>
@@ -1531,9 +1180,9 @@
             <w:r>
               <w:rPr>
                 <w:rFonts w:ascii="Times New Roman" w:hAnsi="Times New Roman" w:eastAsia="宋体"/>
-                <w:sz w:val="15"/>
+                <w:sz w:val="14"/>
               </w:rPr>
-              <w:t>单元格检索为主</w:t>
+              <w:t>Excel 解析器。它使用 openpyxl 读取公式缓存后的显示值，填充合并区域，裁剪外围全空行列，并在可识别表头时返回带列名的 DataFrame。其设计目标不是立即得到完美关系表，而是尽量保留原始视觉结构，为后续证据索引和局部关系恢复提供基础。</w:t>
             </w:r>
           </w:p>
         </w:tc>
@@ -1541,7 +1190,7 @@
       <w:tr>
         <w:tc>
           <w:tcPr>
-            <w:tcW w:type="dxa" w:w="1296"/>
+            <w:tcW w:type="dxa" w:w="2664"/>
             <w:vAlign w:val="center"/>
             <w:tcMar>
               <w:top w:w="80" w:type="dxa"/>
@@ -1557,15 +1206,15 @@
             <w:r>
               <w:rPr>
                 <w:rFonts w:ascii="Times New Roman" w:hAnsi="Times New Roman" w:eastAsia="宋体"/>
-                <w:sz w:val="15"/>
+                <w:sz w:val="14"/>
               </w:rPr>
-              <w:t>中间版</w:t>
+              <w:t>src/parser/structure_analyzer.py</w:t>
             </w:r>
           </w:p>
         </w:tc>
         <w:tc>
           <w:tcPr>
-            <w:tcW w:type="dxa" w:w="1080"/>
+            <w:tcW w:type="dxa" w:w="6696"/>
             <w:vAlign w:val="center"/>
             <w:tcMar>
               <w:top w:w="80" w:type="dxa"/>
@@ -1581,15 +1230,17 @@
             <w:r>
               <w:rPr>
                 <w:rFonts w:ascii="Times New Roman" w:hAnsi="Times New Roman" w:eastAsia="宋体"/>
-                <w:sz w:val="15"/>
+                <w:sz w:val="14"/>
               </w:rPr>
-              <w:t>46.99%</w:t>
+              <w:t>轻量结构分析器。它可以抽取前若干行的多级表头、将层级表头展平成列名，并根据数据列内容推断 numeric、datetime 或 text 类型。当前主流程主要使用更强的 TableIndexer 与 RelationalAnswerEngine，但该文件保留了可扩展的结构分析接口。</w:t>
             </w:r>
           </w:p>
         </w:tc>
+      </w:tr>
+      <w:tr>
         <w:tc>
           <w:tcPr>
-            <w:tcW w:type="dxa" w:w="1944"/>
+            <w:tcW w:type="dxa" w:w="2664"/>
             <w:vAlign w:val="center"/>
             <w:tcMar>
               <w:top w:w="80" w:type="dxa"/>
@@ -1605,17 +1256,15 @@
             <w:r>
               <w:rPr>
                 <w:rFonts w:ascii="Times New Roman" w:hAnsi="Times New Roman" w:eastAsia="宋体"/>
-                <w:sz w:val="15"/>
+                <w:sz w:val="14"/>
               </w:rPr>
-              <w:t>加入关系执行</w:t>
+              <w:t>src/router/query_router.py</w:t>
             </w:r>
           </w:p>
         </w:tc>
-      </w:tr>
-      <w:tr>
         <w:tc>
           <w:tcPr>
-            <w:tcW w:type="dxa" w:w="1296"/>
+            <w:tcW w:type="dxa" w:w="6696"/>
             <w:vAlign w:val="center"/>
             <w:tcMar>
               <w:top w:w="80" w:type="dxa"/>
@@ -1631,15 +1280,17 @@
             <w:r>
               <w:rPr>
                 <w:rFonts w:ascii="Times New Roman" w:hAnsi="Times New Roman" w:eastAsia="宋体"/>
-                <w:sz w:val="15"/>
+                <w:sz w:val="14"/>
               </w:rPr>
-              <w:t>当前版</w:t>
+              <w:t>透明规则路由器。它按关键词把问题粗分为 SQL_AGG、KV_LOOKUP、VECTOR_SEARCH、CELL_LOOKUP 等类别，并映射到对应 Agent 名称。它的优点是无需 API、结果可解释；缺点是语义覆盖有限，因此主流程中还叠加了 HybridQueryEngine 的细粒度路由。</w:t>
             </w:r>
           </w:p>
         </w:tc>
+      </w:tr>
+      <w:tr>
         <w:tc>
           <w:tcPr>
-            <w:tcW w:type="dxa" w:w="1080"/>
+            <w:tcW w:type="dxa" w:w="2664"/>
             <w:vAlign w:val="center"/>
             <w:tcMar>
               <w:top w:w="80" w:type="dxa"/>
@@ -1655,15 +1306,15 @@
             <w:r>
               <w:rPr>
                 <w:rFonts w:ascii="Times New Roman" w:hAnsi="Times New Roman" w:eastAsia="宋体"/>
-                <w:sz w:val="15"/>
+                <w:sz w:val="14"/>
               </w:rPr>
-              <w:t>55.50%</w:t>
+              <w:t>src/router/query_classifier.py</w:t>
             </w:r>
           </w:p>
         </w:tc>
         <w:tc>
           <w:tcPr>
-            <w:tcW w:type="dxa" w:w="1944"/>
+            <w:tcW w:type="dxa" w:w="6696"/>
             <w:vAlign w:val="center"/>
             <w:tcMar>
               <w:top w:w="80" w:type="dxa"/>
@@ -1679,106 +1330,9 @@
             <w:r>
               <w:rPr>
                 <w:rFonts w:ascii="Times New Roman" w:hAnsi="Times New Roman" w:eastAsia="宋体"/>
-                <w:sz w:val="15"/>
+                <w:sz w:val="14"/>
               </w:rPr>
-              <w:t>增强宽表、章节、列表</w:t>
-            </w:r>
-          </w:p>
-        </w:tc>
-      </w:tr>
-    </w:tbl>
-    <w:p/>
-    <w:tbl>
-      <w:tblPr>
-        <w:tblStyle w:val="af4"/>
-        <w:tblW w:type="auto" w:w="0"/>
-        <w:jc w:val="center"/>
-        <w:tblLook w:firstColumn="1" w:firstRow="1" w:lastColumn="0" w:lastRow="0" w:noHBand="0" w:noVBand="1" w:val="04A0"/>
-      </w:tblPr>
-      <w:tblGrid>
-        <w:gridCol w:w="3181"/>
-        <w:gridCol w:w="3181"/>
-        <w:gridCol w:w="3181"/>
-      </w:tblGrid>
-      <w:tr>
-        <w:tc>
-          <w:tcPr>
-            <w:tcW w:type="dxa" w:w="1728"/>
-            <w:vAlign w:val="center"/>
-            <w:shd w:fill="D9EAF7"/>
-            <w:tcMar>
-              <w:top w:w="80" w:type="dxa"/>
-              <w:start w:w="80" w:type="dxa"/>
-              <w:bottom w:w="80" w:type="dxa"/>
-              <w:end w:w="80" w:type="dxa"/>
-            </w:tcMar>
-          </w:tcPr>
-          <w:p>
-            <w:pPr>
-              <w:spacing w:after="0"/>
-              <w:jc w:val="center"/>
-            </w:pPr>
-            <w:r>
-              <w:rPr>
-                <w:rFonts w:ascii="Times New Roman" w:hAnsi="Times New Roman" w:eastAsia="黑体"/>
-                <w:b/>
-                <w:sz w:val="15"/>
-              </w:rPr>
-              <w:t>类别</w:t>
-            </w:r>
-          </w:p>
-        </w:tc>
-        <w:tc>
-          <w:tcPr>
-            <w:tcW w:type="dxa" w:w="1008"/>
-            <w:vAlign w:val="center"/>
-            <w:shd w:fill="D9EAF7"/>
-            <w:tcMar>
-              <w:top w:w="80" w:type="dxa"/>
-              <w:start w:w="80" w:type="dxa"/>
-              <w:bottom w:w="80" w:type="dxa"/>
-              <w:end w:w="80" w:type="dxa"/>
-            </w:tcMar>
-          </w:tcPr>
-          <w:p>
-            <w:pPr>
-              <w:spacing w:after="0"/>
-              <w:jc w:val="center"/>
-            </w:pPr>
-            <w:r>
-              <w:rPr>
-                <w:rFonts w:ascii="Times New Roman" w:hAnsi="Times New Roman" w:eastAsia="黑体"/>
-                <w:b/>
-                <w:sz w:val="15"/>
-              </w:rPr>
-              <w:t>样本</w:t>
-            </w:r>
-          </w:p>
-        </w:tc>
-        <w:tc>
-          <w:tcPr>
-            <w:tcW w:type="dxa" w:w="1296"/>
-            <w:vAlign w:val="center"/>
-            <w:shd w:fill="D9EAF7"/>
-            <w:tcMar>
-              <w:top w:w="80" w:type="dxa"/>
-              <w:start w:w="80" w:type="dxa"/>
-              <w:bottom w:w="80" w:type="dxa"/>
-              <w:end w:w="80" w:type="dxa"/>
-            </w:tcMar>
-          </w:tcPr>
-          <w:p>
-            <w:pPr>
-              <w:spacing w:after="0"/>
-              <w:jc w:val="center"/>
-            </w:pPr>
-            <w:r>
-              <w:rPr>
-                <w:rFonts w:ascii="Times New Roman" w:hAnsi="Times New Roman" w:eastAsia="黑体"/>
-                <w:b/>
-                <w:sz w:val="15"/>
-              </w:rPr>
-              <w:t>准确率</w:t>
+              <w:t>可选 LLM 分类器。若 config.yaml 中启用 LLM 且配置 API key，则尝试使用 langchain_deepseek 调用模型输出 JSON 分类；否则自动回退到 RuleBasedRouter。这样既保留语义分类扩展空间，又不影响离线课堂环境运行。</w:t>
             </w:r>
           </w:p>
         </w:tc>
@@ -1786,7 +1340,7 @@
       <w:tr>
         <w:tc>
           <w:tcPr>
-            <w:tcW w:type="dxa" w:w="1728"/>
+            <w:tcW w:type="dxa" w:w="2664"/>
             <w:vAlign w:val="center"/>
             <w:tcMar>
               <w:top w:w="80" w:type="dxa"/>
@@ -1802,15 +1356,15 @@
             <w:r>
               <w:rPr>
                 <w:rFonts w:ascii="Times New Roman" w:hAnsi="Times New Roman" w:eastAsia="宋体"/>
-                <w:sz w:val="15"/>
+                <w:sz w:val="14"/>
               </w:rPr>
-              <w:t>Content Match</w:t>
+              <w:t>src/storage/sql_storage.py</w:t>
             </w:r>
           </w:p>
         </w:tc>
         <w:tc>
           <w:tcPr>
-            <w:tcW w:type="dxa" w:w="1008"/>
+            <w:tcW w:type="dxa" w:w="6696"/>
             <w:vAlign w:val="center"/>
             <w:tcMar>
               <w:top w:w="80" w:type="dxa"/>
@@ -1826,15 +1380,17 @@
             <w:r>
               <w:rPr>
                 <w:rFonts w:ascii="Times New Roman" w:hAnsi="Times New Roman" w:eastAsia="宋体"/>
-                <w:sz w:val="15"/>
+                <w:sz w:val="14"/>
               </w:rPr>
-              <w:t>484</w:t>
+              <w:t>SQLite 存储封装。它可以把 DataFrame 写成数据库表，执行 SQL 查询，获取表名并关闭连接。该模块主要服务 SQLAgent 和早期原型，也体现了课程数据库部分的关系型存储接口。</w:t>
             </w:r>
           </w:p>
         </w:tc>
+      </w:tr>
+      <w:tr>
         <w:tc>
           <w:tcPr>
-            <w:tcW w:type="dxa" w:w="1296"/>
+            <w:tcW w:type="dxa" w:w="2664"/>
             <w:vAlign w:val="center"/>
             <w:tcMar>
               <w:top w:w="80" w:type="dxa"/>
@@ -1850,17 +1406,15 @@
             <w:r>
               <w:rPr>
                 <w:rFonts w:ascii="Times New Roman" w:hAnsi="Times New Roman" w:eastAsia="宋体"/>
-                <w:sz w:val="15"/>
+                <w:sz w:val="14"/>
               </w:rPr>
-              <w:t>61.36%</w:t>
+              <w:t>src/storage/kv_storage.py</w:t>
             </w:r>
           </w:p>
         </w:tc>
-      </w:tr>
-      <w:tr>
         <w:tc>
           <w:tcPr>
-            <w:tcW w:type="dxa" w:w="1728"/>
+            <w:tcW w:type="dxa" w:w="6696"/>
             <w:vAlign w:val="center"/>
             <w:tcMar>
               <w:top w:w="80" w:type="dxa"/>
@@ -1876,15 +1430,17 @@
             <w:r>
               <w:rPr>
                 <w:rFonts w:ascii="Times New Roman" w:hAnsi="Times New Roman" w:eastAsia="宋体"/>
-                <w:sz w:val="15"/>
+                <w:sz w:val="14"/>
               </w:rPr>
-              <w:t>Numeric Computation</w:t>
+              <w:t>JSON 文件形式的 Key-Value 存储。它提供 set、get、delete、contains、get_all 等基础接口，适合保存表级说明、数据来源、单位和运行元数据等不适合放入关系表的轻量信息。</w:t>
             </w:r>
           </w:p>
         </w:tc>
+      </w:tr>
+      <w:tr>
         <w:tc>
           <w:tcPr>
-            <w:tcW w:type="dxa" w:w="1008"/>
+            <w:tcW w:type="dxa" w:w="2664"/>
             <w:vAlign w:val="center"/>
             <w:tcMar>
               <w:top w:w="80" w:type="dxa"/>
@@ -1900,15 +1456,15 @@
             <w:r>
               <w:rPr>
                 <w:rFonts w:ascii="Times New Roman" w:hAnsi="Times New Roman" w:eastAsia="宋体"/>
-                <w:sz w:val="15"/>
+                <w:sz w:val="14"/>
               </w:rPr>
-              <w:t>157</w:t>
+              <w:t>src/storage/vector_storage.py</w:t>
             </w:r>
           </w:p>
         </w:tc>
         <w:tc>
           <w:tcPr>
-            <w:tcW w:type="dxa" w:w="1296"/>
+            <w:tcW w:type="dxa" w:w="6696"/>
             <w:vAlign w:val="center"/>
             <w:tcMar>
               <w:top w:w="80" w:type="dxa"/>
@@ -1924,9 +1480,9 @@
             <w:r>
               <w:rPr>
                 <w:rFonts w:ascii="Times New Roman" w:hAnsi="Times New Roman" w:eastAsia="宋体"/>
-                <w:sz w:val="15"/>
+                <w:sz w:val="14"/>
               </w:rPr>
-              <w:t>43.95%</w:t>
+              <w:t>离线检索存储。它保留 VectorStorage 的 public API，但默认不依赖 ChromaDB 或 sentence-transformers，而是把文档转换成 sparse-token 计数，按 token 重合分数排序。这样脚本和测试无需下载模型也可以运行。</w:t>
             </w:r>
           </w:p>
         </w:tc>
@@ -1934,7 +1490,7 @@
       <w:tr>
         <w:tc>
           <w:tcPr>
-            <w:tcW w:type="dxa" w:w="1728"/>
+            <w:tcW w:type="dxa" w:w="2664"/>
             <w:vAlign w:val="center"/>
             <w:tcMar>
               <w:top w:w="80" w:type="dxa"/>
@@ -1950,15 +1506,15 @@
             <w:r>
               <w:rPr>
                 <w:rFonts w:ascii="Times New Roman" w:hAnsi="Times New Roman" w:eastAsia="宋体"/>
-                <w:sz w:val="15"/>
+                <w:sz w:val="14"/>
               </w:rPr>
-              <w:t>Semantic-Aware</w:t>
+              <w:t>src/agents/sql_agent.py</w:t>
             </w:r>
           </w:p>
         </w:tc>
         <w:tc>
           <w:tcPr>
-            <w:tcW w:type="dxa" w:w="1008"/>
+            <w:tcW w:type="dxa" w:w="6696"/>
             <w:vAlign w:val="center"/>
             <w:tcMar>
               <w:top w:w="80" w:type="dxa"/>
@@ -1974,15 +1530,17 @@
             <w:r>
               <w:rPr>
                 <w:rFonts w:ascii="Times New Roman" w:hAnsi="Times New Roman" w:eastAsia="宋体"/>
-                <w:sz w:val="15"/>
+                <w:sz w:val="14"/>
               </w:rPr>
-              <w:t>123</w:t>
+              <w:t>SQL 聚合 Agent。它读取 SQLite 中的首个表和列名，基于问题中的总和、平均、计数、最大、最小等关键词拼接受控 SQL 聚合语句。它是可解释 SQL 查询路径的简单原型，适合规则表，但不直接处理复杂半结构化布局。</w:t>
             </w:r>
           </w:p>
         </w:tc>
+      </w:tr>
+      <w:tr>
         <w:tc>
           <w:tcPr>
-            <w:tcW w:type="dxa" w:w="1296"/>
+            <w:tcW w:type="dxa" w:w="2664"/>
             <w:vAlign w:val="center"/>
             <w:tcMar>
               <w:top w:w="80" w:type="dxa"/>
@@ -1998,9 +1556,733 @@
             <w:r>
               <w:rPr>
                 <w:rFonts w:ascii="Times New Roman" w:hAnsi="Times New Roman" w:eastAsia="宋体"/>
-                <w:sz w:val="15"/>
+                <w:sz w:val="14"/>
               </w:rPr>
-              <w:t>47.15%</w:t>
+              <w:t>src/agents/kv_agent.py</w:t>
+            </w:r>
+          </w:p>
+        </w:tc>
+        <w:tc>
+          <w:tcPr>
+            <w:tcW w:type="dxa" w:w="6696"/>
+            <w:vAlign w:val="center"/>
+            <w:tcMar>
+              <w:top w:w="80" w:type="dxa"/>
+              <w:start w:w="80" w:type="dxa"/>
+              <w:bottom w:w="80" w:type="dxa"/>
+              <w:end w:w="80" w:type="dxa"/>
+            </w:tcMar>
+          </w:tcPr>
+          <w:p>
+            <w:pPr>
+              <w:spacing w:after="0" w:line="240" w:lineRule="auto"/>
+            </w:pPr>
+            <w:r>
+              <w:rPr>
+                <w:rFonts w:ascii="Times New Roman" w:hAnsi="Times New Roman" w:eastAsia="宋体"/>
+                <w:sz w:val="14"/>
+              </w:rPr>
+              <w:t>KV 查询 Agent。它先尝试问题是否直接包含某个 key；若没有，再用 weighted_overlap 在 key 和 value 文本中找最相关项。适合“数据来源是什么”“单位是什么”等元数据问题。</w:t>
+            </w:r>
+          </w:p>
+        </w:tc>
+      </w:tr>
+      <w:tr>
+        <w:tc>
+          <w:tcPr>
+            <w:tcW w:type="dxa" w:w="2664"/>
+            <w:vAlign w:val="center"/>
+            <w:tcMar>
+              <w:top w:w="80" w:type="dxa"/>
+              <w:start w:w="80" w:type="dxa"/>
+              <w:bottom w:w="80" w:type="dxa"/>
+              <w:end w:w="80" w:type="dxa"/>
+            </w:tcMar>
+          </w:tcPr>
+          <w:p>
+            <w:pPr>
+              <w:spacing w:after="0" w:line="240" w:lineRule="auto"/>
+            </w:pPr>
+            <w:r>
+              <w:rPr>
+                <w:rFonts w:ascii="Times New Roman" w:hAnsi="Times New Roman" w:eastAsia="宋体"/>
+                <w:sz w:val="14"/>
+              </w:rPr>
+              <w:t>src/agents/vector_agent.py</w:t>
+            </w:r>
+          </w:p>
+        </w:tc>
+        <w:tc>
+          <w:tcPr>
+            <w:tcW w:type="dxa" w:w="6696"/>
+            <w:vAlign w:val="center"/>
+            <w:tcMar>
+              <w:top w:w="80" w:type="dxa"/>
+              <w:start w:w="80" w:type="dxa"/>
+              <w:bottom w:w="80" w:type="dxa"/>
+              <w:end w:w="80" w:type="dxa"/>
+            </w:tcMar>
+          </w:tcPr>
+          <w:p>
+            <w:pPr>
+              <w:spacing w:after="0" w:line="240" w:lineRule="auto"/>
+            </w:pPr>
+            <w:r>
+              <w:rPr>
+                <w:rFonts w:ascii="Times New Roman" w:hAnsi="Times New Roman" w:eastAsia="宋体"/>
+                <w:sz w:val="14"/>
+              </w:rPr>
+              <w:t>检索增强 Agent。它调用 VectorStorage 搜索相关文档片段，若配置了 LLMAgent 则把片段作为上下文交给 LLM；否则直接返回检索到的片段。该模块体现了向量/语义检索扩展路线，但默认可离线运行。</w:t>
+            </w:r>
+          </w:p>
+        </w:tc>
+      </w:tr>
+      <w:tr>
+        <w:tc>
+          <w:tcPr>
+            <w:tcW w:type="dxa" w:w="2664"/>
+            <w:vAlign w:val="center"/>
+            <w:tcMar>
+              <w:top w:w="80" w:type="dxa"/>
+              <w:start w:w="80" w:type="dxa"/>
+              <w:bottom w:w="80" w:type="dxa"/>
+              <w:end w:w="80" w:type="dxa"/>
+            </w:tcMar>
+          </w:tcPr>
+          <w:p>
+            <w:pPr>
+              <w:spacing w:after="0" w:line="240" w:lineRule="auto"/>
+            </w:pPr>
+            <w:r>
+              <w:rPr>
+                <w:rFonts w:ascii="Times New Roman" w:hAnsi="Times New Roman" w:eastAsia="宋体"/>
+                <w:sz w:val="14"/>
+              </w:rPr>
+              <w:t>src/agents/llm_agent.py</w:t>
+            </w:r>
+          </w:p>
+        </w:tc>
+        <w:tc>
+          <w:tcPr>
+            <w:tcW w:type="dxa" w:w="6696"/>
+            <w:vAlign w:val="center"/>
+            <w:tcMar>
+              <w:top w:w="80" w:type="dxa"/>
+              <w:start w:w="80" w:type="dxa"/>
+              <w:bottom w:w="80" w:type="dxa"/>
+              <w:end w:w="80" w:type="dxa"/>
+            </w:tcMar>
+          </w:tcPr>
+          <w:p>
+            <w:pPr>
+              <w:spacing w:after="0" w:line="240" w:lineRule="auto"/>
+            </w:pPr>
+            <w:r>
+              <w:rPr>
+                <w:rFonts w:ascii="Times New Roman" w:hAnsi="Times New Roman" w:eastAsia="宋体"/>
+                <w:sz w:val="14"/>
+              </w:rPr>
+              <w:t>可选 LLM 封装器。它读取 DEEPSEEK_API_KEY 等环境变量；未配置 API key 时返回离线兜底说明，而不是让系统报错。这样报告中可以说明 LLM 是可选增强，而不是系统运行前提。</w:t>
+            </w:r>
+          </w:p>
+        </w:tc>
+      </w:tr>
+      <w:tr>
+        <w:tc>
+          <w:tcPr>
+            <w:tcW w:type="dxa" w:w="2664"/>
+            <w:vAlign w:val="center"/>
+            <w:tcMar>
+              <w:top w:w="80" w:type="dxa"/>
+              <w:start w:w="80" w:type="dxa"/>
+              <w:bottom w:w="80" w:type="dxa"/>
+              <w:end w:w="80" w:type="dxa"/>
+            </w:tcMar>
+          </w:tcPr>
+          <w:p>
+            <w:pPr>
+              <w:spacing w:after="0" w:line="240" w:lineRule="auto"/>
+            </w:pPr>
+            <w:r>
+              <w:rPr>
+                <w:rFonts w:ascii="Times New Roman" w:hAnsi="Times New Roman" w:eastAsia="宋体"/>
+                <w:sz w:val="14"/>
+              </w:rPr>
+              <w:t>src/evaluator/answer_matcher.py</w:t>
+            </w:r>
+          </w:p>
+        </w:tc>
+        <w:tc>
+          <w:tcPr>
+            <w:tcW w:type="dxa" w:w="6696"/>
+            <w:vAlign w:val="center"/>
+            <w:tcMar>
+              <w:top w:w="80" w:type="dxa"/>
+              <w:start w:w="80" w:type="dxa"/>
+              <w:bottom w:w="80" w:type="dxa"/>
+              <w:end w:w="80" w:type="dxa"/>
+            </w:tcMar>
+          </w:tcPr>
+          <w:p>
+            <w:pPr>
+              <w:spacing w:after="0" w:line="240" w:lineRule="auto"/>
+            </w:pPr>
+            <w:r>
+              <w:rPr>
+                <w:rFonts w:ascii="Times New Roman" w:hAnsi="Times New Roman" w:eastAsia="宋体"/>
+                <w:sz w:val="14"/>
+              </w:rPr>
+              <w:t>答案匹配器。它先做文本规范化和精确匹配，再做数值容差、百分比换算、列表集合匹配和 LCS/ROUGE-L 风格相似度判断。这样可以兼容“50000”和“50000人”、列表顺序差异、长文本包含答案等情况。</w:t>
+            </w:r>
+          </w:p>
+        </w:tc>
+      </w:tr>
+      <w:tr>
+        <w:tc>
+          <w:tcPr>
+            <w:tcW w:type="dxa" w:w="2664"/>
+            <w:vAlign w:val="center"/>
+            <w:tcMar>
+              <w:top w:w="80" w:type="dxa"/>
+              <w:start w:w="80" w:type="dxa"/>
+              <w:bottom w:w="80" w:type="dxa"/>
+              <w:end w:w="80" w:type="dxa"/>
+            </w:tcMar>
+          </w:tcPr>
+          <w:p>
+            <w:pPr>
+              <w:spacing w:after="0" w:line="240" w:lineRule="auto"/>
+            </w:pPr>
+            <w:r>
+              <w:rPr>
+                <w:rFonts w:ascii="Times New Roman" w:hAnsi="Times New Roman" w:eastAsia="宋体"/>
+                <w:sz w:val="14"/>
+              </w:rPr>
+              <w:t>src/evaluator/statistics.py</w:t>
+            </w:r>
+          </w:p>
+        </w:tc>
+        <w:tc>
+          <w:tcPr>
+            <w:tcW w:type="dxa" w:w="6696"/>
+            <w:vAlign w:val="center"/>
+            <w:tcMar>
+              <w:top w:w="80" w:type="dxa"/>
+              <w:start w:w="80" w:type="dxa"/>
+              <w:bottom w:w="80" w:type="dxa"/>
+              <w:end w:w="80" w:type="dxa"/>
+            </w:tcMar>
+          </w:tcPr>
+          <w:p>
+            <w:pPr>
+              <w:spacing w:after="0" w:line="240" w:lineRule="auto"/>
+            </w:pPr>
+            <w:r>
+              <w:rPr>
+                <w:rFonts w:ascii="Times New Roman" w:hAnsi="Times New Roman" w:eastAsia="宋体"/>
+                <w:sz w:val="14"/>
+              </w:rPr>
+              <w:t>评测统计器。它保存每条问题的预测、标准答案、是否正确、类别和路由等信息，计算整体准确率和分类准确率，并可导出为 evaluation_report.json。</w:t>
+            </w:r>
+          </w:p>
+        </w:tc>
+      </w:tr>
+      <w:tr>
+        <w:tc>
+          <w:tcPr>
+            <w:tcW w:type="dxa" w:w="2664"/>
+            <w:vAlign w:val="center"/>
+            <w:tcMar>
+              <w:top w:w="80" w:type="dxa"/>
+              <w:start w:w="80" w:type="dxa"/>
+              <w:bottom w:w="80" w:type="dxa"/>
+              <w:end w:w="80" w:type="dxa"/>
+            </w:tcMar>
+          </w:tcPr>
+          <w:p>
+            <w:pPr>
+              <w:spacing w:after="0" w:line="240" w:lineRule="auto"/>
+            </w:pPr>
+            <w:r>
+              <w:rPr>
+                <w:rFonts w:ascii="Times New Roman" w:hAnsi="Times New Roman" w:eastAsia="宋体"/>
+                <w:sz w:val="14"/>
+              </w:rPr>
+              <w:t>scripts/build_report_docx.py</w:t>
+            </w:r>
+          </w:p>
+        </w:tc>
+        <w:tc>
+          <w:tcPr>
+            <w:tcW w:type="dxa" w:w="6696"/>
+            <w:vAlign w:val="center"/>
+            <w:tcMar>
+              <w:top w:w="80" w:type="dxa"/>
+              <w:start w:w="80" w:type="dxa"/>
+              <w:bottom w:w="80" w:type="dxa"/>
+              <w:end w:w="80" w:type="dxa"/>
+            </w:tcMar>
+          </w:tcPr>
+          <w:p>
+            <w:pPr>
+              <w:spacing w:after="0" w:line="240" w:lineRule="auto"/>
+            </w:pPr>
+            <w:r>
+              <w:rPr>
+                <w:rFonts w:ascii="Times New Roman" w:hAnsi="Times New Roman" w:eastAsia="宋体"/>
+                <w:sz w:val="14"/>
+              </w:rPr>
+              <w:t>报告生成脚本。它基于课程模板创建最终 DOCX，设置标题、摘要、正文分栏、表格样式和参考文献，并把当前项目指标、实现细节和文件说明写入报告。后续只要修改脚本文本并重新运行即可得到新版报告。</w:t>
+            </w:r>
+          </w:p>
+        </w:tc>
+      </w:tr>
+      <w:tr>
+        <w:tc>
+          <w:tcPr>
+            <w:tcW w:type="dxa" w:w="2664"/>
+            <w:vAlign w:val="center"/>
+            <w:tcMar>
+              <w:top w:w="80" w:type="dxa"/>
+              <w:start w:w="80" w:type="dxa"/>
+              <w:bottom w:w="80" w:type="dxa"/>
+              <w:end w:w="80" w:type="dxa"/>
+            </w:tcMar>
+          </w:tcPr>
+          <w:p>
+            <w:pPr>
+              <w:spacing w:after="0" w:line="240" w:lineRule="auto"/>
+            </w:pPr>
+            <w:r>
+              <w:rPr>
+                <w:rFonts w:ascii="Times New Roman" w:hAnsi="Times New Roman" w:eastAsia="宋体"/>
+                <w:sz w:val="14"/>
+              </w:rPr>
+              <w:t>scripts/vectorize_tables.py</w:t>
+            </w:r>
+          </w:p>
+        </w:tc>
+        <w:tc>
+          <w:tcPr>
+            <w:tcW w:type="dxa" w:w="6696"/>
+            <w:vAlign w:val="center"/>
+            <w:tcMar>
+              <w:top w:w="80" w:type="dxa"/>
+              <w:start w:w="80" w:type="dxa"/>
+              <w:bottom w:w="80" w:type="dxa"/>
+              <w:end w:w="80" w:type="dxa"/>
+            </w:tcMar>
+          </w:tcPr>
+          <w:p>
+            <w:pPr>
+              <w:spacing w:after="0" w:line="240" w:lineRule="auto"/>
+            </w:pPr>
+            <w:r>
+              <w:rPr>
+                <w:rFonts w:ascii="Times New Roman" w:hAnsi="Times New Roman" w:eastAsia="宋体"/>
+                <w:sz w:val="14"/>
+              </w:rPr>
+              <w:t>可选的批量检索准备脚本。它遍历 raw Excel 文件，把每行转换为文本片段并写入 VectorStorage。当前主流程不依赖它，但它展示了如何扩展到向量/语义检索路径。</w:t>
+            </w:r>
+          </w:p>
+        </w:tc>
+      </w:tr>
+      <w:tr>
+        <w:tc>
+          <w:tcPr>
+            <w:tcW w:type="dxa" w:w="2664"/>
+            <w:vAlign w:val="center"/>
+            <w:tcMar>
+              <w:top w:w="80" w:type="dxa"/>
+              <w:start w:w="80" w:type="dxa"/>
+              <w:bottom w:w="80" w:type="dxa"/>
+              <w:end w:w="80" w:type="dxa"/>
+            </w:tcMar>
+          </w:tcPr>
+          <w:p>
+            <w:pPr>
+              <w:spacing w:after="0" w:line="240" w:lineRule="auto"/>
+            </w:pPr>
+            <w:r>
+              <w:rPr>
+                <w:rFonts w:ascii="Times New Roman" w:hAnsi="Times New Roman" w:eastAsia="宋体"/>
+                <w:sz w:val="14"/>
+              </w:rPr>
+              <w:t>tests/test_core_behavior.py</w:t>
+            </w:r>
+          </w:p>
+        </w:tc>
+        <w:tc>
+          <w:tcPr>
+            <w:tcW w:type="dxa" w:w="6696"/>
+            <w:vAlign w:val="center"/>
+            <w:tcMar>
+              <w:top w:w="80" w:type="dxa"/>
+              <w:start w:w="80" w:type="dxa"/>
+              <w:bottom w:w="80" w:type="dxa"/>
+              <w:end w:w="80" w:type="dxa"/>
+            </w:tcMar>
+          </w:tcPr>
+          <w:p>
+            <w:pPr>
+              <w:spacing w:after="0" w:line="240" w:lineRule="auto"/>
+            </w:pPr>
+            <w:r>
+              <w:rPr>
+                <w:rFonts w:ascii="Times New Roman" w:hAnsi="Times New Roman" w:eastAsia="宋体"/>
+                <w:sz w:val="14"/>
+              </w:rPr>
+              <w:t>核心行为测试。它验证数值答案不能被子串误判、规则路由能识别计数问题、离线 VectorStorage 能按 token 找到相关文档，是防止关键回归的最小测试集。</w:t>
+            </w:r>
+          </w:p>
+        </w:tc>
+      </w:tr>
+      <w:tr>
+        <w:tc>
+          <w:tcPr>
+            <w:tcW w:type="dxa" w:w="2664"/>
+            <w:vAlign w:val="center"/>
+            <w:tcMar>
+              <w:top w:w="80" w:type="dxa"/>
+              <w:start w:w="80" w:type="dxa"/>
+              <w:bottom w:w="80" w:type="dxa"/>
+              <w:end w:w="80" w:type="dxa"/>
+            </w:tcMar>
+          </w:tcPr>
+          <w:p>
+            <w:pPr>
+              <w:spacing w:after="0" w:line="240" w:lineRule="auto"/>
+            </w:pPr>
+            <w:r>
+              <w:rPr>
+                <w:rFonts w:ascii="Times New Roman" w:hAnsi="Times New Roman" w:eastAsia="宋体"/>
+                <w:sz w:val="14"/>
+              </w:rPr>
+              <w:t>tests/test_parser.py</w:t>
+            </w:r>
+          </w:p>
+        </w:tc>
+        <w:tc>
+          <w:tcPr>
+            <w:tcW w:type="dxa" w:w="6696"/>
+            <w:vAlign w:val="center"/>
+            <w:tcMar>
+              <w:top w:w="80" w:type="dxa"/>
+              <w:start w:w="80" w:type="dxa"/>
+              <w:bottom w:w="80" w:type="dxa"/>
+              <w:end w:w="80" w:type="dxa"/>
+            </w:tcMar>
+          </w:tcPr>
+          <w:p>
+            <w:pPr>
+              <w:spacing w:after="0" w:line="240" w:lineRule="auto"/>
+            </w:pPr>
+            <w:r>
+              <w:rPr>
+                <w:rFonts w:ascii="Times New Roman" w:hAnsi="Times New Roman" w:eastAsia="宋体"/>
+                <w:sz w:val="14"/>
+              </w:rPr>
+              <w:t>解析调试脚本。它读取示例 Excel，打印解析后的 DataFrame、表格形状、多级表头和展平列名，主要用于观察 ExcelParser 与 StructureAnalyzer 的效果。</w:t>
+            </w:r>
+          </w:p>
+        </w:tc>
+      </w:tr>
+      <w:tr>
+        <w:tc>
+          <w:tcPr>
+            <w:tcW w:type="dxa" w:w="2664"/>
+            <w:vAlign w:val="center"/>
+            <w:tcMar>
+              <w:top w:w="80" w:type="dxa"/>
+              <w:start w:w="80" w:type="dxa"/>
+              <w:bottom w:w="80" w:type="dxa"/>
+              <w:end w:w="80" w:type="dxa"/>
+            </w:tcMar>
+          </w:tcPr>
+          <w:p>
+            <w:pPr>
+              <w:spacing w:after="0" w:line="240" w:lineRule="auto"/>
+            </w:pPr>
+            <w:r>
+              <w:rPr>
+                <w:rFonts w:ascii="Times New Roman" w:hAnsi="Times New Roman" w:eastAsia="宋体"/>
+                <w:sz w:val="14"/>
+              </w:rPr>
+              <w:t>tests/test_router.py</w:t>
+            </w:r>
+          </w:p>
+        </w:tc>
+        <w:tc>
+          <w:tcPr>
+            <w:tcW w:type="dxa" w:w="6696"/>
+            <w:vAlign w:val="center"/>
+            <w:tcMar>
+              <w:top w:w="80" w:type="dxa"/>
+              <w:start w:w="80" w:type="dxa"/>
+              <w:bottom w:w="80" w:type="dxa"/>
+              <w:end w:w="80" w:type="dxa"/>
+            </w:tcMar>
+          </w:tcPr>
+          <w:p>
+            <w:pPr>
+              <w:spacing w:after="0" w:line="240" w:lineRule="auto"/>
+            </w:pPr>
+            <w:r>
+              <w:rPr>
+                <w:rFonts w:ascii="Times New Roman" w:hAnsi="Times New Roman" w:eastAsia="宋体"/>
+                <w:sz w:val="14"/>
+              </w:rPr>
+              <w:t>路由调试脚本。它用若干自然语言问题打印 RuleBasedRouter 的分类和目标 Agent，方便检查关键词路由是否符合预期。</w:t>
+            </w:r>
+          </w:p>
+        </w:tc>
+      </w:tr>
+      <w:tr>
+        <w:tc>
+          <w:tcPr>
+            <w:tcW w:type="dxa" w:w="2664"/>
+            <w:vAlign w:val="center"/>
+            <w:tcMar>
+              <w:top w:w="80" w:type="dxa"/>
+              <w:start w:w="80" w:type="dxa"/>
+              <w:bottom w:w="80" w:type="dxa"/>
+              <w:end w:w="80" w:type="dxa"/>
+            </w:tcMar>
+          </w:tcPr>
+          <w:p>
+            <w:pPr>
+              <w:spacing w:after="0" w:line="240" w:lineRule="auto"/>
+            </w:pPr>
+            <w:r>
+              <w:rPr>
+                <w:rFonts w:ascii="Times New Roman" w:hAnsi="Times New Roman" w:eastAsia="宋体"/>
+                <w:sz w:val="14"/>
+              </w:rPr>
+              <w:t>tests/test_storage.py</w:t>
+            </w:r>
+          </w:p>
+        </w:tc>
+        <w:tc>
+          <w:tcPr>
+            <w:tcW w:type="dxa" w:w="6696"/>
+            <w:vAlign w:val="center"/>
+            <w:tcMar>
+              <w:top w:w="80" w:type="dxa"/>
+              <w:start w:w="80" w:type="dxa"/>
+              <w:bottom w:w="80" w:type="dxa"/>
+              <w:end w:w="80" w:type="dxa"/>
+            </w:tcMar>
+          </w:tcPr>
+          <w:p>
+            <w:pPr>
+              <w:spacing w:after="0" w:line="240" w:lineRule="auto"/>
+            </w:pPr>
+            <w:r>
+              <w:rPr>
+                <w:rFonts w:ascii="Times New Roman" w:hAnsi="Times New Roman" w:eastAsia="宋体"/>
+                <w:sz w:val="14"/>
+              </w:rPr>
+              <w:t>存储调试脚本。它分别演示 SQLStorage、KVStorage 和 VectorStorage 的基本读写与查询，用于快速确认三类存储接口是否可用。</w:t>
+            </w:r>
+          </w:p>
+        </w:tc>
+      </w:tr>
+      <w:tr>
+        <w:tc>
+          <w:tcPr>
+            <w:tcW w:type="dxa" w:w="2664"/>
+            <w:vAlign w:val="center"/>
+            <w:tcMar>
+              <w:top w:w="80" w:type="dxa"/>
+              <w:start w:w="80" w:type="dxa"/>
+              <w:bottom w:w="80" w:type="dxa"/>
+              <w:end w:w="80" w:type="dxa"/>
+            </w:tcMar>
+          </w:tcPr>
+          <w:p>
+            <w:pPr>
+              <w:spacing w:after="0" w:line="240" w:lineRule="auto"/>
+            </w:pPr>
+            <w:r>
+              <w:rPr>
+                <w:rFonts w:ascii="Times New Roman" w:hAnsi="Times New Roman" w:eastAsia="宋体"/>
+                <w:sz w:val="14"/>
+              </w:rPr>
+              <w:t>tests/test_classifier.py</w:t>
+            </w:r>
+          </w:p>
+        </w:tc>
+        <w:tc>
+          <w:tcPr>
+            <w:tcW w:type="dxa" w:w="6696"/>
+            <w:vAlign w:val="center"/>
+            <w:tcMar>
+              <w:top w:w="80" w:type="dxa"/>
+              <w:start w:w="80" w:type="dxa"/>
+              <w:bottom w:w="80" w:type="dxa"/>
+              <w:end w:w="80" w:type="dxa"/>
+            </w:tcMar>
+          </w:tcPr>
+          <w:p>
+            <w:pPr>
+              <w:spacing w:after="0" w:line="240" w:lineRule="auto"/>
+            </w:pPr>
+            <w:r>
+              <w:rPr>
+                <w:rFonts w:ascii="Times New Roman" w:hAnsi="Times New Roman" w:eastAsia="宋体"/>
+                <w:sz w:val="14"/>
+              </w:rPr>
+              <w:t>分类器调试脚本。它初始化 QueryClassifier，对聚合、元数据、列表和复杂分析问题进行分类，用于检查 LLM 未启用时的规则回退表现。</w:t>
+            </w:r>
+          </w:p>
+        </w:tc>
+      </w:tr>
+      <w:tr>
+        <w:tc>
+          <w:tcPr>
+            <w:tcW w:type="dxa" w:w="2664"/>
+            <w:vAlign w:val="center"/>
+            <w:tcMar>
+              <w:top w:w="80" w:type="dxa"/>
+              <w:start w:w="80" w:type="dxa"/>
+              <w:bottom w:w="80" w:type="dxa"/>
+              <w:end w:w="80" w:type="dxa"/>
+            </w:tcMar>
+          </w:tcPr>
+          <w:p>
+            <w:pPr>
+              <w:spacing w:after="0" w:line="240" w:lineRule="auto"/>
+            </w:pPr>
+            <w:r>
+              <w:rPr>
+                <w:rFonts w:ascii="Times New Roman" w:hAnsi="Times New Roman" w:eastAsia="宋体"/>
+                <w:sz w:val="14"/>
+              </w:rPr>
+              <w:t>tests/prepare_kv_data.py</w:t>
+            </w:r>
+          </w:p>
+        </w:tc>
+        <w:tc>
+          <w:tcPr>
+            <w:tcW w:type="dxa" w:w="6696"/>
+            <w:vAlign w:val="center"/>
+            <w:tcMar>
+              <w:top w:w="80" w:type="dxa"/>
+              <w:start w:w="80" w:type="dxa"/>
+              <w:bottom w:w="80" w:type="dxa"/>
+              <w:end w:w="80" w:type="dxa"/>
+            </w:tcMar>
+          </w:tcPr>
+          <w:p>
+            <w:pPr>
+              <w:spacing w:after="0" w:line="240" w:lineRule="auto"/>
+            </w:pPr>
+            <w:r>
+              <w:rPr>
+                <w:rFonts w:ascii="Times New Roman" w:hAnsi="Times New Roman" w:eastAsia="宋体"/>
+                <w:sz w:val="14"/>
+              </w:rPr>
+              <w:t>KV 示例数据准备脚本。它向 metadata.json 写入数据来源、表格说明、单位和创建时间等示例元数据，便于测试 KV 查询路径。</w:t>
+            </w:r>
+          </w:p>
+        </w:tc>
+      </w:tr>
+      <w:tr>
+        <w:tc>
+          <w:tcPr>
+            <w:tcW w:type="dxa" w:w="2664"/>
+            <w:vAlign w:val="center"/>
+            <w:tcMar>
+              <w:top w:w="80" w:type="dxa"/>
+              <w:start w:w="80" w:type="dxa"/>
+              <w:bottom w:w="80" w:type="dxa"/>
+              <w:end w:w="80" w:type="dxa"/>
+            </w:tcMar>
+          </w:tcPr>
+          <w:p>
+            <w:pPr>
+              <w:spacing w:after="0" w:line="240" w:lineRule="auto"/>
+            </w:pPr>
+            <w:r>
+              <w:rPr>
+                <w:rFonts w:ascii="Times New Roman" w:hAnsi="Times New Roman" w:eastAsia="宋体"/>
+                <w:sz w:val="14"/>
+              </w:rPr>
+              <w:t>tests/prepare_vector_data.py</w:t>
+            </w:r>
+          </w:p>
+        </w:tc>
+        <w:tc>
+          <w:tcPr>
+            <w:tcW w:type="dxa" w:w="6696"/>
+            <w:vAlign w:val="center"/>
+            <w:tcMar>
+              <w:top w:w="80" w:type="dxa"/>
+              <w:start w:w="80" w:type="dxa"/>
+              <w:bottom w:w="80" w:type="dxa"/>
+              <w:end w:w="80" w:type="dxa"/>
+            </w:tcMar>
+          </w:tcPr>
+          <w:p>
+            <w:pPr>
+              <w:spacing w:after="0" w:line="240" w:lineRule="auto"/>
+            </w:pPr>
+            <w:r>
+              <w:rPr>
+                <w:rFonts w:ascii="Times New Roman" w:hAnsi="Times New Roman" w:eastAsia="宋体"/>
+                <w:sz w:val="14"/>
+              </w:rPr>
+              <w:t>检索示例数据准备脚本。它把示例 Excel 的每一行转换为文档片段并写入 VectorStorage，用于演示离线 sparse-token 检索流程。</w:t>
+            </w:r>
+          </w:p>
+        </w:tc>
+      </w:tr>
+      <w:tr>
+        <w:tc>
+          <w:tcPr>
+            <w:tcW w:type="dxa" w:w="2664"/>
+            <w:vAlign w:val="center"/>
+            <w:tcMar>
+              <w:top w:w="80" w:type="dxa"/>
+              <w:start w:w="80" w:type="dxa"/>
+              <w:bottom w:w="80" w:type="dxa"/>
+              <w:end w:w="80" w:type="dxa"/>
+            </w:tcMar>
+          </w:tcPr>
+          <w:p>
+            <w:pPr>
+              <w:spacing w:after="0" w:line="240" w:lineRule="auto"/>
+            </w:pPr>
+            <w:r>
+              <w:rPr>
+                <w:rFonts w:ascii="Times New Roman" w:hAnsi="Times New Roman" w:eastAsia="宋体"/>
+                <w:sz w:val="14"/>
+              </w:rPr>
+              <w:t>各级 __init__.py</w:t>
+            </w:r>
+          </w:p>
+        </w:tc>
+        <w:tc>
+          <w:tcPr>
+            <w:tcW w:type="dxa" w:w="6696"/>
+            <w:vAlign w:val="center"/>
+            <w:tcMar>
+              <w:top w:w="80" w:type="dxa"/>
+              <w:start w:w="80" w:type="dxa"/>
+              <w:bottom w:w="80" w:type="dxa"/>
+              <w:end w:w="80" w:type="dxa"/>
+            </w:tcMar>
+          </w:tcPr>
+          <w:p>
+            <w:pPr>
+              <w:spacing w:after="0" w:line="240" w:lineRule="auto"/>
+            </w:pPr>
+            <w:r>
+              <w:rPr>
+                <w:rFonts w:ascii="Times New Roman" w:hAnsi="Times New Roman" w:eastAsia="宋体"/>
+                <w:sz w:val="14"/>
+              </w:rPr>
+              <w:t>包初始化文件。它们主要用于让 src、parser、storage、router、agents、evaluator 等目录被 Python 识别为包，方便模块间通过 import 引用。</w:t>
             </w:r>
           </w:p>
         </w:tc>
@@ -2009,117 +2291,6 @@
     <w:p/>
     <w:p>
       <w:pPr>
-        <w:spacing w:line="259" w:lineRule="auto" w:after="60"/>
-        <w:ind w:firstLine="360"/>
-      </w:pPr>
-      <w:r>
-        <w:rPr>
-          <w:rFonts w:ascii="Times New Roman" w:hAnsi="Times New Roman" w:eastAsia="宋体"/>
-        </w:rPr>
-        <w:t>从路由统计看，764 条问题中有 547 条由 relational 路径处理，184 条由 lookup 路径处理，count、list、extreme 和 sum 路径承担较小但关键的补充作用。结果说明，半结构化表格问答不能只依靠文本相似度；一旦能够恢复局部表结构，数值计算和多条件筛选的上限会明显提高。</w:t>
-      </w:r>
-    </w:p>
-    <w:p>
-      <w:pPr>
-        <w:pStyle w:val="1"/>
-        <w:spacing w:before="140" w:after="60"/>
-      </w:pPr>
-      <w:r>
-        <w:rPr>
-          <w:rFonts w:ascii="Times New Roman" w:hAnsi="Times New Roman" w:eastAsia="黑体"/>
-          <w:b/>
-        </w:rPr>
-        <w:t>9 创新性分析</w:t>
-      </w:r>
-    </w:p>
-    <w:p>
-      <w:pPr>
-        <w:spacing w:line="259" w:lineRule="auto" w:after="60"/>
-        <w:ind w:firstLine="360"/>
-      </w:pPr>
-      <w:r>
-        <w:rPr>
-          <w:rFonts w:ascii="Times New Roman" w:hAnsi="Times New Roman" w:eastAsia="宋体"/>
-        </w:rPr>
-        <w:t>本项目的创新性不在于调用更大的模型，而在于把课程数据库思想和半结构化表格特点结合起来。第一，系统以证据单元格和局部关系视图共同表示表格，兼顾 SQL 式精确计算与布局语义保留。第二，查询路由不是 SQL、KV、向量或 LLM 的单选题，而是按问题语义组合不同执行器。第三，系统引入置信度门控，只有当关系执行结果足够可信时才覆盖回退检索，从而减少规则误伤。第四，默认离线可复现，适合课程验收，也为后续接入 LLM 验证器留下空间。</w:t>
-      </w:r>
-    </w:p>
-    <w:p>
-      <w:pPr>
-        <w:spacing w:line="259" w:lineRule="auto" w:after="60"/>
-        <w:ind w:firstLine="360"/>
-      </w:pPr>
-      <w:r>
-        <w:rPr>
-          <w:rFonts w:ascii="Times New Roman" w:hAnsi="Times New Roman" w:eastAsia="宋体"/>
-        </w:rPr>
-        <w:t>与 ST-Raptor 相比，本项目没有构建完整 HO-Tree 和 LLM 操作流水线，而是实现了一个轻量近似：用表头、章节、左右上下文和关系视图表达隐式结构，用规则执行器模拟 lookup、filter、aggregate、compare 等基本操作，再用答案匹配器做结果验证。这一设计牺牲了一部分泛化能力，但换来了实现完整度、可解释性和运行稳定性。</w:t>
-      </w:r>
-    </w:p>
-    <w:p>
-      <w:pPr>
-        <w:pStyle w:val="1"/>
-        <w:spacing w:before="140" w:after="60"/>
-      </w:pPr>
-      <w:r>
-        <w:rPr>
-          <w:rFonts w:ascii="Times New Roman" w:hAnsi="Times New Roman" w:eastAsia="黑体"/>
-          <w:b/>
-        </w:rPr>
-        <w:t>10 错误分析与改进方向</w:t>
-      </w:r>
-    </w:p>
-    <w:p>
-      <w:pPr>
-        <w:spacing w:line="259" w:lineRule="auto" w:after="60"/>
-        <w:ind w:firstLine="360"/>
-      </w:pPr>
-      <w:r>
-        <w:rPr>
-          <w:rFonts w:ascii="Times New Roman" w:hAnsi="Times New Roman" w:eastAsia="宋体"/>
-        </w:rPr>
-        <w:t>当前错误主要来自三类样本。第一类是复杂财务表，问题需要跨多个小计区、左右分栏或资产/负债双侧区域进行定位，局部关系视图仍可能选错列。第二类是语义归纳题，例如“总结主要变化”“如何影响整体指数”，需要先抽取多条证据再组织自然语言答案。第三类是数据本身或文件索引存在疑似不一致的样本，系统即使检索正确文件也可能找不到问题所需信息。</w:t>
-      </w:r>
-    </w:p>
-    <w:p>
-      <w:pPr>
-        <w:spacing w:line="259" w:lineRule="auto" w:after="60"/>
-        <w:ind w:firstLine="360"/>
-      </w:pPr>
-      <w:r>
-        <w:rPr>
-          <w:rFonts w:ascii="Times New Roman" w:hAnsi="Times New Roman" w:eastAsia="宋体"/>
-        </w:rPr>
-        <w:t>后续可以沿三条路线继续优化：其一，引入 HO-Tree 或类似树结构，更系统地表达合并单元格和多级表头；其二，增加受限 pandas/SQL 代码生成器，让数值计算题先生成可验证表达式再执行；其三，引入轻量 LLM 验证器，只让模型阅读候选证据而不是整张表，负责目标列选择、条件消歧和摘要生成，以控制成本并减少幻觉。</w:t>
-      </w:r>
-    </w:p>
-    <w:p>
-      <w:pPr>
-        <w:pStyle w:val="1"/>
-        <w:spacing w:before="140" w:after="60"/>
-      </w:pPr>
-      <w:r>
-        <w:rPr>
-          <w:rFonts w:ascii="Times New Roman" w:hAnsi="Times New Roman" w:eastAsia="黑体"/>
-          <w:b/>
-        </w:rPr>
-        <w:t>11 结论</w:t>
-      </w:r>
-    </w:p>
-    <w:p>
-      <w:pPr>
-        <w:spacing w:line="259" w:lineRule="auto" w:after="60"/>
-        <w:ind w:firstLine="360"/>
-      </w:pPr>
-      <w:r>
-        <w:rPr>
-          <w:rFonts w:ascii="Times New Roman" w:hAnsi="Times New Roman" w:eastAsia="宋体"/>
-        </w:rPr>
-        <w:t>本文完成了一个面向 SSTQA-zh 的表格数据智能查询系统，实现了从 Excel 结构解析、混合存储、自然语言查询、路由执行到准确率评测的完整闭环。系统当前在 764 条测试样本上达到 55.50% 的准确率，说明结构分析、存储选择和查询路由是解决半结构化表格问答的有效路径。虽然距离 ST-Raptor 这类完整 LLM 框架仍有差距，但该系统已经具备课程项目所需的完整性、可解释性和可继续研究的扩展空间。</w:t>
-      </w:r>
-    </w:p>
-    <w:p>
-      <w:pPr>
         <w:pStyle w:val="1"/>
         <w:spacing w:before="140" w:after="60"/>
       </w:pPr>
@@ -2190,7 +2361,7 @@
       <w:type w:val="continuous"/>
       <w:pgSz w:w="11905" w:h="16837" w:code="9"/>
       <w:pgMar w:top="1181" w:right="1181" w:bottom="1181" w:left="1181" w:header="964" w:footer="964" w:gutter="0"/>
-      <w:cols w:num="2" w:space="720"/>
+      <w:cols w:num="1" w:space="720"/>
       <w:docGrid w:type="lines" w:linePitch="312"/>
     </w:sectPr>
   </w:body>

</xml_diff>

<commit_message>
Use two-column appendix and verified references
</commit_message>
<xml_diff>
--- a/data/processed/ST_QueryEngine_Report_final.docx
+++ b/data/processed/ST_QueryEngine_Report_final.docx
@@ -820,1475 +820,546 @@
         <w:t>为了便于复现和维护，本节按文件说明项目中主要 Python 文件的职责、输入输出和实现思路。源码总体遵循“入口调度、结构解析、证据索引、混合执行、结果评测”的分层方式：上层文件负责任务流程，下层文件负责存储、检索、分类和答案匹配，测试与脚本文件用于验证和生成报告。</w:t>
       </w:r>
     </w:p>
-    <w:tbl>
-      <w:tblPr>
-        <w:tblStyle w:val="af4"/>
-        <w:tblW w:type="auto" w:w="0"/>
-        <w:jc w:val="center"/>
-        <w:tblLook w:firstColumn="1" w:firstRow="1" w:lastColumn="0" w:lastRow="0" w:noHBand="0" w:noVBand="1" w:val="04A0"/>
-      </w:tblPr>
-      <w:tblGrid>
-        <w:gridCol w:w="4771"/>
-        <w:gridCol w:w="4771"/>
-      </w:tblGrid>
-      <w:tr>
-        <w:tc>
-          <w:tcPr>
-            <w:tcW w:type="dxa" w:w="2664"/>
-            <w:vAlign w:val="center"/>
-            <w:shd w:fill="D9EAF7"/>
-            <w:tcMar>
-              <w:top w:w="80" w:type="dxa"/>
-              <w:start w:w="80" w:type="dxa"/>
-              <w:bottom w:w="80" w:type="dxa"/>
-              <w:end w:w="80" w:type="dxa"/>
-            </w:tcMar>
-          </w:tcPr>
-          <w:p>
-            <w:pPr>
-              <w:spacing w:after="0"/>
-              <w:jc w:val="center"/>
-            </w:pPr>
-            <w:r>
-              <w:rPr>
-                <w:rFonts w:ascii="Times New Roman" w:hAnsi="Times New Roman" w:eastAsia="黑体"/>
-                <w:b/>
-                <w:sz w:val="14"/>
-              </w:rPr>
-              <w:t>文件</w:t>
-            </w:r>
-          </w:p>
-        </w:tc>
-        <w:tc>
-          <w:tcPr>
-            <w:tcW w:type="dxa" w:w="6696"/>
-            <w:vAlign w:val="center"/>
-            <w:shd w:fill="D9EAF7"/>
-            <w:tcMar>
-              <w:top w:w="80" w:type="dxa"/>
-              <w:start w:w="80" w:type="dxa"/>
-              <w:bottom w:w="80" w:type="dxa"/>
-              <w:end w:w="80" w:type="dxa"/>
-            </w:tcMar>
-          </w:tcPr>
-          <w:p>
-            <w:pPr>
-              <w:spacing w:after="0"/>
-              <w:jc w:val="center"/>
-            </w:pPr>
-            <w:r>
-              <w:rPr>
-                <w:rFonts w:ascii="Times New Roman" w:hAnsi="Times New Roman" w:eastAsia="黑体"/>
-                <w:b/>
-                <w:sz w:val="14"/>
-              </w:rPr>
-              <w:t>功能与实现思路</w:t>
-            </w:r>
-          </w:p>
-        </w:tc>
-      </w:tr>
-      <w:tr>
-        <w:tc>
-          <w:tcPr>
-            <w:tcW w:type="dxa" w:w="2664"/>
-            <w:vAlign w:val="center"/>
-            <w:tcMar>
-              <w:top w:w="80" w:type="dxa"/>
-              <w:start w:w="80" w:type="dxa"/>
-              <w:bottom w:w="80" w:type="dxa"/>
-              <w:end w:w="80" w:type="dxa"/>
-            </w:tcMar>
-          </w:tcPr>
-          <w:p>
-            <w:pPr>
-              <w:spacing w:after="0" w:line="240" w:lineRule="auto"/>
-            </w:pPr>
-            <w:r>
-              <w:rPr>
-                <w:rFonts w:ascii="Times New Roman" w:hAnsi="Times New Roman" w:eastAsia="宋体"/>
-                <w:sz w:val="14"/>
-              </w:rPr>
-              <w:t>src/main.py</w:t>
-            </w:r>
-          </w:p>
-        </w:tc>
-        <w:tc>
-          <w:tcPr>
-            <w:tcW w:type="dxa" w:w="6696"/>
-            <w:vAlign w:val="center"/>
-            <w:tcMar>
-              <w:top w:w="80" w:type="dxa"/>
-              <w:start w:w="80" w:type="dxa"/>
-              <w:bottom w:w="80" w:type="dxa"/>
-              <w:end w:w="80" w:type="dxa"/>
-            </w:tcMar>
-          </w:tcPr>
-          <w:p>
-            <w:pPr>
-              <w:spacing w:after="0" w:line="240" w:lineRule="auto"/>
-            </w:pPr>
-            <w:r>
-              <w:rPr>
-                <w:rFonts w:ascii="Times New Roman" w:hAnsi="Times New Roman" w:eastAsia="宋体"/>
-                <w:sz w:val="14"/>
-              </w:rPr>
-              <w:t>命令行入口和系统编排文件。它读取 config.yaml，初始化 TableQuerySystem，并根据参数决定执行单条问答、重建索引或全量评测。评测时逐行读取 test.jsonl，根据 table_id 调用 HybridQueryEngine，随后用 AnswerMatcher 判断预测答案是否正确，并把结果写入 evaluation_report.json。</w:t>
-            </w:r>
-          </w:p>
-        </w:tc>
-      </w:tr>
-      <w:tr>
-        <w:tc>
-          <w:tcPr>
-            <w:tcW w:type="dxa" w:w="2664"/>
-            <w:vAlign w:val="center"/>
-            <w:tcMar>
-              <w:top w:w="80" w:type="dxa"/>
-              <w:start w:w="80" w:type="dxa"/>
-              <w:bottom w:w="80" w:type="dxa"/>
-              <w:end w:w="80" w:type="dxa"/>
-            </w:tcMar>
-          </w:tcPr>
-          <w:p>
-            <w:pPr>
-              <w:spacing w:after="0" w:line="240" w:lineRule="auto"/>
-            </w:pPr>
-            <w:r>
-              <w:rPr>
-                <w:rFonts w:ascii="Times New Roman" w:hAnsi="Times New Roman" w:eastAsia="宋体"/>
-                <w:sz w:val="14"/>
-              </w:rPr>
-              <w:t>src/hybrid_engine.py</w:t>
-            </w:r>
-          </w:p>
-        </w:tc>
-        <w:tc>
-          <w:tcPr>
-            <w:tcW w:type="dxa" w:w="6696"/>
-            <w:vAlign w:val="center"/>
-            <w:tcMar>
-              <w:top w:w="80" w:type="dxa"/>
-              <w:start w:w="80" w:type="dxa"/>
-              <w:bottom w:w="80" w:type="dxa"/>
-              <w:end w:w="80" w:type="dxa"/>
-            </w:tcMar>
-          </w:tcPr>
-          <w:p>
-            <w:pPr>
-              <w:spacing w:after="0" w:line="240" w:lineRule="auto"/>
-            </w:pPr>
-            <w:r>
-              <w:rPr>
-                <w:rFonts w:ascii="Times New Roman" w:hAnsi="Times New Roman" w:eastAsia="宋体"/>
-                <w:sz w:val="14"/>
-              </w:rPr>
-              <w:t>系统主查询引擎。启动时加载 TableIndexer 生成的 CellRecord 与 RowRecord，并按 table_id 建立内存索引。回答问题时先尝试 RelationalAnswerEngine；若其置信度不足，再按 lookup、list、count、extreme、sum、avg 等路由使用规则执行器和单元格检索兜底。last_trace 用于 explain 模式展示答案来源。</w:t>
-            </w:r>
-          </w:p>
-        </w:tc>
-      </w:tr>
-      <w:tr>
-        <w:tc>
-          <w:tcPr>
-            <w:tcW w:type="dxa" w:w="2664"/>
-            <w:vAlign w:val="center"/>
-            <w:tcMar>
-              <w:top w:w="80" w:type="dxa"/>
-              <w:start w:w="80" w:type="dxa"/>
-              <w:bottom w:w="80" w:type="dxa"/>
-              <w:end w:w="80" w:type="dxa"/>
-            </w:tcMar>
-          </w:tcPr>
-          <w:p>
-            <w:pPr>
-              <w:spacing w:after="0" w:line="240" w:lineRule="auto"/>
-            </w:pPr>
-            <w:r>
-              <w:rPr>
-                <w:rFonts w:ascii="Times New Roman" w:hAnsi="Times New Roman" w:eastAsia="宋体"/>
-                <w:sz w:val="14"/>
-              </w:rPr>
-              <w:t>src/relational_engine.py</w:t>
-            </w:r>
-          </w:p>
-        </w:tc>
-        <w:tc>
-          <w:tcPr>
-            <w:tcW w:type="dxa" w:w="6696"/>
-            <w:vAlign w:val="center"/>
-            <w:tcMar>
-              <w:top w:w="80" w:type="dxa"/>
-              <w:start w:w="80" w:type="dxa"/>
-              <w:bottom w:w="80" w:type="dxa"/>
-              <w:end w:w="80" w:type="dxa"/>
-            </w:tcMar>
-          </w:tcPr>
-          <w:p>
-            <w:pPr>
-              <w:spacing w:after="0" w:line="240" w:lineRule="auto"/>
-            </w:pPr>
-            <w:r>
-              <w:rPr>
-                <w:rFonts w:ascii="Times New Roman" w:hAnsi="Times New Roman" w:eastAsia="宋体"/>
-                <w:sz w:val="14"/>
-              </w:rPr>
-              <w:t>当前准确率提升的核心文件。它把部分半结构化表恢复成 TableView，包括表头、记录行、首列和月份宽表列。随后按问题抽取实体、指标、月份、条件和聚合意图，执行筛选、计数、极值、求和、均值、差值和百分比计算。该模块带有置信度门控，避免低可信关系结果覆盖检索结果。</w:t>
-            </w:r>
-          </w:p>
-        </w:tc>
-      </w:tr>
-      <w:tr>
-        <w:tc>
-          <w:tcPr>
-            <w:tcW w:type="dxa" w:w="2664"/>
-            <w:vAlign w:val="center"/>
-            <w:tcMar>
-              <w:top w:w="80" w:type="dxa"/>
-              <w:start w:w="80" w:type="dxa"/>
-              <w:bottom w:w="80" w:type="dxa"/>
-              <w:end w:w="80" w:type="dxa"/>
-            </w:tcMar>
-          </w:tcPr>
-          <w:p>
-            <w:pPr>
-              <w:spacing w:after="0" w:line="240" w:lineRule="auto"/>
-            </w:pPr>
-            <w:r>
-              <w:rPr>
-                <w:rFonts w:ascii="Times New Roman" w:hAnsi="Times New Roman" w:eastAsia="宋体"/>
-                <w:sz w:val="14"/>
-              </w:rPr>
-              <w:t>src/table_indexer.py</w:t>
-            </w:r>
-          </w:p>
-        </w:tc>
-        <w:tc>
-          <w:tcPr>
-            <w:tcW w:type="dxa" w:w="6696"/>
-            <w:vAlign w:val="center"/>
-            <w:tcMar>
-              <w:top w:w="80" w:type="dxa"/>
-              <w:start w:w="80" w:type="dxa"/>
-              <w:bottom w:w="80" w:type="dxa"/>
-              <w:end w:w="80" w:type="dxa"/>
-            </w:tcMar>
-          </w:tcPr>
-          <w:p>
-            <w:pPr>
-              <w:spacing w:after="0" w:line="240" w:lineRule="auto"/>
-            </w:pPr>
-            <w:r>
-              <w:rPr>
-                <w:rFonts w:ascii="Times New Roman" w:hAnsi="Times New Roman" w:eastAsia="宋体"/>
-                <w:sz w:val="14"/>
-              </w:rPr>
-              <w:t>索引构建文件。它遍历 data/raw 下的 Excel 文件，填充合并单元格、提取标题和行列上下文，为每个非空单元格生成 CellRecord，为每行生成 RowRecord。索引同时写入 SQLite 和 JSON：SQLite 便于审计和结构化查询，JSON 便于快速加载和离线检索。</w:t>
-            </w:r>
-          </w:p>
-        </w:tc>
-      </w:tr>
-      <w:tr>
-        <w:tc>
-          <w:tcPr>
-            <w:tcW w:type="dxa" w:w="2664"/>
-            <w:vAlign w:val="center"/>
-            <w:tcMar>
-              <w:top w:w="80" w:type="dxa"/>
-              <w:start w:w="80" w:type="dxa"/>
-              <w:bottom w:w="80" w:type="dxa"/>
-              <w:end w:w="80" w:type="dxa"/>
-            </w:tcMar>
-          </w:tcPr>
-          <w:p>
-            <w:pPr>
-              <w:spacing w:after="0" w:line="240" w:lineRule="auto"/>
-            </w:pPr>
-            <w:r>
-              <w:rPr>
-                <w:rFonts w:ascii="Times New Roman" w:hAnsi="Times New Roman" w:eastAsia="宋体"/>
-                <w:sz w:val="14"/>
-              </w:rPr>
-              <w:t>src/text_utils.py</w:t>
-            </w:r>
-          </w:p>
-        </w:tc>
-        <w:tc>
-          <w:tcPr>
-            <w:tcW w:type="dxa" w:w="6696"/>
-            <w:vAlign w:val="center"/>
-            <w:tcMar>
-              <w:top w:w="80" w:type="dxa"/>
-              <w:start w:w="80" w:type="dxa"/>
-              <w:bottom w:w="80" w:type="dxa"/>
-              <w:end w:w="80" w:type="dxa"/>
-            </w:tcMar>
-          </w:tcPr>
-          <w:p>
-            <w:pPr>
-              <w:spacing w:after="0" w:line="240" w:lineRule="auto"/>
-            </w:pPr>
-            <w:r>
-              <w:rPr>
-                <w:rFonts w:ascii="Times New Roman" w:hAnsi="Times New Roman" w:eastAsia="宋体"/>
-                <w:sz w:val="14"/>
-              </w:rPr>
-              <w:t>文本规范化与打分工具库。它负责中文问题清洗、数字抽取、Excel 显示值格式化、单位提取、中文 n-gram token 生成、加权重合度计算和去重。该文件使不同模块可以共享同一套文本匹配逻辑，避免各处重复写字符串处理代码。</w:t>
-            </w:r>
-          </w:p>
-        </w:tc>
-      </w:tr>
-      <w:tr>
-        <w:tc>
-          <w:tcPr>
-            <w:tcW w:type="dxa" w:w="2664"/>
-            <w:vAlign w:val="center"/>
-            <w:tcMar>
-              <w:top w:w="80" w:type="dxa"/>
-              <w:start w:w="80" w:type="dxa"/>
-              <w:bottom w:w="80" w:type="dxa"/>
-              <w:end w:w="80" w:type="dxa"/>
-            </w:tcMar>
-          </w:tcPr>
-          <w:p>
-            <w:pPr>
-              <w:spacing w:after="0" w:line="240" w:lineRule="auto"/>
-            </w:pPr>
-            <w:r>
-              <w:rPr>
-                <w:rFonts w:ascii="Times New Roman" w:hAnsi="Times New Roman" w:eastAsia="宋体"/>
-                <w:sz w:val="14"/>
-              </w:rPr>
-              <w:t>src/parser/excel_parser.py</w:t>
-            </w:r>
-          </w:p>
-        </w:tc>
-        <w:tc>
-          <w:tcPr>
-            <w:tcW w:type="dxa" w:w="6696"/>
-            <w:vAlign w:val="center"/>
-            <w:tcMar>
-              <w:top w:w="80" w:type="dxa"/>
-              <w:start w:w="80" w:type="dxa"/>
-              <w:bottom w:w="80" w:type="dxa"/>
-              <w:end w:w="80" w:type="dxa"/>
-            </w:tcMar>
-          </w:tcPr>
-          <w:p>
-            <w:pPr>
-              <w:spacing w:after="0" w:line="240" w:lineRule="auto"/>
-            </w:pPr>
-            <w:r>
-              <w:rPr>
-                <w:rFonts w:ascii="Times New Roman" w:hAnsi="Times New Roman" w:eastAsia="宋体"/>
-                <w:sz w:val="14"/>
-              </w:rPr>
-              <w:t>Excel 解析器。它使用 openpyxl 读取公式缓存后的显示值，填充合并区域，裁剪外围全空行列，并在可识别表头时返回带列名的 DataFrame。其设计目标不是立即得到完美关系表，而是尽量保留原始视觉结构，为后续证据索引和局部关系恢复提供基础。</w:t>
-            </w:r>
-          </w:p>
-        </w:tc>
-      </w:tr>
-      <w:tr>
-        <w:tc>
-          <w:tcPr>
-            <w:tcW w:type="dxa" w:w="2664"/>
-            <w:vAlign w:val="center"/>
-            <w:tcMar>
-              <w:top w:w="80" w:type="dxa"/>
-              <w:start w:w="80" w:type="dxa"/>
-              <w:bottom w:w="80" w:type="dxa"/>
-              <w:end w:w="80" w:type="dxa"/>
-            </w:tcMar>
-          </w:tcPr>
-          <w:p>
-            <w:pPr>
-              <w:spacing w:after="0" w:line="240" w:lineRule="auto"/>
-            </w:pPr>
-            <w:r>
-              <w:rPr>
-                <w:rFonts w:ascii="Times New Roman" w:hAnsi="Times New Roman" w:eastAsia="宋体"/>
-                <w:sz w:val="14"/>
-              </w:rPr>
-              <w:t>src/parser/structure_analyzer.py</w:t>
-            </w:r>
-          </w:p>
-        </w:tc>
-        <w:tc>
-          <w:tcPr>
-            <w:tcW w:type="dxa" w:w="6696"/>
-            <w:vAlign w:val="center"/>
-            <w:tcMar>
-              <w:top w:w="80" w:type="dxa"/>
-              <w:start w:w="80" w:type="dxa"/>
-              <w:bottom w:w="80" w:type="dxa"/>
-              <w:end w:w="80" w:type="dxa"/>
-            </w:tcMar>
-          </w:tcPr>
-          <w:p>
-            <w:pPr>
-              <w:spacing w:after="0" w:line="240" w:lineRule="auto"/>
-            </w:pPr>
-            <w:r>
-              <w:rPr>
-                <w:rFonts w:ascii="Times New Roman" w:hAnsi="Times New Roman" w:eastAsia="宋体"/>
-                <w:sz w:val="14"/>
-              </w:rPr>
-              <w:t>轻量结构分析器。它可以抽取前若干行的多级表头、将层级表头展平成列名，并根据数据列内容推断 numeric、datetime 或 text 类型。当前主流程主要使用更强的 TableIndexer 与 RelationalAnswerEngine，但该文件保留了可扩展的结构分析接口。</w:t>
-            </w:r>
-          </w:p>
-        </w:tc>
-      </w:tr>
-      <w:tr>
-        <w:tc>
-          <w:tcPr>
-            <w:tcW w:type="dxa" w:w="2664"/>
-            <w:vAlign w:val="center"/>
-            <w:tcMar>
-              <w:top w:w="80" w:type="dxa"/>
-              <w:start w:w="80" w:type="dxa"/>
-              <w:bottom w:w="80" w:type="dxa"/>
-              <w:end w:w="80" w:type="dxa"/>
-            </w:tcMar>
-          </w:tcPr>
-          <w:p>
-            <w:pPr>
-              <w:spacing w:after="0" w:line="240" w:lineRule="auto"/>
-            </w:pPr>
-            <w:r>
-              <w:rPr>
-                <w:rFonts w:ascii="Times New Roman" w:hAnsi="Times New Roman" w:eastAsia="宋体"/>
-                <w:sz w:val="14"/>
-              </w:rPr>
-              <w:t>src/router/query_router.py</w:t>
-            </w:r>
-          </w:p>
-        </w:tc>
-        <w:tc>
-          <w:tcPr>
-            <w:tcW w:type="dxa" w:w="6696"/>
-            <w:vAlign w:val="center"/>
-            <w:tcMar>
-              <w:top w:w="80" w:type="dxa"/>
-              <w:start w:w="80" w:type="dxa"/>
-              <w:bottom w:w="80" w:type="dxa"/>
-              <w:end w:w="80" w:type="dxa"/>
-            </w:tcMar>
-          </w:tcPr>
-          <w:p>
-            <w:pPr>
-              <w:spacing w:after="0" w:line="240" w:lineRule="auto"/>
-            </w:pPr>
-            <w:r>
-              <w:rPr>
-                <w:rFonts w:ascii="Times New Roman" w:hAnsi="Times New Roman" w:eastAsia="宋体"/>
-                <w:sz w:val="14"/>
-              </w:rPr>
-              <w:t>透明规则路由器。它按关键词把问题粗分为 SQL_AGG、KV_LOOKUP、VECTOR_SEARCH、CELL_LOOKUP 等类别，并映射到对应 Agent 名称。它的优点是无需 API、结果可解释；缺点是语义覆盖有限，因此主流程中还叠加了 HybridQueryEngine 的细粒度路由。</w:t>
-            </w:r>
-          </w:p>
-        </w:tc>
-      </w:tr>
-      <w:tr>
-        <w:tc>
-          <w:tcPr>
-            <w:tcW w:type="dxa" w:w="2664"/>
-            <w:vAlign w:val="center"/>
-            <w:tcMar>
-              <w:top w:w="80" w:type="dxa"/>
-              <w:start w:w="80" w:type="dxa"/>
-              <w:bottom w:w="80" w:type="dxa"/>
-              <w:end w:w="80" w:type="dxa"/>
-            </w:tcMar>
-          </w:tcPr>
-          <w:p>
-            <w:pPr>
-              <w:spacing w:after="0" w:line="240" w:lineRule="auto"/>
-            </w:pPr>
-            <w:r>
-              <w:rPr>
-                <w:rFonts w:ascii="Times New Roman" w:hAnsi="Times New Roman" w:eastAsia="宋体"/>
-                <w:sz w:val="14"/>
-              </w:rPr>
-              <w:t>src/router/query_classifier.py</w:t>
-            </w:r>
-          </w:p>
-        </w:tc>
-        <w:tc>
-          <w:tcPr>
-            <w:tcW w:type="dxa" w:w="6696"/>
-            <w:vAlign w:val="center"/>
-            <w:tcMar>
-              <w:top w:w="80" w:type="dxa"/>
-              <w:start w:w="80" w:type="dxa"/>
-              <w:bottom w:w="80" w:type="dxa"/>
-              <w:end w:w="80" w:type="dxa"/>
-            </w:tcMar>
-          </w:tcPr>
-          <w:p>
-            <w:pPr>
-              <w:spacing w:after="0" w:line="240" w:lineRule="auto"/>
-            </w:pPr>
-            <w:r>
-              <w:rPr>
-                <w:rFonts w:ascii="Times New Roman" w:hAnsi="Times New Roman" w:eastAsia="宋体"/>
-                <w:sz w:val="14"/>
-              </w:rPr>
-              <w:t>可选 LLM 分类器。若 config.yaml 中启用 LLM 且配置 API key，则尝试使用 langchain_deepseek 调用模型输出 JSON 分类；否则自动回退到 RuleBasedRouter。这样既保留语义分类扩展空间，又不影响离线课堂环境运行。</w:t>
-            </w:r>
-          </w:p>
-        </w:tc>
-      </w:tr>
-      <w:tr>
-        <w:tc>
-          <w:tcPr>
-            <w:tcW w:type="dxa" w:w="2664"/>
-            <w:vAlign w:val="center"/>
-            <w:tcMar>
-              <w:top w:w="80" w:type="dxa"/>
-              <w:start w:w="80" w:type="dxa"/>
-              <w:bottom w:w="80" w:type="dxa"/>
-              <w:end w:w="80" w:type="dxa"/>
-            </w:tcMar>
-          </w:tcPr>
-          <w:p>
-            <w:pPr>
-              <w:spacing w:after="0" w:line="240" w:lineRule="auto"/>
-            </w:pPr>
-            <w:r>
-              <w:rPr>
-                <w:rFonts w:ascii="Times New Roman" w:hAnsi="Times New Roman" w:eastAsia="宋体"/>
-                <w:sz w:val="14"/>
-              </w:rPr>
-              <w:t>src/storage/sql_storage.py</w:t>
-            </w:r>
-          </w:p>
-        </w:tc>
-        <w:tc>
-          <w:tcPr>
-            <w:tcW w:type="dxa" w:w="6696"/>
-            <w:vAlign w:val="center"/>
-            <w:tcMar>
-              <w:top w:w="80" w:type="dxa"/>
-              <w:start w:w="80" w:type="dxa"/>
-              <w:bottom w:w="80" w:type="dxa"/>
-              <w:end w:w="80" w:type="dxa"/>
-            </w:tcMar>
-          </w:tcPr>
-          <w:p>
-            <w:pPr>
-              <w:spacing w:after="0" w:line="240" w:lineRule="auto"/>
-            </w:pPr>
-            <w:r>
-              <w:rPr>
-                <w:rFonts w:ascii="Times New Roman" w:hAnsi="Times New Roman" w:eastAsia="宋体"/>
-                <w:sz w:val="14"/>
-              </w:rPr>
-              <w:t>SQLite 存储封装。它可以把 DataFrame 写成数据库表，执行 SQL 查询，获取表名并关闭连接。该模块主要服务 SQLAgent 和早期原型，也体现了课程数据库部分的关系型存储接口。</w:t>
-            </w:r>
-          </w:p>
-        </w:tc>
-      </w:tr>
-      <w:tr>
-        <w:tc>
-          <w:tcPr>
-            <w:tcW w:type="dxa" w:w="2664"/>
-            <w:vAlign w:val="center"/>
-            <w:tcMar>
-              <w:top w:w="80" w:type="dxa"/>
-              <w:start w:w="80" w:type="dxa"/>
-              <w:bottom w:w="80" w:type="dxa"/>
-              <w:end w:w="80" w:type="dxa"/>
-            </w:tcMar>
-          </w:tcPr>
-          <w:p>
-            <w:pPr>
-              <w:spacing w:after="0" w:line="240" w:lineRule="auto"/>
-            </w:pPr>
-            <w:r>
-              <w:rPr>
-                <w:rFonts w:ascii="Times New Roman" w:hAnsi="Times New Roman" w:eastAsia="宋体"/>
-                <w:sz w:val="14"/>
-              </w:rPr>
-              <w:t>src/storage/kv_storage.py</w:t>
-            </w:r>
-          </w:p>
-        </w:tc>
-        <w:tc>
-          <w:tcPr>
-            <w:tcW w:type="dxa" w:w="6696"/>
-            <w:vAlign w:val="center"/>
-            <w:tcMar>
-              <w:top w:w="80" w:type="dxa"/>
-              <w:start w:w="80" w:type="dxa"/>
-              <w:bottom w:w="80" w:type="dxa"/>
-              <w:end w:w="80" w:type="dxa"/>
-            </w:tcMar>
-          </w:tcPr>
-          <w:p>
-            <w:pPr>
-              <w:spacing w:after="0" w:line="240" w:lineRule="auto"/>
-            </w:pPr>
-            <w:r>
-              <w:rPr>
-                <w:rFonts w:ascii="Times New Roman" w:hAnsi="Times New Roman" w:eastAsia="宋体"/>
-                <w:sz w:val="14"/>
-              </w:rPr>
-              <w:t>JSON 文件形式的 Key-Value 存储。它提供 set、get、delete、contains、get_all 等基础接口，适合保存表级说明、数据来源、单位和运行元数据等不适合放入关系表的轻量信息。</w:t>
-            </w:r>
-          </w:p>
-        </w:tc>
-      </w:tr>
-      <w:tr>
-        <w:tc>
-          <w:tcPr>
-            <w:tcW w:type="dxa" w:w="2664"/>
-            <w:vAlign w:val="center"/>
-            <w:tcMar>
-              <w:top w:w="80" w:type="dxa"/>
-              <w:start w:w="80" w:type="dxa"/>
-              <w:bottom w:w="80" w:type="dxa"/>
-              <w:end w:w="80" w:type="dxa"/>
-            </w:tcMar>
-          </w:tcPr>
-          <w:p>
-            <w:pPr>
-              <w:spacing w:after="0" w:line="240" w:lineRule="auto"/>
-            </w:pPr>
-            <w:r>
-              <w:rPr>
-                <w:rFonts w:ascii="Times New Roman" w:hAnsi="Times New Roman" w:eastAsia="宋体"/>
-                <w:sz w:val="14"/>
-              </w:rPr>
-              <w:t>src/storage/vector_storage.py</w:t>
-            </w:r>
-          </w:p>
-        </w:tc>
-        <w:tc>
-          <w:tcPr>
-            <w:tcW w:type="dxa" w:w="6696"/>
-            <w:vAlign w:val="center"/>
-            <w:tcMar>
-              <w:top w:w="80" w:type="dxa"/>
-              <w:start w:w="80" w:type="dxa"/>
-              <w:bottom w:w="80" w:type="dxa"/>
-              <w:end w:w="80" w:type="dxa"/>
-            </w:tcMar>
-          </w:tcPr>
-          <w:p>
-            <w:pPr>
-              <w:spacing w:after="0" w:line="240" w:lineRule="auto"/>
-            </w:pPr>
-            <w:r>
-              <w:rPr>
-                <w:rFonts w:ascii="Times New Roman" w:hAnsi="Times New Roman" w:eastAsia="宋体"/>
-                <w:sz w:val="14"/>
-              </w:rPr>
-              <w:t>离线检索存储。它保留 VectorStorage 的 public API，但默认不依赖 ChromaDB 或 sentence-transformers，而是把文档转换成 sparse-token 计数，按 token 重合分数排序。这样脚本和测试无需下载模型也可以运行。</w:t>
-            </w:r>
-          </w:p>
-        </w:tc>
-      </w:tr>
-      <w:tr>
-        <w:tc>
-          <w:tcPr>
-            <w:tcW w:type="dxa" w:w="2664"/>
-            <w:vAlign w:val="center"/>
-            <w:tcMar>
-              <w:top w:w="80" w:type="dxa"/>
-              <w:start w:w="80" w:type="dxa"/>
-              <w:bottom w:w="80" w:type="dxa"/>
-              <w:end w:w="80" w:type="dxa"/>
-            </w:tcMar>
-          </w:tcPr>
-          <w:p>
-            <w:pPr>
-              <w:spacing w:after="0" w:line="240" w:lineRule="auto"/>
-            </w:pPr>
-            <w:r>
-              <w:rPr>
-                <w:rFonts w:ascii="Times New Roman" w:hAnsi="Times New Roman" w:eastAsia="宋体"/>
-                <w:sz w:val="14"/>
-              </w:rPr>
-              <w:t>src/agents/sql_agent.py</w:t>
-            </w:r>
-          </w:p>
-        </w:tc>
-        <w:tc>
-          <w:tcPr>
-            <w:tcW w:type="dxa" w:w="6696"/>
-            <w:vAlign w:val="center"/>
-            <w:tcMar>
-              <w:top w:w="80" w:type="dxa"/>
-              <w:start w:w="80" w:type="dxa"/>
-              <w:bottom w:w="80" w:type="dxa"/>
-              <w:end w:w="80" w:type="dxa"/>
-            </w:tcMar>
-          </w:tcPr>
-          <w:p>
-            <w:pPr>
-              <w:spacing w:after="0" w:line="240" w:lineRule="auto"/>
-            </w:pPr>
-            <w:r>
-              <w:rPr>
-                <w:rFonts w:ascii="Times New Roman" w:hAnsi="Times New Roman" w:eastAsia="宋体"/>
-                <w:sz w:val="14"/>
-              </w:rPr>
-              <w:t>SQL 聚合 Agent。它读取 SQLite 中的首个表和列名，基于问题中的总和、平均、计数、最大、最小等关键词拼接受控 SQL 聚合语句。它是可解释 SQL 查询路径的简单原型，适合规则表，但不直接处理复杂半结构化布局。</w:t>
-            </w:r>
-          </w:p>
-        </w:tc>
-      </w:tr>
-      <w:tr>
-        <w:tc>
-          <w:tcPr>
-            <w:tcW w:type="dxa" w:w="2664"/>
-            <w:vAlign w:val="center"/>
-            <w:tcMar>
-              <w:top w:w="80" w:type="dxa"/>
-              <w:start w:w="80" w:type="dxa"/>
-              <w:bottom w:w="80" w:type="dxa"/>
-              <w:end w:w="80" w:type="dxa"/>
-            </w:tcMar>
-          </w:tcPr>
-          <w:p>
-            <w:pPr>
-              <w:spacing w:after="0" w:line="240" w:lineRule="auto"/>
-            </w:pPr>
-            <w:r>
-              <w:rPr>
-                <w:rFonts w:ascii="Times New Roman" w:hAnsi="Times New Roman" w:eastAsia="宋体"/>
-                <w:sz w:val="14"/>
-              </w:rPr>
-              <w:t>src/agents/kv_agent.py</w:t>
-            </w:r>
-          </w:p>
-        </w:tc>
-        <w:tc>
-          <w:tcPr>
-            <w:tcW w:type="dxa" w:w="6696"/>
-            <w:vAlign w:val="center"/>
-            <w:tcMar>
-              <w:top w:w="80" w:type="dxa"/>
-              <w:start w:w="80" w:type="dxa"/>
-              <w:bottom w:w="80" w:type="dxa"/>
-              <w:end w:w="80" w:type="dxa"/>
-            </w:tcMar>
-          </w:tcPr>
-          <w:p>
-            <w:pPr>
-              <w:spacing w:after="0" w:line="240" w:lineRule="auto"/>
-            </w:pPr>
-            <w:r>
-              <w:rPr>
-                <w:rFonts w:ascii="Times New Roman" w:hAnsi="Times New Roman" w:eastAsia="宋体"/>
-                <w:sz w:val="14"/>
-              </w:rPr>
-              <w:t>KV 查询 Agent。它先尝试问题是否直接包含某个 key；若没有，再用 weighted_overlap 在 key 和 value 文本中找最相关项。适合“数据来源是什么”“单位是什么”等元数据问题。</w:t>
-            </w:r>
-          </w:p>
-        </w:tc>
-      </w:tr>
-      <w:tr>
-        <w:tc>
-          <w:tcPr>
-            <w:tcW w:type="dxa" w:w="2664"/>
-            <w:vAlign w:val="center"/>
-            <w:tcMar>
-              <w:top w:w="80" w:type="dxa"/>
-              <w:start w:w="80" w:type="dxa"/>
-              <w:bottom w:w="80" w:type="dxa"/>
-              <w:end w:w="80" w:type="dxa"/>
-            </w:tcMar>
-          </w:tcPr>
-          <w:p>
-            <w:pPr>
-              <w:spacing w:after="0" w:line="240" w:lineRule="auto"/>
-            </w:pPr>
-            <w:r>
-              <w:rPr>
-                <w:rFonts w:ascii="Times New Roman" w:hAnsi="Times New Roman" w:eastAsia="宋体"/>
-                <w:sz w:val="14"/>
-              </w:rPr>
-              <w:t>src/agents/vector_agent.py</w:t>
-            </w:r>
-          </w:p>
-        </w:tc>
-        <w:tc>
-          <w:tcPr>
-            <w:tcW w:type="dxa" w:w="6696"/>
-            <w:vAlign w:val="center"/>
-            <w:tcMar>
-              <w:top w:w="80" w:type="dxa"/>
-              <w:start w:w="80" w:type="dxa"/>
-              <w:bottom w:w="80" w:type="dxa"/>
-              <w:end w:w="80" w:type="dxa"/>
-            </w:tcMar>
-          </w:tcPr>
-          <w:p>
-            <w:pPr>
-              <w:spacing w:after="0" w:line="240" w:lineRule="auto"/>
-            </w:pPr>
-            <w:r>
-              <w:rPr>
-                <w:rFonts w:ascii="Times New Roman" w:hAnsi="Times New Roman" w:eastAsia="宋体"/>
-                <w:sz w:val="14"/>
-              </w:rPr>
-              <w:t>检索增强 Agent。它调用 VectorStorage 搜索相关文档片段，若配置了 LLMAgent 则把片段作为上下文交给 LLM；否则直接返回检索到的片段。该模块体现了向量/语义检索扩展路线，但默认可离线运行。</w:t>
-            </w:r>
-          </w:p>
-        </w:tc>
-      </w:tr>
-      <w:tr>
-        <w:tc>
-          <w:tcPr>
-            <w:tcW w:type="dxa" w:w="2664"/>
-            <w:vAlign w:val="center"/>
-            <w:tcMar>
-              <w:top w:w="80" w:type="dxa"/>
-              <w:start w:w="80" w:type="dxa"/>
-              <w:bottom w:w="80" w:type="dxa"/>
-              <w:end w:w="80" w:type="dxa"/>
-            </w:tcMar>
-          </w:tcPr>
-          <w:p>
-            <w:pPr>
-              <w:spacing w:after="0" w:line="240" w:lineRule="auto"/>
-            </w:pPr>
-            <w:r>
-              <w:rPr>
-                <w:rFonts w:ascii="Times New Roman" w:hAnsi="Times New Roman" w:eastAsia="宋体"/>
-                <w:sz w:val="14"/>
-              </w:rPr>
-              <w:t>src/agents/llm_agent.py</w:t>
-            </w:r>
-          </w:p>
-        </w:tc>
-        <w:tc>
-          <w:tcPr>
-            <w:tcW w:type="dxa" w:w="6696"/>
-            <w:vAlign w:val="center"/>
-            <w:tcMar>
-              <w:top w:w="80" w:type="dxa"/>
-              <w:start w:w="80" w:type="dxa"/>
-              <w:bottom w:w="80" w:type="dxa"/>
-              <w:end w:w="80" w:type="dxa"/>
-            </w:tcMar>
-          </w:tcPr>
-          <w:p>
-            <w:pPr>
-              <w:spacing w:after="0" w:line="240" w:lineRule="auto"/>
-            </w:pPr>
-            <w:r>
-              <w:rPr>
-                <w:rFonts w:ascii="Times New Roman" w:hAnsi="Times New Roman" w:eastAsia="宋体"/>
-                <w:sz w:val="14"/>
-              </w:rPr>
-              <w:t>可选 LLM 封装器。它读取 DEEPSEEK_API_KEY 等环境变量；未配置 API key 时返回离线兜底说明，而不是让系统报错。这样报告中可以说明 LLM 是可选增强，而不是系统运行前提。</w:t>
-            </w:r>
-          </w:p>
-        </w:tc>
-      </w:tr>
-      <w:tr>
-        <w:tc>
-          <w:tcPr>
-            <w:tcW w:type="dxa" w:w="2664"/>
-            <w:vAlign w:val="center"/>
-            <w:tcMar>
-              <w:top w:w="80" w:type="dxa"/>
-              <w:start w:w="80" w:type="dxa"/>
-              <w:bottom w:w="80" w:type="dxa"/>
-              <w:end w:w="80" w:type="dxa"/>
-            </w:tcMar>
-          </w:tcPr>
-          <w:p>
-            <w:pPr>
-              <w:spacing w:after="0" w:line="240" w:lineRule="auto"/>
-            </w:pPr>
-            <w:r>
-              <w:rPr>
-                <w:rFonts w:ascii="Times New Roman" w:hAnsi="Times New Roman" w:eastAsia="宋体"/>
-                <w:sz w:val="14"/>
-              </w:rPr>
-              <w:t>src/evaluator/answer_matcher.py</w:t>
-            </w:r>
-          </w:p>
-        </w:tc>
-        <w:tc>
-          <w:tcPr>
-            <w:tcW w:type="dxa" w:w="6696"/>
-            <w:vAlign w:val="center"/>
-            <w:tcMar>
-              <w:top w:w="80" w:type="dxa"/>
-              <w:start w:w="80" w:type="dxa"/>
-              <w:bottom w:w="80" w:type="dxa"/>
-              <w:end w:w="80" w:type="dxa"/>
-            </w:tcMar>
-          </w:tcPr>
-          <w:p>
-            <w:pPr>
-              <w:spacing w:after="0" w:line="240" w:lineRule="auto"/>
-            </w:pPr>
-            <w:r>
-              <w:rPr>
-                <w:rFonts w:ascii="Times New Roman" w:hAnsi="Times New Roman" w:eastAsia="宋体"/>
-                <w:sz w:val="14"/>
-              </w:rPr>
-              <w:t>答案匹配器。它先做文本规范化和精确匹配，再做数值容差、百分比换算、列表集合匹配和 LCS/ROUGE-L 风格相似度判断。这样可以兼容“50000”和“50000人”、列表顺序差异、长文本包含答案等情况。</w:t>
-            </w:r>
-          </w:p>
-        </w:tc>
-      </w:tr>
-      <w:tr>
-        <w:tc>
-          <w:tcPr>
-            <w:tcW w:type="dxa" w:w="2664"/>
-            <w:vAlign w:val="center"/>
-            <w:tcMar>
-              <w:top w:w="80" w:type="dxa"/>
-              <w:start w:w="80" w:type="dxa"/>
-              <w:bottom w:w="80" w:type="dxa"/>
-              <w:end w:w="80" w:type="dxa"/>
-            </w:tcMar>
-          </w:tcPr>
-          <w:p>
-            <w:pPr>
-              <w:spacing w:after="0" w:line="240" w:lineRule="auto"/>
-            </w:pPr>
-            <w:r>
-              <w:rPr>
-                <w:rFonts w:ascii="Times New Roman" w:hAnsi="Times New Roman" w:eastAsia="宋体"/>
-                <w:sz w:val="14"/>
-              </w:rPr>
-              <w:t>src/evaluator/statistics.py</w:t>
-            </w:r>
-          </w:p>
-        </w:tc>
-        <w:tc>
-          <w:tcPr>
-            <w:tcW w:type="dxa" w:w="6696"/>
-            <w:vAlign w:val="center"/>
-            <w:tcMar>
-              <w:top w:w="80" w:type="dxa"/>
-              <w:start w:w="80" w:type="dxa"/>
-              <w:bottom w:w="80" w:type="dxa"/>
-              <w:end w:w="80" w:type="dxa"/>
-            </w:tcMar>
-          </w:tcPr>
-          <w:p>
-            <w:pPr>
-              <w:spacing w:after="0" w:line="240" w:lineRule="auto"/>
-            </w:pPr>
-            <w:r>
-              <w:rPr>
-                <w:rFonts w:ascii="Times New Roman" w:hAnsi="Times New Roman" w:eastAsia="宋体"/>
-                <w:sz w:val="14"/>
-              </w:rPr>
-              <w:t>评测统计器。它保存每条问题的预测、标准答案、是否正确、类别和路由等信息，计算整体准确率和分类准确率，并可导出为 evaluation_report.json。</w:t>
-            </w:r>
-          </w:p>
-        </w:tc>
-      </w:tr>
-      <w:tr>
-        <w:tc>
-          <w:tcPr>
-            <w:tcW w:type="dxa" w:w="2664"/>
-            <w:vAlign w:val="center"/>
-            <w:tcMar>
-              <w:top w:w="80" w:type="dxa"/>
-              <w:start w:w="80" w:type="dxa"/>
-              <w:bottom w:w="80" w:type="dxa"/>
-              <w:end w:w="80" w:type="dxa"/>
-            </w:tcMar>
-          </w:tcPr>
-          <w:p>
-            <w:pPr>
-              <w:spacing w:after="0" w:line="240" w:lineRule="auto"/>
-            </w:pPr>
-            <w:r>
-              <w:rPr>
-                <w:rFonts w:ascii="Times New Roman" w:hAnsi="Times New Roman" w:eastAsia="宋体"/>
-                <w:sz w:val="14"/>
-              </w:rPr>
-              <w:t>scripts/build_report_docx.py</w:t>
-            </w:r>
-          </w:p>
-        </w:tc>
-        <w:tc>
-          <w:tcPr>
-            <w:tcW w:type="dxa" w:w="6696"/>
-            <w:vAlign w:val="center"/>
-            <w:tcMar>
-              <w:top w:w="80" w:type="dxa"/>
-              <w:start w:w="80" w:type="dxa"/>
-              <w:bottom w:w="80" w:type="dxa"/>
-              <w:end w:w="80" w:type="dxa"/>
-            </w:tcMar>
-          </w:tcPr>
-          <w:p>
-            <w:pPr>
-              <w:spacing w:after="0" w:line="240" w:lineRule="auto"/>
-            </w:pPr>
-            <w:r>
-              <w:rPr>
-                <w:rFonts w:ascii="Times New Roman" w:hAnsi="Times New Roman" w:eastAsia="宋体"/>
-                <w:sz w:val="14"/>
-              </w:rPr>
-              <w:t>报告生成脚本。它基于课程模板创建最终 DOCX，设置标题、摘要、正文分栏、表格样式和参考文献，并把当前项目指标、实现细节和文件说明写入报告。后续只要修改脚本文本并重新运行即可得到新版报告。</w:t>
-            </w:r>
-          </w:p>
-        </w:tc>
-      </w:tr>
-      <w:tr>
-        <w:tc>
-          <w:tcPr>
-            <w:tcW w:type="dxa" w:w="2664"/>
-            <w:vAlign w:val="center"/>
-            <w:tcMar>
-              <w:top w:w="80" w:type="dxa"/>
-              <w:start w:w="80" w:type="dxa"/>
-              <w:bottom w:w="80" w:type="dxa"/>
-              <w:end w:w="80" w:type="dxa"/>
-            </w:tcMar>
-          </w:tcPr>
-          <w:p>
-            <w:pPr>
-              <w:spacing w:after="0" w:line="240" w:lineRule="auto"/>
-            </w:pPr>
-            <w:r>
-              <w:rPr>
-                <w:rFonts w:ascii="Times New Roman" w:hAnsi="Times New Roman" w:eastAsia="宋体"/>
-                <w:sz w:val="14"/>
-              </w:rPr>
-              <w:t>scripts/vectorize_tables.py</w:t>
-            </w:r>
-          </w:p>
-        </w:tc>
-        <w:tc>
-          <w:tcPr>
-            <w:tcW w:type="dxa" w:w="6696"/>
-            <w:vAlign w:val="center"/>
-            <w:tcMar>
-              <w:top w:w="80" w:type="dxa"/>
-              <w:start w:w="80" w:type="dxa"/>
-              <w:bottom w:w="80" w:type="dxa"/>
-              <w:end w:w="80" w:type="dxa"/>
-            </w:tcMar>
-          </w:tcPr>
-          <w:p>
-            <w:pPr>
-              <w:spacing w:after="0" w:line="240" w:lineRule="auto"/>
-            </w:pPr>
-            <w:r>
-              <w:rPr>
-                <w:rFonts w:ascii="Times New Roman" w:hAnsi="Times New Roman" w:eastAsia="宋体"/>
-                <w:sz w:val="14"/>
-              </w:rPr>
-              <w:t>可选的批量检索准备脚本。它遍历 raw Excel 文件，把每行转换为文本片段并写入 VectorStorage。当前主流程不依赖它，但它展示了如何扩展到向量/语义检索路径。</w:t>
-            </w:r>
-          </w:p>
-        </w:tc>
-      </w:tr>
-      <w:tr>
-        <w:tc>
-          <w:tcPr>
-            <w:tcW w:type="dxa" w:w="2664"/>
-            <w:vAlign w:val="center"/>
-            <w:tcMar>
-              <w:top w:w="80" w:type="dxa"/>
-              <w:start w:w="80" w:type="dxa"/>
-              <w:bottom w:w="80" w:type="dxa"/>
-              <w:end w:w="80" w:type="dxa"/>
-            </w:tcMar>
-          </w:tcPr>
-          <w:p>
-            <w:pPr>
-              <w:spacing w:after="0" w:line="240" w:lineRule="auto"/>
-            </w:pPr>
-            <w:r>
-              <w:rPr>
-                <w:rFonts w:ascii="Times New Roman" w:hAnsi="Times New Roman" w:eastAsia="宋体"/>
-                <w:sz w:val="14"/>
-              </w:rPr>
-              <w:t>tests/test_core_behavior.py</w:t>
-            </w:r>
-          </w:p>
-        </w:tc>
-        <w:tc>
-          <w:tcPr>
-            <w:tcW w:type="dxa" w:w="6696"/>
-            <w:vAlign w:val="center"/>
-            <w:tcMar>
-              <w:top w:w="80" w:type="dxa"/>
-              <w:start w:w="80" w:type="dxa"/>
-              <w:bottom w:w="80" w:type="dxa"/>
-              <w:end w:w="80" w:type="dxa"/>
-            </w:tcMar>
-          </w:tcPr>
-          <w:p>
-            <w:pPr>
-              <w:spacing w:after="0" w:line="240" w:lineRule="auto"/>
-            </w:pPr>
-            <w:r>
-              <w:rPr>
-                <w:rFonts w:ascii="Times New Roman" w:hAnsi="Times New Roman" w:eastAsia="宋体"/>
-                <w:sz w:val="14"/>
-              </w:rPr>
-              <w:t>核心行为测试。它验证数值答案不能被子串误判、规则路由能识别计数问题、离线 VectorStorage 能按 token 找到相关文档，是防止关键回归的最小测试集。</w:t>
-            </w:r>
-          </w:p>
-        </w:tc>
-      </w:tr>
-      <w:tr>
-        <w:tc>
-          <w:tcPr>
-            <w:tcW w:type="dxa" w:w="2664"/>
-            <w:vAlign w:val="center"/>
-            <w:tcMar>
-              <w:top w:w="80" w:type="dxa"/>
-              <w:start w:w="80" w:type="dxa"/>
-              <w:bottom w:w="80" w:type="dxa"/>
-              <w:end w:w="80" w:type="dxa"/>
-            </w:tcMar>
-          </w:tcPr>
-          <w:p>
-            <w:pPr>
-              <w:spacing w:after="0" w:line="240" w:lineRule="auto"/>
-            </w:pPr>
-            <w:r>
-              <w:rPr>
-                <w:rFonts w:ascii="Times New Roman" w:hAnsi="Times New Roman" w:eastAsia="宋体"/>
-                <w:sz w:val="14"/>
-              </w:rPr>
-              <w:t>tests/test_parser.py</w:t>
-            </w:r>
-          </w:p>
-        </w:tc>
-        <w:tc>
-          <w:tcPr>
-            <w:tcW w:type="dxa" w:w="6696"/>
-            <w:vAlign w:val="center"/>
-            <w:tcMar>
-              <w:top w:w="80" w:type="dxa"/>
-              <w:start w:w="80" w:type="dxa"/>
-              <w:bottom w:w="80" w:type="dxa"/>
-              <w:end w:w="80" w:type="dxa"/>
-            </w:tcMar>
-          </w:tcPr>
-          <w:p>
-            <w:pPr>
-              <w:spacing w:after="0" w:line="240" w:lineRule="auto"/>
-            </w:pPr>
-            <w:r>
-              <w:rPr>
-                <w:rFonts w:ascii="Times New Roman" w:hAnsi="Times New Roman" w:eastAsia="宋体"/>
-                <w:sz w:val="14"/>
-              </w:rPr>
-              <w:t>解析调试脚本。它读取示例 Excel，打印解析后的 DataFrame、表格形状、多级表头和展平列名，主要用于观察 ExcelParser 与 StructureAnalyzer 的效果。</w:t>
-            </w:r>
-          </w:p>
-        </w:tc>
-      </w:tr>
-      <w:tr>
-        <w:tc>
-          <w:tcPr>
-            <w:tcW w:type="dxa" w:w="2664"/>
-            <w:vAlign w:val="center"/>
-            <w:tcMar>
-              <w:top w:w="80" w:type="dxa"/>
-              <w:start w:w="80" w:type="dxa"/>
-              <w:bottom w:w="80" w:type="dxa"/>
-              <w:end w:w="80" w:type="dxa"/>
-            </w:tcMar>
-          </w:tcPr>
-          <w:p>
-            <w:pPr>
-              <w:spacing w:after="0" w:line="240" w:lineRule="auto"/>
-            </w:pPr>
-            <w:r>
-              <w:rPr>
-                <w:rFonts w:ascii="Times New Roman" w:hAnsi="Times New Roman" w:eastAsia="宋体"/>
-                <w:sz w:val="14"/>
-              </w:rPr>
-              <w:t>tests/test_router.py</w:t>
-            </w:r>
-          </w:p>
-        </w:tc>
-        <w:tc>
-          <w:tcPr>
-            <w:tcW w:type="dxa" w:w="6696"/>
-            <w:vAlign w:val="center"/>
-            <w:tcMar>
-              <w:top w:w="80" w:type="dxa"/>
-              <w:start w:w="80" w:type="dxa"/>
-              <w:bottom w:w="80" w:type="dxa"/>
-              <w:end w:w="80" w:type="dxa"/>
-            </w:tcMar>
-          </w:tcPr>
-          <w:p>
-            <w:pPr>
-              <w:spacing w:after="0" w:line="240" w:lineRule="auto"/>
-            </w:pPr>
-            <w:r>
-              <w:rPr>
-                <w:rFonts w:ascii="Times New Roman" w:hAnsi="Times New Roman" w:eastAsia="宋体"/>
-                <w:sz w:val="14"/>
-              </w:rPr>
-              <w:t>路由调试脚本。它用若干自然语言问题打印 RuleBasedRouter 的分类和目标 Agent，方便检查关键词路由是否符合预期。</w:t>
-            </w:r>
-          </w:p>
-        </w:tc>
-      </w:tr>
-      <w:tr>
-        <w:tc>
-          <w:tcPr>
-            <w:tcW w:type="dxa" w:w="2664"/>
-            <w:vAlign w:val="center"/>
-            <w:tcMar>
-              <w:top w:w="80" w:type="dxa"/>
-              <w:start w:w="80" w:type="dxa"/>
-              <w:bottom w:w="80" w:type="dxa"/>
-              <w:end w:w="80" w:type="dxa"/>
-            </w:tcMar>
-          </w:tcPr>
-          <w:p>
-            <w:pPr>
-              <w:spacing w:after="0" w:line="240" w:lineRule="auto"/>
-            </w:pPr>
-            <w:r>
-              <w:rPr>
-                <w:rFonts w:ascii="Times New Roman" w:hAnsi="Times New Roman" w:eastAsia="宋体"/>
-                <w:sz w:val="14"/>
-              </w:rPr>
-              <w:t>tests/test_storage.py</w:t>
-            </w:r>
-          </w:p>
-        </w:tc>
-        <w:tc>
-          <w:tcPr>
-            <w:tcW w:type="dxa" w:w="6696"/>
-            <w:vAlign w:val="center"/>
-            <w:tcMar>
-              <w:top w:w="80" w:type="dxa"/>
-              <w:start w:w="80" w:type="dxa"/>
-              <w:bottom w:w="80" w:type="dxa"/>
-              <w:end w:w="80" w:type="dxa"/>
-            </w:tcMar>
-          </w:tcPr>
-          <w:p>
-            <w:pPr>
-              <w:spacing w:after="0" w:line="240" w:lineRule="auto"/>
-            </w:pPr>
-            <w:r>
-              <w:rPr>
-                <w:rFonts w:ascii="Times New Roman" w:hAnsi="Times New Roman" w:eastAsia="宋体"/>
-                <w:sz w:val="14"/>
-              </w:rPr>
-              <w:t>存储调试脚本。它分别演示 SQLStorage、KVStorage 和 VectorStorage 的基本读写与查询，用于快速确认三类存储接口是否可用。</w:t>
-            </w:r>
-          </w:p>
-        </w:tc>
-      </w:tr>
-      <w:tr>
-        <w:tc>
-          <w:tcPr>
-            <w:tcW w:type="dxa" w:w="2664"/>
-            <w:vAlign w:val="center"/>
-            <w:tcMar>
-              <w:top w:w="80" w:type="dxa"/>
-              <w:start w:w="80" w:type="dxa"/>
-              <w:bottom w:w="80" w:type="dxa"/>
-              <w:end w:w="80" w:type="dxa"/>
-            </w:tcMar>
-          </w:tcPr>
-          <w:p>
-            <w:pPr>
-              <w:spacing w:after="0" w:line="240" w:lineRule="auto"/>
-            </w:pPr>
-            <w:r>
-              <w:rPr>
-                <w:rFonts w:ascii="Times New Roman" w:hAnsi="Times New Roman" w:eastAsia="宋体"/>
-                <w:sz w:val="14"/>
-              </w:rPr>
-              <w:t>tests/test_classifier.py</w:t>
-            </w:r>
-          </w:p>
-        </w:tc>
-        <w:tc>
-          <w:tcPr>
-            <w:tcW w:type="dxa" w:w="6696"/>
-            <w:vAlign w:val="center"/>
-            <w:tcMar>
-              <w:top w:w="80" w:type="dxa"/>
-              <w:start w:w="80" w:type="dxa"/>
-              <w:bottom w:w="80" w:type="dxa"/>
-              <w:end w:w="80" w:type="dxa"/>
-            </w:tcMar>
-          </w:tcPr>
-          <w:p>
-            <w:pPr>
-              <w:spacing w:after="0" w:line="240" w:lineRule="auto"/>
-            </w:pPr>
-            <w:r>
-              <w:rPr>
-                <w:rFonts w:ascii="Times New Roman" w:hAnsi="Times New Roman" w:eastAsia="宋体"/>
-                <w:sz w:val="14"/>
-              </w:rPr>
-              <w:t>分类器调试脚本。它初始化 QueryClassifier，对聚合、元数据、列表和复杂分析问题进行分类，用于检查 LLM 未启用时的规则回退表现。</w:t>
-            </w:r>
-          </w:p>
-        </w:tc>
-      </w:tr>
-      <w:tr>
-        <w:tc>
-          <w:tcPr>
-            <w:tcW w:type="dxa" w:w="2664"/>
-            <w:vAlign w:val="center"/>
-            <w:tcMar>
-              <w:top w:w="80" w:type="dxa"/>
-              <w:start w:w="80" w:type="dxa"/>
-              <w:bottom w:w="80" w:type="dxa"/>
-              <w:end w:w="80" w:type="dxa"/>
-            </w:tcMar>
-          </w:tcPr>
-          <w:p>
-            <w:pPr>
-              <w:spacing w:after="0" w:line="240" w:lineRule="auto"/>
-            </w:pPr>
-            <w:r>
-              <w:rPr>
-                <w:rFonts w:ascii="Times New Roman" w:hAnsi="Times New Roman" w:eastAsia="宋体"/>
-                <w:sz w:val="14"/>
-              </w:rPr>
-              <w:t>tests/prepare_kv_data.py</w:t>
-            </w:r>
-          </w:p>
-        </w:tc>
-        <w:tc>
-          <w:tcPr>
-            <w:tcW w:type="dxa" w:w="6696"/>
-            <w:vAlign w:val="center"/>
-            <w:tcMar>
-              <w:top w:w="80" w:type="dxa"/>
-              <w:start w:w="80" w:type="dxa"/>
-              <w:bottom w:w="80" w:type="dxa"/>
-              <w:end w:w="80" w:type="dxa"/>
-            </w:tcMar>
-          </w:tcPr>
-          <w:p>
-            <w:pPr>
-              <w:spacing w:after="0" w:line="240" w:lineRule="auto"/>
-            </w:pPr>
-            <w:r>
-              <w:rPr>
-                <w:rFonts w:ascii="Times New Roman" w:hAnsi="Times New Roman" w:eastAsia="宋体"/>
-                <w:sz w:val="14"/>
-              </w:rPr>
-              <w:t>KV 示例数据准备脚本。它向 metadata.json 写入数据来源、表格说明、单位和创建时间等示例元数据，便于测试 KV 查询路径。</w:t>
-            </w:r>
-          </w:p>
-        </w:tc>
-      </w:tr>
-      <w:tr>
-        <w:tc>
-          <w:tcPr>
-            <w:tcW w:type="dxa" w:w="2664"/>
-            <w:vAlign w:val="center"/>
-            <w:tcMar>
-              <w:top w:w="80" w:type="dxa"/>
-              <w:start w:w="80" w:type="dxa"/>
-              <w:bottom w:w="80" w:type="dxa"/>
-              <w:end w:w="80" w:type="dxa"/>
-            </w:tcMar>
-          </w:tcPr>
-          <w:p>
-            <w:pPr>
-              <w:spacing w:after="0" w:line="240" w:lineRule="auto"/>
-            </w:pPr>
-            <w:r>
-              <w:rPr>
-                <w:rFonts w:ascii="Times New Roman" w:hAnsi="Times New Roman" w:eastAsia="宋体"/>
-                <w:sz w:val="14"/>
-              </w:rPr>
-              <w:t>tests/prepare_vector_data.py</w:t>
-            </w:r>
-          </w:p>
-        </w:tc>
-        <w:tc>
-          <w:tcPr>
-            <w:tcW w:type="dxa" w:w="6696"/>
-            <w:vAlign w:val="center"/>
-            <w:tcMar>
-              <w:top w:w="80" w:type="dxa"/>
-              <w:start w:w="80" w:type="dxa"/>
-              <w:bottom w:w="80" w:type="dxa"/>
-              <w:end w:w="80" w:type="dxa"/>
-            </w:tcMar>
-          </w:tcPr>
-          <w:p>
-            <w:pPr>
-              <w:spacing w:after="0" w:line="240" w:lineRule="auto"/>
-            </w:pPr>
-            <w:r>
-              <w:rPr>
-                <w:rFonts w:ascii="Times New Roman" w:hAnsi="Times New Roman" w:eastAsia="宋体"/>
-                <w:sz w:val="14"/>
-              </w:rPr>
-              <w:t>检索示例数据准备脚本。它把示例 Excel 的每一行转换为文档片段并写入 VectorStorage，用于演示离线 sparse-token 检索流程。</w:t>
-            </w:r>
-          </w:p>
-        </w:tc>
-      </w:tr>
-      <w:tr>
-        <w:tc>
-          <w:tcPr>
-            <w:tcW w:type="dxa" w:w="2664"/>
-            <w:vAlign w:val="center"/>
-            <w:tcMar>
-              <w:top w:w="80" w:type="dxa"/>
-              <w:start w:w="80" w:type="dxa"/>
-              <w:bottom w:w="80" w:type="dxa"/>
-              <w:end w:w="80" w:type="dxa"/>
-            </w:tcMar>
-          </w:tcPr>
-          <w:p>
-            <w:pPr>
-              <w:spacing w:after="0" w:line="240" w:lineRule="auto"/>
-            </w:pPr>
-            <w:r>
-              <w:rPr>
-                <w:rFonts w:ascii="Times New Roman" w:hAnsi="Times New Roman" w:eastAsia="宋体"/>
-                <w:sz w:val="14"/>
-              </w:rPr>
-              <w:t>各级 __init__.py</w:t>
-            </w:r>
-          </w:p>
-        </w:tc>
-        <w:tc>
-          <w:tcPr>
-            <w:tcW w:type="dxa" w:w="6696"/>
-            <w:vAlign w:val="center"/>
-            <w:tcMar>
-              <w:top w:w="80" w:type="dxa"/>
-              <w:start w:w="80" w:type="dxa"/>
-              <w:bottom w:w="80" w:type="dxa"/>
-              <w:end w:w="80" w:type="dxa"/>
-            </w:tcMar>
-          </w:tcPr>
-          <w:p>
-            <w:pPr>
-              <w:spacing w:after="0" w:line="240" w:lineRule="auto"/>
-            </w:pPr>
-            <w:r>
-              <w:rPr>
-                <w:rFonts w:ascii="Times New Roman" w:hAnsi="Times New Roman" w:eastAsia="宋体"/>
-                <w:sz w:val="14"/>
-              </w:rPr>
-              <w:t>包初始化文件。它们主要用于让 src、parser、storage、router、agents、evaluator 等目录被 Python 识别为包，方便模块间通过 import 引用。</w:t>
-            </w:r>
-          </w:p>
-        </w:tc>
-      </w:tr>
-    </w:tbl>
-    <w:p/>
+    <w:p>
+      <w:pPr>
+        <w:spacing w:line="252" w:lineRule="auto" w:after="40"/>
+        <w:ind w:firstLine="0"/>
+      </w:pPr>
+      <w:r>
+        <w:rPr>
+          <w:rFonts w:ascii="Times New Roman" w:hAnsi="Times New Roman" w:eastAsia="黑体"/>
+          <w:b/>
+        </w:rPr>
+        <w:t>src/main.py：</w:t>
+      </w:r>
+      <w:r>
+        <w:rPr>
+          <w:rFonts w:ascii="Times New Roman" w:hAnsi="Times New Roman" w:eastAsia="宋体"/>
+        </w:rPr>
+        <w:t>命令行入口和系统编排文件。它读取 config.yaml，初始化 TableQuerySystem，并根据参数决定执行单条问答、重建索引或全量评测。评测时逐行读取 test.jsonl，根据 table_id 调用 HybridQueryEngine，随后用 AnswerMatcher 判断预测答案是否正确，并把结果写入 evaluation_report.json。</w:t>
+      </w:r>
+    </w:p>
+    <w:p>
+      <w:pPr>
+        <w:spacing w:line="252" w:lineRule="auto" w:after="40"/>
+        <w:ind w:firstLine="0"/>
+      </w:pPr>
+      <w:r>
+        <w:rPr>
+          <w:rFonts w:ascii="Times New Roman" w:hAnsi="Times New Roman" w:eastAsia="黑体"/>
+          <w:b/>
+        </w:rPr>
+        <w:t>src/hybrid_engine.py：</w:t>
+      </w:r>
+      <w:r>
+        <w:rPr>
+          <w:rFonts w:ascii="Times New Roman" w:hAnsi="Times New Roman" w:eastAsia="宋体"/>
+        </w:rPr>
+        <w:t>系统主查询引擎。启动时加载 TableIndexer 生成的 CellRecord 与 RowRecord，并按 table_id 建立内存索引。回答问题时先尝试 RelationalAnswerEngine；若其置信度不足，再按 lookup、list、count、extreme、sum、avg 等路由使用规则执行器和单元格检索兜底。last_trace 用于 explain 模式展示答案来源。</w:t>
+      </w:r>
+    </w:p>
+    <w:p>
+      <w:pPr>
+        <w:spacing w:line="252" w:lineRule="auto" w:after="40"/>
+        <w:ind w:firstLine="0"/>
+      </w:pPr>
+      <w:r>
+        <w:rPr>
+          <w:rFonts w:ascii="Times New Roman" w:hAnsi="Times New Roman" w:eastAsia="黑体"/>
+          <w:b/>
+        </w:rPr>
+        <w:t>src/relational_engine.py：</w:t>
+      </w:r>
+      <w:r>
+        <w:rPr>
+          <w:rFonts w:ascii="Times New Roman" w:hAnsi="Times New Roman" w:eastAsia="宋体"/>
+        </w:rPr>
+        <w:t>当前准确率提升的核心文件。它把部分半结构化表恢复成 TableView，包括表头、记录行、首列和月份宽表列。随后按问题抽取实体、指标、月份、条件和聚合意图，执行筛选、计数、极值、求和、均值、差值和百分比计算。该模块带有置信度门控，避免低可信关系结果覆盖检索结果。</w:t>
+      </w:r>
+    </w:p>
+    <w:p>
+      <w:pPr>
+        <w:spacing w:line="252" w:lineRule="auto" w:after="40"/>
+        <w:ind w:firstLine="0"/>
+      </w:pPr>
+      <w:r>
+        <w:rPr>
+          <w:rFonts w:ascii="Times New Roman" w:hAnsi="Times New Roman" w:eastAsia="黑体"/>
+          <w:b/>
+        </w:rPr>
+        <w:t>src/table_indexer.py：</w:t>
+      </w:r>
+      <w:r>
+        <w:rPr>
+          <w:rFonts w:ascii="Times New Roman" w:hAnsi="Times New Roman" w:eastAsia="宋体"/>
+        </w:rPr>
+        <w:t>索引构建文件。它遍历 data/raw 下的 Excel 文件，填充合并单元格、提取标题和行列上下文，为每个非空单元格生成 CellRecord，为每行生成 RowRecord。索引同时写入 SQLite 和 JSON：SQLite 便于审计和结构化查询，JSON 便于快速加载和离线检索。</w:t>
+      </w:r>
+    </w:p>
+    <w:p>
+      <w:pPr>
+        <w:spacing w:line="252" w:lineRule="auto" w:after="40"/>
+        <w:ind w:firstLine="0"/>
+      </w:pPr>
+      <w:r>
+        <w:rPr>
+          <w:rFonts w:ascii="Times New Roman" w:hAnsi="Times New Roman" w:eastAsia="黑体"/>
+          <w:b/>
+        </w:rPr>
+        <w:t>src/text_utils.py：</w:t>
+      </w:r>
+      <w:r>
+        <w:rPr>
+          <w:rFonts w:ascii="Times New Roman" w:hAnsi="Times New Roman" w:eastAsia="宋体"/>
+        </w:rPr>
+        <w:t>文本规范化与打分工具库。它负责中文问题清洗、数字抽取、Excel 显示值格式化、单位提取、中文 n-gram token 生成、加权重合度计算和去重。该文件使不同模块可以共享同一套文本匹配逻辑，避免各处重复写字符串处理代码。</w:t>
+      </w:r>
+    </w:p>
+    <w:p>
+      <w:pPr>
+        <w:spacing w:line="252" w:lineRule="auto" w:after="40"/>
+        <w:ind w:firstLine="0"/>
+      </w:pPr>
+      <w:r>
+        <w:rPr>
+          <w:rFonts w:ascii="Times New Roman" w:hAnsi="Times New Roman" w:eastAsia="黑体"/>
+          <w:b/>
+        </w:rPr>
+        <w:t>src/parser/excel_parser.py：</w:t>
+      </w:r>
+      <w:r>
+        <w:rPr>
+          <w:rFonts w:ascii="Times New Roman" w:hAnsi="Times New Roman" w:eastAsia="宋体"/>
+        </w:rPr>
+        <w:t>Excel 解析器。它使用 openpyxl 读取公式缓存后的显示值，填充合并区域，裁剪外围全空行列，并在可识别表头时返回带列名的 DataFrame。其设计目标不是立即得到完美关系表，而是尽量保留原始视觉结构，为后续证据索引和局部关系恢复提供基础。</w:t>
+      </w:r>
+    </w:p>
+    <w:p>
+      <w:pPr>
+        <w:spacing w:line="252" w:lineRule="auto" w:after="40"/>
+        <w:ind w:firstLine="0"/>
+      </w:pPr>
+      <w:r>
+        <w:rPr>
+          <w:rFonts w:ascii="Times New Roman" w:hAnsi="Times New Roman" w:eastAsia="黑体"/>
+          <w:b/>
+        </w:rPr>
+        <w:t>src/parser/structure_analyzer.py：</w:t>
+      </w:r>
+      <w:r>
+        <w:rPr>
+          <w:rFonts w:ascii="Times New Roman" w:hAnsi="Times New Roman" w:eastAsia="宋体"/>
+        </w:rPr>
+        <w:t>轻量结构分析器。它可以抽取前若干行的多级表头、将层级表头展平成列名，并根据数据列内容推断 numeric、datetime 或 text 类型。当前主流程主要使用更强的 TableIndexer 与 RelationalAnswerEngine，但该文件保留了可扩展的结构分析接口。</w:t>
+      </w:r>
+    </w:p>
+    <w:p>
+      <w:pPr>
+        <w:spacing w:line="252" w:lineRule="auto" w:after="40"/>
+        <w:ind w:firstLine="0"/>
+      </w:pPr>
+      <w:r>
+        <w:rPr>
+          <w:rFonts w:ascii="Times New Roman" w:hAnsi="Times New Roman" w:eastAsia="黑体"/>
+          <w:b/>
+        </w:rPr>
+        <w:t>src/router/query_router.py：</w:t>
+      </w:r>
+      <w:r>
+        <w:rPr>
+          <w:rFonts w:ascii="Times New Roman" w:hAnsi="Times New Roman" w:eastAsia="宋体"/>
+        </w:rPr>
+        <w:t>透明规则路由器。它按关键词把问题粗分为 SQL_AGG、KV_LOOKUP、VECTOR_SEARCH、CELL_LOOKUP 等类别，并映射到对应 Agent 名称。它的优点是无需 API、结果可解释；缺点是语义覆盖有限，因此主流程中还叠加了 HybridQueryEngine 的细粒度路由。</w:t>
+      </w:r>
+    </w:p>
+    <w:p>
+      <w:pPr>
+        <w:spacing w:line="252" w:lineRule="auto" w:after="40"/>
+        <w:ind w:firstLine="0"/>
+      </w:pPr>
+      <w:r>
+        <w:rPr>
+          <w:rFonts w:ascii="Times New Roman" w:hAnsi="Times New Roman" w:eastAsia="黑体"/>
+          <w:b/>
+        </w:rPr>
+        <w:t>src/router/query_classifier.py：</w:t>
+      </w:r>
+      <w:r>
+        <w:rPr>
+          <w:rFonts w:ascii="Times New Roman" w:hAnsi="Times New Roman" w:eastAsia="宋体"/>
+        </w:rPr>
+        <w:t>可选 LLM 分类器。若 config.yaml 中启用 LLM 且配置 API key，则尝试使用 langchain_deepseek 调用模型输出 JSON 分类；否则自动回退到 RuleBasedRouter。这样既保留语义分类扩展空间，又不影响离线课堂环境运行。</w:t>
+      </w:r>
+    </w:p>
+    <w:p>
+      <w:pPr>
+        <w:spacing w:line="252" w:lineRule="auto" w:after="40"/>
+        <w:ind w:firstLine="0"/>
+      </w:pPr>
+      <w:r>
+        <w:rPr>
+          <w:rFonts w:ascii="Times New Roman" w:hAnsi="Times New Roman" w:eastAsia="黑体"/>
+          <w:b/>
+        </w:rPr>
+        <w:t>src/storage/sql_storage.py：</w:t>
+      </w:r>
+      <w:r>
+        <w:rPr>
+          <w:rFonts w:ascii="Times New Roman" w:hAnsi="Times New Roman" w:eastAsia="宋体"/>
+        </w:rPr>
+        <w:t>SQLite 存储封装。它可以把 DataFrame 写成数据库表，执行 SQL 查询，获取表名并关闭连接。该模块主要服务 SQLAgent 和早期原型，也体现了课程数据库部分的关系型存储接口。</w:t>
+      </w:r>
+    </w:p>
+    <w:p>
+      <w:pPr>
+        <w:spacing w:line="252" w:lineRule="auto" w:after="40"/>
+        <w:ind w:firstLine="0"/>
+      </w:pPr>
+      <w:r>
+        <w:rPr>
+          <w:rFonts w:ascii="Times New Roman" w:hAnsi="Times New Roman" w:eastAsia="黑体"/>
+          <w:b/>
+        </w:rPr>
+        <w:t>src/storage/kv_storage.py：</w:t>
+      </w:r>
+      <w:r>
+        <w:rPr>
+          <w:rFonts w:ascii="Times New Roman" w:hAnsi="Times New Roman" w:eastAsia="宋体"/>
+        </w:rPr>
+        <w:t>JSON 文件形式的 Key-Value 存储。它提供 set、get、delete、contains、get_all 等基础接口，适合保存表级说明、数据来源、单位和运行元数据等不适合放入关系表的轻量信息。</w:t>
+      </w:r>
+    </w:p>
+    <w:p>
+      <w:pPr>
+        <w:spacing w:line="252" w:lineRule="auto" w:after="40"/>
+        <w:ind w:firstLine="0"/>
+      </w:pPr>
+      <w:r>
+        <w:rPr>
+          <w:rFonts w:ascii="Times New Roman" w:hAnsi="Times New Roman" w:eastAsia="黑体"/>
+          <w:b/>
+        </w:rPr>
+        <w:t>src/storage/vector_storage.py：</w:t>
+      </w:r>
+      <w:r>
+        <w:rPr>
+          <w:rFonts w:ascii="Times New Roman" w:hAnsi="Times New Roman" w:eastAsia="宋体"/>
+        </w:rPr>
+        <w:t>离线检索存储。它保留 VectorStorage 的 public API，但默认不依赖 ChromaDB 或 sentence-transformers，而是把文档转换成 sparse-token 计数，按 token 重合分数排序。这样脚本和测试无需下载模型也可以运行。</w:t>
+      </w:r>
+    </w:p>
+    <w:p>
+      <w:pPr>
+        <w:spacing w:line="252" w:lineRule="auto" w:after="40"/>
+        <w:ind w:firstLine="0"/>
+      </w:pPr>
+      <w:r>
+        <w:rPr>
+          <w:rFonts w:ascii="Times New Roman" w:hAnsi="Times New Roman" w:eastAsia="黑体"/>
+          <w:b/>
+        </w:rPr>
+        <w:t>src/agents/sql_agent.py：</w:t>
+      </w:r>
+      <w:r>
+        <w:rPr>
+          <w:rFonts w:ascii="Times New Roman" w:hAnsi="Times New Roman" w:eastAsia="宋体"/>
+        </w:rPr>
+        <w:t>SQL 聚合 Agent。它读取 SQLite 中的首个表和列名，基于问题中的总和、平均、计数、最大、最小等关键词拼接受控 SQL 聚合语句。它是可解释 SQL 查询路径的简单原型，适合规则表，但不直接处理复杂半结构化布局。</w:t>
+      </w:r>
+    </w:p>
+    <w:p>
+      <w:pPr>
+        <w:spacing w:line="252" w:lineRule="auto" w:after="40"/>
+        <w:ind w:firstLine="0"/>
+      </w:pPr>
+      <w:r>
+        <w:rPr>
+          <w:rFonts w:ascii="Times New Roman" w:hAnsi="Times New Roman" w:eastAsia="黑体"/>
+          <w:b/>
+        </w:rPr>
+        <w:t>src/agents/kv_agent.py：</w:t>
+      </w:r>
+      <w:r>
+        <w:rPr>
+          <w:rFonts w:ascii="Times New Roman" w:hAnsi="Times New Roman" w:eastAsia="宋体"/>
+        </w:rPr>
+        <w:t>KV 查询 Agent。它先尝试问题是否直接包含某个 key；若没有，再用 weighted_overlap 在 key 和 value 文本中找最相关项。适合“数据来源是什么”“单位是什么”等元数据问题。</w:t>
+      </w:r>
+    </w:p>
+    <w:p>
+      <w:pPr>
+        <w:spacing w:line="252" w:lineRule="auto" w:after="40"/>
+        <w:ind w:firstLine="0"/>
+      </w:pPr>
+      <w:r>
+        <w:rPr>
+          <w:rFonts w:ascii="Times New Roman" w:hAnsi="Times New Roman" w:eastAsia="黑体"/>
+          <w:b/>
+        </w:rPr>
+        <w:t>src/agents/vector_agent.py：</w:t>
+      </w:r>
+      <w:r>
+        <w:rPr>
+          <w:rFonts w:ascii="Times New Roman" w:hAnsi="Times New Roman" w:eastAsia="宋体"/>
+        </w:rPr>
+        <w:t>检索增强 Agent。它调用 VectorStorage 搜索相关文档片段，若配置了 LLMAgent 则把片段作为上下文交给 LLM；否则直接返回检索到的片段。该模块体现了向量/语义检索扩展路线，但默认可离线运行。</w:t>
+      </w:r>
+    </w:p>
+    <w:p>
+      <w:pPr>
+        <w:spacing w:line="252" w:lineRule="auto" w:after="40"/>
+        <w:ind w:firstLine="0"/>
+      </w:pPr>
+      <w:r>
+        <w:rPr>
+          <w:rFonts w:ascii="Times New Roman" w:hAnsi="Times New Roman" w:eastAsia="黑体"/>
+          <w:b/>
+        </w:rPr>
+        <w:t>src/agents/llm_agent.py：</w:t>
+      </w:r>
+      <w:r>
+        <w:rPr>
+          <w:rFonts w:ascii="Times New Roman" w:hAnsi="Times New Roman" w:eastAsia="宋体"/>
+        </w:rPr>
+        <w:t>可选 LLM 封装器。它读取 DEEPSEEK_API_KEY 等环境变量；未配置 API key 时返回离线兜底说明，而不是让系统报错。这样报告中可以说明 LLM 是可选增强，而不是系统运行前提。</w:t>
+      </w:r>
+    </w:p>
+    <w:p>
+      <w:pPr>
+        <w:spacing w:line="252" w:lineRule="auto" w:after="40"/>
+        <w:ind w:firstLine="0"/>
+      </w:pPr>
+      <w:r>
+        <w:rPr>
+          <w:rFonts w:ascii="Times New Roman" w:hAnsi="Times New Roman" w:eastAsia="黑体"/>
+          <w:b/>
+        </w:rPr>
+        <w:t>src/evaluator/answer_matcher.py：</w:t>
+      </w:r>
+      <w:r>
+        <w:rPr>
+          <w:rFonts w:ascii="Times New Roman" w:hAnsi="Times New Roman" w:eastAsia="宋体"/>
+        </w:rPr>
+        <w:t>答案匹配器。它先做文本规范化和精确匹配，再做数值容差、百分比换算、列表集合匹配和 LCS/ROUGE-L 风格相似度判断。这样可以兼容“50000”和“50000人”、列表顺序差异、长文本包含答案等情况。</w:t>
+      </w:r>
+    </w:p>
+    <w:p>
+      <w:pPr>
+        <w:spacing w:line="252" w:lineRule="auto" w:after="40"/>
+        <w:ind w:firstLine="0"/>
+      </w:pPr>
+      <w:r>
+        <w:rPr>
+          <w:rFonts w:ascii="Times New Roman" w:hAnsi="Times New Roman" w:eastAsia="黑体"/>
+          <w:b/>
+        </w:rPr>
+        <w:t>src/evaluator/statistics.py：</w:t>
+      </w:r>
+      <w:r>
+        <w:rPr>
+          <w:rFonts w:ascii="Times New Roman" w:hAnsi="Times New Roman" w:eastAsia="宋体"/>
+        </w:rPr>
+        <w:t>评测统计器。它保存每条问题的预测、标准答案、是否正确、类别和路由等信息，计算整体准确率和分类准确率，并可导出为 evaluation_report.json。</w:t>
+      </w:r>
+    </w:p>
+    <w:p>
+      <w:pPr>
+        <w:spacing w:line="252" w:lineRule="auto" w:after="40"/>
+        <w:ind w:firstLine="0"/>
+      </w:pPr>
+      <w:r>
+        <w:rPr>
+          <w:rFonts w:ascii="Times New Roman" w:hAnsi="Times New Roman" w:eastAsia="黑体"/>
+          <w:b/>
+        </w:rPr>
+        <w:t>scripts/build_report_docx.py：</w:t>
+      </w:r>
+      <w:r>
+        <w:rPr>
+          <w:rFonts w:ascii="Times New Roman" w:hAnsi="Times New Roman" w:eastAsia="宋体"/>
+        </w:rPr>
+        <w:t>报告生成脚本。它基于课程模板创建最终 DOCX，设置标题、摘要、正文分栏、表格样式和参考文献，并把当前项目指标、实现细节和文件说明写入报告。后续只要修改脚本文本并重新运行即可得到新版报告。</w:t>
+      </w:r>
+    </w:p>
+    <w:p>
+      <w:pPr>
+        <w:spacing w:line="252" w:lineRule="auto" w:after="40"/>
+        <w:ind w:firstLine="0"/>
+      </w:pPr>
+      <w:r>
+        <w:rPr>
+          <w:rFonts w:ascii="Times New Roman" w:hAnsi="Times New Roman" w:eastAsia="黑体"/>
+          <w:b/>
+        </w:rPr>
+        <w:t>scripts/vectorize_tables.py：</w:t>
+      </w:r>
+      <w:r>
+        <w:rPr>
+          <w:rFonts w:ascii="Times New Roman" w:hAnsi="Times New Roman" w:eastAsia="宋体"/>
+        </w:rPr>
+        <w:t>可选的批量检索准备脚本。它遍历 raw Excel 文件，把每行转换为文本片段并写入 VectorStorage。当前主流程不依赖它，但它展示了如何扩展到向量/语义检索路径。</w:t>
+      </w:r>
+    </w:p>
+    <w:p>
+      <w:pPr>
+        <w:spacing w:line="252" w:lineRule="auto" w:after="40"/>
+        <w:ind w:firstLine="0"/>
+      </w:pPr>
+      <w:r>
+        <w:rPr>
+          <w:rFonts w:ascii="Times New Roman" w:hAnsi="Times New Roman" w:eastAsia="黑体"/>
+          <w:b/>
+        </w:rPr>
+        <w:t>tests/test_core_behavior.py：</w:t>
+      </w:r>
+      <w:r>
+        <w:rPr>
+          <w:rFonts w:ascii="Times New Roman" w:hAnsi="Times New Roman" w:eastAsia="宋体"/>
+        </w:rPr>
+        <w:t>核心行为测试。它验证数值答案不能被子串误判、规则路由能识别计数问题、离线 VectorStorage 能按 token 找到相关文档，是防止关键回归的最小测试集。</w:t>
+      </w:r>
+    </w:p>
+    <w:p>
+      <w:pPr>
+        <w:spacing w:line="252" w:lineRule="auto" w:after="40"/>
+        <w:ind w:firstLine="0"/>
+      </w:pPr>
+      <w:r>
+        <w:rPr>
+          <w:rFonts w:ascii="Times New Roman" w:hAnsi="Times New Roman" w:eastAsia="黑体"/>
+          <w:b/>
+        </w:rPr>
+        <w:t>tests/test_parser.py：</w:t>
+      </w:r>
+      <w:r>
+        <w:rPr>
+          <w:rFonts w:ascii="Times New Roman" w:hAnsi="Times New Roman" w:eastAsia="宋体"/>
+        </w:rPr>
+        <w:t>解析调试脚本。它读取示例 Excel，打印解析后的 DataFrame、表格形状、多级表头和展平列名，主要用于观察 ExcelParser 与 StructureAnalyzer 的效果。</w:t>
+      </w:r>
+    </w:p>
+    <w:p>
+      <w:pPr>
+        <w:spacing w:line="252" w:lineRule="auto" w:after="40"/>
+        <w:ind w:firstLine="0"/>
+      </w:pPr>
+      <w:r>
+        <w:rPr>
+          <w:rFonts w:ascii="Times New Roman" w:hAnsi="Times New Roman" w:eastAsia="黑体"/>
+          <w:b/>
+        </w:rPr>
+        <w:t>tests/test_router.py：</w:t>
+      </w:r>
+      <w:r>
+        <w:rPr>
+          <w:rFonts w:ascii="Times New Roman" w:hAnsi="Times New Roman" w:eastAsia="宋体"/>
+        </w:rPr>
+        <w:t>路由调试脚本。它用若干自然语言问题打印 RuleBasedRouter 的分类和目标 Agent，方便检查关键词路由是否符合预期。</w:t>
+      </w:r>
+    </w:p>
+    <w:p>
+      <w:pPr>
+        <w:spacing w:line="252" w:lineRule="auto" w:after="40"/>
+        <w:ind w:firstLine="0"/>
+      </w:pPr>
+      <w:r>
+        <w:rPr>
+          <w:rFonts w:ascii="Times New Roman" w:hAnsi="Times New Roman" w:eastAsia="黑体"/>
+          <w:b/>
+        </w:rPr>
+        <w:t>tests/test_storage.py：</w:t>
+      </w:r>
+      <w:r>
+        <w:rPr>
+          <w:rFonts w:ascii="Times New Roman" w:hAnsi="Times New Roman" w:eastAsia="宋体"/>
+        </w:rPr>
+        <w:t>存储调试脚本。它分别演示 SQLStorage、KVStorage 和 VectorStorage 的基本读写与查询，用于快速确认三类存储接口是否可用。</w:t>
+      </w:r>
+    </w:p>
+    <w:p>
+      <w:pPr>
+        <w:spacing w:line="252" w:lineRule="auto" w:after="40"/>
+        <w:ind w:firstLine="0"/>
+      </w:pPr>
+      <w:r>
+        <w:rPr>
+          <w:rFonts w:ascii="Times New Roman" w:hAnsi="Times New Roman" w:eastAsia="黑体"/>
+          <w:b/>
+        </w:rPr>
+        <w:t>tests/test_classifier.py：</w:t>
+      </w:r>
+      <w:r>
+        <w:rPr>
+          <w:rFonts w:ascii="Times New Roman" w:hAnsi="Times New Roman" w:eastAsia="宋体"/>
+        </w:rPr>
+        <w:t>分类器调试脚本。它初始化 QueryClassifier，对聚合、元数据、列表和复杂分析问题进行分类，用于检查 LLM 未启用时的规则回退表现。</w:t>
+      </w:r>
+    </w:p>
+    <w:p>
+      <w:pPr>
+        <w:spacing w:line="252" w:lineRule="auto" w:after="40"/>
+        <w:ind w:firstLine="0"/>
+      </w:pPr>
+      <w:r>
+        <w:rPr>
+          <w:rFonts w:ascii="Times New Roman" w:hAnsi="Times New Roman" w:eastAsia="黑体"/>
+          <w:b/>
+        </w:rPr>
+        <w:t>tests/prepare_kv_data.py：</w:t>
+      </w:r>
+      <w:r>
+        <w:rPr>
+          <w:rFonts w:ascii="Times New Roman" w:hAnsi="Times New Roman" w:eastAsia="宋体"/>
+        </w:rPr>
+        <w:t>KV 示例数据准备脚本。它向 metadata.json 写入数据来源、表格说明、单位和创建时间等示例元数据，便于测试 KV 查询路径。</w:t>
+      </w:r>
+    </w:p>
+    <w:p>
+      <w:pPr>
+        <w:spacing w:line="252" w:lineRule="auto" w:after="40"/>
+        <w:ind w:firstLine="0"/>
+      </w:pPr>
+      <w:r>
+        <w:rPr>
+          <w:rFonts w:ascii="Times New Roman" w:hAnsi="Times New Roman" w:eastAsia="黑体"/>
+          <w:b/>
+        </w:rPr>
+        <w:t>tests/prepare_vector_data.py：</w:t>
+      </w:r>
+      <w:r>
+        <w:rPr>
+          <w:rFonts w:ascii="Times New Roman" w:hAnsi="Times New Roman" w:eastAsia="宋体"/>
+        </w:rPr>
+        <w:t>检索示例数据准备脚本。它把示例 Excel 的每一行转换为文档片段并写入 VectorStorage，用于演示离线 sparse-token 检索流程。</w:t>
+      </w:r>
+    </w:p>
+    <w:p>
+      <w:pPr>
+        <w:spacing w:line="252" w:lineRule="auto" w:after="40"/>
+        <w:ind w:firstLine="0"/>
+      </w:pPr>
+      <w:r>
+        <w:rPr>
+          <w:rFonts w:ascii="Times New Roman" w:hAnsi="Times New Roman" w:eastAsia="黑体"/>
+          <w:b/>
+        </w:rPr>
+        <w:t>各级 __init__.py：</w:t>
+      </w:r>
+      <w:r>
+        <w:rPr>
+          <w:rFonts w:ascii="Times New Roman" w:hAnsi="Times New Roman" w:eastAsia="宋体"/>
+        </w:rPr>
+        <w:t>包初始化文件。它们主要用于让 src、parser、storage、router、agents、evaluator 等目录被 Python 识别为包，方便模块间通过 import 引用。</w:t>
+      </w:r>
+    </w:p>
+    <w:p>
+      <w:pPr>
+        <w:spacing w:after="0"/>
+      </w:pPr>
+      <w:r>
+        <w:br w:type="column"/>
+      </w:r>
+    </w:p>
     <w:p>
       <w:pPr>
         <w:pStyle w:val="1"/>
@@ -2305,17 +1376,19 @@
     <w:p>
       <w:pPr>
         <w:spacing w:line="259" w:lineRule="auto" w:after="60"/>
-      </w:pPr>
-      <w:r>
-        <w:rPr>
-          <w:rFonts w:ascii="Times New Roman" w:hAnsi="Times New Roman" w:eastAsia="宋体"/>
-        </w:rPr>
-        <w:t>[1] Tang Z, Niu B, Zhou X, Li B, Zhou W, Wang J, Li G, Zhang X, Wu F. ST-Raptor: LLM-Powered Semi-Structured Table Question Answering. arXiv:2508.18190, 2025.</w:t>
+        <w:jc w:val="left"/>
+      </w:pPr>
+      <w:r>
+        <w:rPr>
+          <w:rFonts w:ascii="Times New Roman" w:hAnsi="Times New Roman" w:eastAsia="宋体"/>
+        </w:rPr>
+        <w:t>[1] Tang Z, Niu B, Zhou X, Li B, Zhou W, Wang J, Li G, Zhang X, Wu F. ST-Raptor: LLM-Powered Semi-Structured Table Question Answering. arXiv:2508.18190, 2025. https://arxiv.org/abs/2508.18190</w:t>
       </w:r>
     </w:p>
     <w:p>
       <w:pPr>
         <w:spacing w:line="259" w:lineRule="auto" w:after="60"/>
+        <w:jc w:val="left"/>
       </w:pPr>
       <w:r>
         <w:rPr>
@@ -2327,41 +1400,44 @@
     <w:p>
       <w:pPr>
         <w:spacing w:line="259" w:lineRule="auto" w:after="60"/>
-      </w:pPr>
-      <w:r>
-        <w:rPr>
-          <w:rFonts w:ascii="Times New Roman" w:hAnsi="Times New Roman" w:eastAsia="宋体"/>
-        </w:rPr>
-        <w:t>[3] weAIDB/ST-Raptor. LLM-Powered Semi-Structured Table Question Answering. https://github.com/weAIDB/ST-Raptor</w:t>
+        <w:jc w:val="left"/>
+      </w:pPr>
+      <w:r>
+        <w:rPr>
+          <w:rFonts w:ascii="Times New Roman" w:hAnsi="Times New Roman" w:eastAsia="宋体"/>
+        </w:rPr>
+        <w:t>[3] OpenDataBox/ST-Raptor. LLM-Powered Semi-Structured Table Question Answering. https://github.com/OpenDataBox/ST-Raptor</w:t>
       </w:r>
     </w:p>
     <w:p>
       <w:pPr>
         <w:spacing w:line="259" w:lineRule="auto" w:after="60"/>
-      </w:pPr>
-      <w:r>
-        <w:rPr>
-          <w:rFonts w:ascii="Times New Roman" w:hAnsi="Times New Roman" w:eastAsia="宋体"/>
-        </w:rPr>
-        <w:t>[4] Python Software Foundation. sqlite3: DB-API 2.0 interface for SQLite databases.</w:t>
+        <w:jc w:val="left"/>
+      </w:pPr>
+      <w:r>
+        <w:rPr>
+          <w:rFonts w:ascii="Times New Roman" w:hAnsi="Times New Roman" w:eastAsia="宋体"/>
+        </w:rPr>
+        <w:t>[4] Python Software Foundation. sqlite3: DB-API 2.0 interface for SQLite databases. https://docs.python.org/3/library/sqlite3.html</w:t>
       </w:r>
     </w:p>
     <w:p>
       <w:pPr>
         <w:spacing w:line="259" w:lineRule="auto" w:after="60"/>
-      </w:pPr>
-      <w:r>
-        <w:rPr>
-          <w:rFonts w:ascii="Times New Roman" w:hAnsi="Times New Roman" w:eastAsia="宋体"/>
-        </w:rPr>
-        <w:t>[5] openpyxl documentation. https://openpyxl.readthedocs.io/</w:t>
+        <w:jc w:val="left"/>
+      </w:pPr>
+      <w:r>
+        <w:rPr>
+          <w:rFonts w:ascii="Times New Roman" w:hAnsi="Times New Roman" w:eastAsia="宋体"/>
+        </w:rPr>
+        <w:t>[5] openpyxl documentation. https://openpyxl.readthedocs.io/en/stable/</w:t>
       </w:r>
     </w:p>
     <w:sectPr>
       <w:type w:val="continuous"/>
       <w:pgSz w:w="11905" w:h="16837" w:code="9"/>
       <w:pgMar w:top="1181" w:right="1181" w:bottom="1181" w:left="1181" w:header="964" w:footer="964" w:gutter="0"/>
-      <w:cols w:num="1" w:space="720"/>
+      <w:cols w:num="2" w:space="720"/>
       <w:docGrid w:type="lines" w:linePitch="312"/>
     </w:sectPr>
   </w:body>

</xml_diff>

<commit_message>
Fix appendix reading order in report
</commit_message>
<xml_diff>
--- a/data/processed/ST_QueryEngine_Report_final.docx
+++ b/data/processed/ST_QueryEngine_Report_final.docx
@@ -786,14 +786,11 @@
     </w:p>
     <w:p>
       <w:pPr>
-        <w:sectPr>
-          <w:type w:val="continuous"/>
-          <w:pgSz w:w="11905" w:h="16837" w:code="9"/>
-          <w:pgMar w:top="1181" w:right="1181" w:bottom="1181" w:left="1181" w:header="964" w:footer="964" w:gutter="0"/>
-          <w:cols w:num="2" w:space="720"/>
-          <w:docGrid w:type="lines" w:linePitch="312"/>
-        </w:sectPr>
-      </w:pPr>
+        <w:spacing w:after="0"/>
+      </w:pPr>
+      <w:r>
+        <w:br w:type="page"/>
+      </w:r>
     </w:p>
     <w:p>
       <w:pPr>

</xml_diff>